<commit_message>
Corrigido, removido e ajustado todas as pendencias do Manter Gestor #106 Resolve
</commit_message>
<xml_diff>
--- a/Requisitos/CSU07 - Manter gestor.docx
+++ b/Requisitos/CSU07 - Manter gestor.docx
@@ -1,13 +1,11 @@
 
 <file path=word/document.xml><?xml version="1.0" encoding="utf-8"?>
-<w:document xmlns:o="urn:schemas-microsoft-com:office:office" xmlns:r="http://schemas.openxmlformats.org/officeDocument/2006/relationships" xmlns:v="urn:schemas-microsoft-com:vml" xmlns:w="http://schemas.openxmlformats.org/wordprocessingml/2006/main" xmlns:w10="urn:schemas-microsoft-com:office:word" xmlns:wp="http://schemas.openxmlformats.org/drawingml/2006/wordprocessingDrawing" xmlns:wps="http://schemas.microsoft.com/office/word/2010/wordprocessingShape" xmlns:wpg="http://schemas.microsoft.com/office/word/2010/wordprocessingGroup" xmlns:mc="http://schemas.openxmlformats.org/markup-compatibility/2006" xmlns:wp14="http://schemas.microsoft.com/office/word/2010/wordprocessingDrawing" xmlns:w14="http://schemas.microsoft.com/office/word/2010/wordml" xmlns:w15="http://schemas.microsoft.com/office/word/2012/wordml" mc:Ignorable="w14 wp14 w15">
+<w:document xmlns:wpc="http://schemas.microsoft.com/office/word/2010/wordprocessingCanvas" xmlns:cx="http://schemas.microsoft.com/office/drawing/2014/chartex" xmlns:cx1="http://schemas.microsoft.com/office/drawing/2015/9/8/chartex" xmlns:cx2="http://schemas.microsoft.com/office/drawing/2015/10/21/chartex" xmlns:cx3="http://schemas.microsoft.com/office/drawing/2016/5/9/chartex" xmlns:cx4="http://schemas.microsoft.com/office/drawing/2016/5/10/chartex" xmlns:cx5="http://schemas.microsoft.com/office/drawing/2016/5/11/chartex" xmlns:cx6="http://schemas.microsoft.com/office/drawing/2016/5/12/chartex" xmlns:cx7="http://schemas.microsoft.com/office/drawing/2016/5/13/chartex" xmlns:cx8="http://schemas.microsoft.com/office/drawing/2016/5/14/chartex" xmlns:mc="http://schemas.openxmlformats.org/markup-compatibility/2006" xmlns:aink="http://schemas.microsoft.com/office/drawing/2016/ink" xmlns:am3d="http://schemas.microsoft.com/office/drawing/2017/model3d" xmlns:o="urn:schemas-microsoft-com:office:office" xmlns:oel="http://schemas.microsoft.com/office/2019/extlst" xmlns:r="http://schemas.openxmlformats.org/officeDocument/2006/relationships" xmlns:m="http://schemas.openxmlformats.org/officeDocument/2006/math" xmlns:v="urn:schemas-microsoft-com:vml" xmlns:wp14="http://schemas.microsoft.com/office/word/2010/wordprocessingDrawing" xmlns:wp="http://schemas.openxmlformats.org/drawingml/2006/wordprocessingDrawing" xmlns:w10="urn:schemas-microsoft-com:office:word" xmlns:w="http://schemas.openxmlformats.org/wordprocessingml/2006/main" xmlns:w14="http://schemas.microsoft.com/office/word/2010/wordml" xmlns:w15="http://schemas.microsoft.com/office/word/2012/wordml" xmlns:w16cex="http://schemas.microsoft.com/office/word/2018/wordml/cex" xmlns:w16cid="http://schemas.microsoft.com/office/word/2016/wordml/cid" xmlns:w16="http://schemas.microsoft.com/office/word/2018/wordml" xmlns:w16du="http://schemas.microsoft.com/office/word/2023/wordml/word16du" xmlns:w16sdtdh="http://schemas.microsoft.com/office/word/2020/wordml/sdtdatahash" xmlns:w16se="http://schemas.microsoft.com/office/word/2015/wordml/symex" xmlns:wpg="http://schemas.microsoft.com/office/word/2010/wordprocessingGroup" xmlns:wpi="http://schemas.microsoft.com/office/word/2010/wordprocessingInk" xmlns:wne="http://schemas.microsoft.com/office/word/2006/wordml" xmlns:wps="http://schemas.microsoft.com/office/word/2010/wordprocessingShape" mc:Ignorable="w14 w15 w16se w16cid w16 w16cex w16sdtdh w16du wp14">
   <w:body>
     <w:p>
       <w:pPr>
-        <w:pStyle w:val="Normal"/>
-        <w:spacing w:lineRule="auto" w:line="360"/>
+        <w:spacing w:line="360" w:lineRule="auto"/>
         <w:jc w:val="center"/>
-        <w:rPr/>
       </w:pPr>
       <w:r>
         <w:rPr>
@@ -38,9 +36,7 @@
     </w:p>
     <w:p>
       <w:pPr>
-        <w:pStyle w:val="Normal"/>
-        <w:spacing w:lineRule="auto" w:line="360"/>
-        <w:rPr/>
+        <w:spacing w:line="360" w:lineRule="auto"/>
       </w:pPr>
       <w:r>
         <w:rPr>
@@ -61,23 +57,15 @@
     <w:tbl>
       <w:tblPr>
         <w:tblW w:w="9628" w:type="dxa"/>
-        <w:jc w:val="left"/>
         <w:tblInd w:w="-113" w:type="dxa"/>
         <w:tblLayout w:type="fixed"/>
-        <w:tblCellMar>
-          <w:top w:w="0" w:type="dxa"/>
-          <w:left w:w="108" w:type="dxa"/>
-          <w:bottom w:w="0" w:type="dxa"/>
-          <w:right w:w="108" w:type="dxa"/>
-        </w:tblCellMar>
-        <w:tblLook w:firstRow="0" w:noVBand="1" w:lastRow="0" w:firstColumn="0" w:lastColumn="0" w:noHBand="0" w:val="0400"/>
+        <w:tblLook w:val="0400" w:firstRow="0" w:lastRow="0" w:firstColumn="0" w:lastColumn="0" w:noHBand="0" w:noVBand="1"/>
       </w:tblPr>
       <w:tblGrid>
         <w:gridCol w:w="2689"/>
-        <w:gridCol w:w="6938"/>
+        <w:gridCol w:w="6939"/>
       </w:tblGrid>
       <w:tr>
-        <w:trPr/>
         <w:tc>
           <w:tcPr>
             <w:tcW w:w="2689" w:type="dxa"/>
@@ -90,9 +78,7 @@
           </w:tcPr>
           <w:p>
             <w:pPr>
-              <w:pStyle w:val="Normal"/>
-              <w:spacing w:lineRule="auto" w:line="360"/>
-              <w:rPr/>
+              <w:spacing w:line="360" w:lineRule="auto"/>
             </w:pPr>
             <w:r>
               <w:rPr>
@@ -116,9 +102,7 @@
           </w:tcPr>
           <w:p>
             <w:pPr>
-              <w:pStyle w:val="Normal"/>
-              <w:spacing w:lineRule="auto" w:line="360"/>
-              <w:rPr/>
+              <w:spacing w:line="360" w:lineRule="auto"/>
             </w:pPr>
             <w:r>
               <w:rPr>
@@ -131,7 +115,6 @@
         </w:tc>
       </w:tr>
       <w:tr>
-        <w:trPr/>
         <w:tc>
           <w:tcPr>
             <w:tcW w:w="2689" w:type="dxa"/>
@@ -144,9 +127,7 @@
           </w:tcPr>
           <w:p>
             <w:pPr>
-              <w:pStyle w:val="Normal"/>
-              <w:spacing w:lineRule="auto" w:line="360"/>
-              <w:rPr/>
+              <w:spacing w:line="360" w:lineRule="auto"/>
             </w:pPr>
             <w:r>
               <w:rPr>
@@ -170,10 +151,8 @@
           </w:tcPr>
           <w:p>
             <w:pPr>
-              <w:pStyle w:val="Normal"/>
-              <w:spacing w:lineRule="auto" w:line="360"/>
+              <w:spacing w:line="360" w:lineRule="auto"/>
               <w:jc w:val="both"/>
-              <w:rPr/>
             </w:pPr>
             <w:r>
               <w:rPr>
@@ -185,10 +164,8 @@
           </w:p>
           <w:p>
             <w:pPr>
-              <w:pStyle w:val="Normal"/>
-              <w:spacing w:lineRule="auto" w:line="360"/>
+              <w:spacing w:line="360" w:lineRule="auto"/>
               <w:jc w:val="both"/>
-              <w:rPr/>
             </w:pPr>
             <w:r>
               <w:rPr>
@@ -201,7 +178,6 @@
         </w:tc>
       </w:tr>
       <w:tr>
-        <w:trPr/>
         <w:tc>
           <w:tcPr>
             <w:tcW w:w="2689" w:type="dxa"/>
@@ -214,9 +190,7 @@
           </w:tcPr>
           <w:p>
             <w:pPr>
-              <w:pStyle w:val="Normal"/>
-              <w:spacing w:lineRule="auto" w:line="360"/>
-              <w:rPr/>
+              <w:spacing w:line="360" w:lineRule="auto"/>
             </w:pPr>
             <w:r>
               <w:rPr>
@@ -240,9 +214,7 @@
           </w:tcPr>
           <w:p>
             <w:pPr>
-              <w:pStyle w:val="Normal"/>
-              <w:spacing w:lineRule="auto" w:line="360"/>
-              <w:rPr/>
+              <w:spacing w:line="360" w:lineRule="auto"/>
             </w:pPr>
             <w:r>
               <w:rPr>
@@ -255,7 +227,6 @@
         </w:tc>
       </w:tr>
       <w:tr>
-        <w:trPr/>
         <w:tc>
           <w:tcPr>
             <w:tcW w:w="2689" w:type="dxa"/>
@@ -268,9 +239,7 @@
           </w:tcPr>
           <w:p>
             <w:pPr>
-              <w:pStyle w:val="Normal"/>
-              <w:spacing w:lineRule="auto" w:line="360"/>
-              <w:rPr/>
+              <w:spacing w:line="360" w:lineRule="auto"/>
             </w:pPr>
             <w:r>
               <w:rPr>
@@ -294,9 +263,7 @@
           </w:tcPr>
           <w:p>
             <w:pPr>
-              <w:pStyle w:val="Normal"/>
-              <w:spacing w:lineRule="auto" w:line="360"/>
-              <w:rPr/>
+              <w:spacing w:line="360" w:lineRule="auto"/>
             </w:pPr>
             <w:r>
               <w:rPr>
@@ -309,7 +276,6 @@
         </w:tc>
       </w:tr>
       <w:tr>
-        <w:trPr/>
         <w:tc>
           <w:tcPr>
             <w:tcW w:w="2689" w:type="dxa"/>
@@ -322,9 +288,7 @@
           </w:tcPr>
           <w:p>
             <w:pPr>
-              <w:pStyle w:val="Normal"/>
-              <w:spacing w:lineRule="auto" w:line="360"/>
-              <w:rPr/>
+              <w:spacing w:line="360" w:lineRule="auto"/>
             </w:pPr>
             <w:r>
               <w:rPr>
@@ -348,9 +312,7 @@
           </w:tcPr>
           <w:p>
             <w:pPr>
-              <w:pStyle w:val="Normal"/>
-              <w:spacing w:lineRule="auto" w:line="360"/>
-              <w:rPr/>
+              <w:spacing w:line="360" w:lineRule="auto"/>
             </w:pPr>
             <w:r>
               <w:rPr>
@@ -371,7 +333,6 @@
         </w:tc>
       </w:tr>
       <w:tr>
-        <w:trPr/>
         <w:tc>
           <w:tcPr>
             <w:tcW w:w="2689" w:type="dxa"/>
@@ -384,9 +345,7 @@
           </w:tcPr>
           <w:p>
             <w:pPr>
-              <w:pStyle w:val="Normal"/>
-              <w:spacing w:lineRule="auto" w:line="360"/>
-              <w:rPr/>
+              <w:spacing w:line="360" w:lineRule="auto"/>
             </w:pPr>
             <w:r>
               <w:rPr>
@@ -410,9 +369,7 @@
           </w:tcPr>
           <w:p>
             <w:pPr>
-              <w:pStyle w:val="Normal"/>
-              <w:spacing w:lineRule="auto" w:line="360"/>
-              <w:rPr/>
+              <w:spacing w:line="360" w:lineRule="auto"/>
             </w:pPr>
             <w:r>
               <w:rPr>
@@ -427,37 +384,23 @@
     </w:tbl>
     <w:p>
       <w:pPr>
-        <w:pStyle w:val="Normal"/>
-        <w:spacing w:lineRule="auto" w:line="360"/>
+        <w:spacing w:line="360" w:lineRule="auto"/>
         <w:rPr>
           <w:u w:val="single"/>
         </w:rPr>
       </w:pPr>
-      <w:r>
-        <w:rPr>
-          <w:u w:val="single"/>
-        </w:rPr>
-      </w:r>
     </w:p>
     <w:tbl>
       <w:tblPr>
         <w:tblW w:w="9628" w:type="dxa"/>
-        <w:jc w:val="left"/>
         <w:tblInd w:w="-113" w:type="dxa"/>
         <w:tblLayout w:type="fixed"/>
-        <w:tblCellMar>
-          <w:top w:w="0" w:type="dxa"/>
-          <w:left w:w="108" w:type="dxa"/>
-          <w:bottom w:w="0" w:type="dxa"/>
-          <w:right w:w="108" w:type="dxa"/>
-        </w:tblCellMar>
-        <w:tblLook w:firstRow="0" w:noVBand="1" w:lastRow="0" w:firstColumn="0" w:lastColumn="0" w:noHBand="0" w:val="0400"/>
+        <w:tblLook w:val="0400" w:firstRow="0" w:lastRow="0" w:firstColumn="0" w:lastColumn="0" w:noHBand="0" w:noVBand="1"/>
       </w:tblPr>
       <w:tblGrid>
         <w:gridCol w:w="9628"/>
       </w:tblGrid>
       <w:tr>
-        <w:trPr/>
         <w:tc>
           <w:tcPr>
             <w:tcW w:w="9628" w:type="dxa"/>
@@ -470,10 +413,8 @@
           </w:tcPr>
           <w:p>
             <w:pPr>
-              <w:pStyle w:val="Normal"/>
-              <w:spacing w:lineRule="auto" w:line="360"/>
+              <w:spacing w:line="360" w:lineRule="auto"/>
               <w:jc w:val="center"/>
-              <w:rPr/>
             </w:pPr>
             <w:r>
               <w:rPr>
@@ -487,7 +428,6 @@
         </w:tc>
       </w:tr>
       <w:tr>
-        <w:trPr/>
         <w:tc>
           <w:tcPr>
             <w:tcW w:w="9628" w:type="dxa"/>
@@ -500,75 +440,25 @@
           </w:tcPr>
           <w:p>
             <w:pPr>
-              <w:pStyle w:val="Normal"/>
-              <w:spacing w:lineRule="auto" w:line="360"/>
+              <w:spacing w:line="360" w:lineRule="auto"/>
               <w:jc w:val="both"/>
-              <w:rPr/>
-            </w:pPr>
-            <w:r>
-              <w:rPr>
-                <w:sz w:val="28"/>
-                <w:szCs w:val="28"/>
-              </w:rPr>
-              <w:t>1. Ator seleciona a opção “</w:t>
-            </w:r>
-            <w:r>
-              <w:rPr>
-                <w:b/>
-                <w:bCs/>
-                <w:sz w:val="28"/>
-                <w:szCs w:val="28"/>
-              </w:rPr>
-              <w:t>Entre ou cadastre-se</w:t>
-            </w:r>
-            <w:r>
-              <w:rPr>
-                <w:sz w:val="28"/>
-                <w:szCs w:val="28"/>
-              </w:rPr>
-              <w:t>” (</w:t>
-            </w:r>
-            <w:r>
-              <w:rPr>
-                <w:color w:val="C9211E"/>
-                <w:sz w:val="28"/>
-                <w:szCs w:val="28"/>
-              </w:rPr>
-              <w:t>Tela 01</w:t>
-            </w:r>
-            <w:r>
-              <w:rPr>
-                <w:sz w:val="28"/>
-                <w:szCs w:val="28"/>
-              </w:rPr>
-              <w:t>).</w:t>
-            </w:r>
-          </w:p>
-          <w:p>
-            <w:pPr>
-              <w:pStyle w:val="Normal"/>
-              <w:spacing w:lineRule="auto" w:line="360"/>
-              <w:jc w:val="both"/>
-              <w:rPr/>
-            </w:pPr>
-            <w:r>
-              <w:rPr>
-                <w:sz w:val="28"/>
-                <w:szCs w:val="28"/>
-              </w:rPr>
-              <w:t>2. Sistema exibe tela que oferece o acesso à 4 opções disponibilizadas pelo sistema, as quais são:</w:t>
-            </w:r>
-          </w:p>
-          <w:p>
-            <w:pPr>
-              <w:pStyle w:val="Normal"/>
+            </w:pPr>
+            <w:r>
+              <w:rPr>
+                <w:sz w:val="28"/>
+                <w:szCs w:val="28"/>
+              </w:rPr>
+              <w:t>1. Sistema exibe tela que oferece o acesso à 4 opções disponibilizadas pelo sistema, as quais são:</w:t>
+            </w:r>
+          </w:p>
+          <w:p>
+            <w:pPr>
               <w:numPr>
                 <w:ilvl w:val="0"/>
                 <w:numId w:val="1"/>
               </w:numPr>
-              <w:spacing w:lineRule="auto" w:line="360"/>
+              <w:spacing w:line="360" w:lineRule="auto"/>
               <w:jc w:val="both"/>
-              <w:rPr/>
             </w:pPr>
             <w:r>
               <w:rPr>
@@ -588,14 +478,12 @@
           </w:p>
           <w:p>
             <w:pPr>
-              <w:pStyle w:val="Normal"/>
               <w:numPr>
                 <w:ilvl w:val="0"/>
                 <w:numId w:val="1"/>
               </w:numPr>
-              <w:spacing w:lineRule="auto" w:line="360"/>
+              <w:spacing w:line="360" w:lineRule="auto"/>
               <w:jc w:val="both"/>
-              <w:rPr/>
             </w:pPr>
             <w:r>
               <w:rPr>
@@ -615,14 +503,12 @@
           </w:p>
           <w:p>
             <w:pPr>
-              <w:pStyle w:val="Normal"/>
               <w:numPr>
                 <w:ilvl w:val="0"/>
                 <w:numId w:val="1"/>
               </w:numPr>
-              <w:spacing w:lineRule="auto" w:line="360"/>
+              <w:spacing w:line="360" w:lineRule="auto"/>
               <w:jc w:val="both"/>
-              <w:rPr/>
             </w:pPr>
             <w:r>
               <w:rPr>
@@ -642,14 +528,12 @@
           </w:p>
           <w:p>
             <w:pPr>
-              <w:pStyle w:val="Normal"/>
               <w:numPr>
                 <w:ilvl w:val="0"/>
                 <w:numId w:val="1"/>
               </w:numPr>
-              <w:spacing w:lineRule="auto" w:line="360"/>
+              <w:spacing w:line="360" w:lineRule="auto"/>
               <w:jc w:val="both"/>
-              <w:rPr/>
             </w:pPr>
             <w:r>
               <w:rPr>
@@ -672,48 +556,29 @@
     </w:tbl>
     <w:p>
       <w:pPr>
-        <w:pStyle w:val="Normal"/>
-        <w:spacing w:lineRule="auto" w:line="360"/>
+        <w:spacing w:line="360" w:lineRule="auto"/>
         <w:rPr>
           <w:b/>
           <w:sz w:val="28"/>
           <w:szCs w:val="28"/>
         </w:rPr>
       </w:pPr>
-      <w:r>
-        <w:rPr>
-          <w:b/>
-          <w:sz w:val="28"/>
-          <w:szCs w:val="28"/>
-        </w:rPr>
-      </w:r>
       <w:bookmarkStart w:id="0" w:name="_heading=h.thy09f3cbfuh"/>
-      <w:bookmarkStart w:id="1" w:name="_heading=h.thy09f3cbfuh"/>
-      <w:bookmarkEnd w:id="1"/>
+      <w:bookmarkEnd w:id="0"/>
     </w:p>
     <w:p>
       <w:pPr>
-        <w:pStyle w:val="Normal"/>
-        <w:spacing w:lineRule="auto" w:line="360"/>
+        <w:spacing w:line="360" w:lineRule="auto"/>
         <w:rPr>
           <w:b/>
           <w:sz w:val="32"/>
           <w:szCs w:val="32"/>
         </w:rPr>
       </w:pPr>
-      <w:r>
-        <w:rPr>
-          <w:b/>
-          <w:sz w:val="32"/>
-          <w:szCs w:val="32"/>
-        </w:rPr>
-      </w:r>
     </w:p>
     <w:p>
       <w:pPr>
-        <w:pStyle w:val="Normal"/>
-        <w:spacing w:lineRule="auto" w:line="360"/>
-        <w:rPr/>
+        <w:spacing w:line="360" w:lineRule="auto"/>
       </w:pPr>
       <w:r>
         <w:rPr>
@@ -732,7 +597,7 @@
       </w:r>
       <w:r>
         <w:rPr>
-          <w:color w:themeColor="text1" w:val="000000"/>
+          <w:color w:val="000000" w:themeColor="text1"/>
           <w:sz w:val="32"/>
           <w:szCs w:val="32"/>
         </w:rPr>
@@ -742,23 +607,14 @@
     <w:tbl>
       <w:tblPr>
         <w:tblW w:w="9628" w:type="dxa"/>
-        <w:jc w:val="left"/>
-        <w:tblInd w:w="0" w:type="dxa"/>
         <w:tblLayout w:type="fixed"/>
-        <w:tblCellMar>
-          <w:top w:w="0" w:type="dxa"/>
-          <w:left w:w="108" w:type="dxa"/>
-          <w:bottom w:w="0" w:type="dxa"/>
-          <w:right w:w="108" w:type="dxa"/>
-        </w:tblCellMar>
-        <w:tblLook w:firstRow="0" w:noVBand="1" w:lastRow="0" w:firstColumn="0" w:lastColumn="0" w:noHBand="0" w:val="0400"/>
+        <w:tblLook w:val="0400" w:firstRow="0" w:lastRow="0" w:firstColumn="0" w:lastColumn="0" w:noHBand="0" w:noVBand="1"/>
       </w:tblPr>
       <w:tblGrid>
         <w:gridCol w:w="2689"/>
-        <w:gridCol w:w="6938"/>
+        <w:gridCol w:w="6939"/>
       </w:tblGrid>
       <w:tr>
-        <w:trPr/>
         <w:tc>
           <w:tcPr>
             <w:tcW w:w="2689" w:type="dxa"/>
@@ -771,9 +627,7 @@
           </w:tcPr>
           <w:p>
             <w:pPr>
-              <w:pStyle w:val="Normal"/>
-              <w:spacing w:lineRule="auto" w:line="360"/>
-              <w:rPr/>
+              <w:spacing w:line="360" w:lineRule="auto"/>
             </w:pPr>
             <w:r>
               <w:rPr>
@@ -797,9 +651,7 @@
           </w:tcPr>
           <w:p>
             <w:pPr>
-              <w:pStyle w:val="Normal"/>
-              <w:spacing w:lineRule="auto" w:line="360"/>
-              <w:rPr/>
+              <w:spacing w:line="360" w:lineRule="auto"/>
             </w:pPr>
             <w:r>
               <w:rPr>
@@ -810,7 +662,7 @@
             </w:r>
             <w:r>
               <w:rPr>
-                <w:color w:themeColor="text1" w:val="000000"/>
+                <w:color w:val="000000" w:themeColor="text1"/>
                 <w:sz w:val="28"/>
                 <w:szCs w:val="28"/>
               </w:rPr>
@@ -829,39 +681,23 @@
     </w:tbl>
     <w:p>
       <w:pPr>
-        <w:pStyle w:val="Normal"/>
-        <w:spacing w:lineRule="auto" w:line="360"/>
+        <w:spacing w:line="360" w:lineRule="auto"/>
         <w:rPr>
           <w:sz w:val="32"/>
           <w:szCs w:val="32"/>
         </w:rPr>
       </w:pPr>
-      <w:r>
-        <w:rPr>
-          <w:sz w:val="32"/>
-          <w:szCs w:val="32"/>
-        </w:rPr>
-      </w:r>
     </w:p>
     <w:tbl>
       <w:tblPr>
         <w:tblW w:w="9628" w:type="dxa"/>
-        <w:jc w:val="left"/>
-        <w:tblInd w:w="0" w:type="dxa"/>
         <w:tblLayout w:type="fixed"/>
-        <w:tblCellMar>
-          <w:top w:w="0" w:type="dxa"/>
-          <w:left w:w="108" w:type="dxa"/>
-          <w:bottom w:w="0" w:type="dxa"/>
-          <w:right w:w="108" w:type="dxa"/>
-        </w:tblCellMar>
-        <w:tblLook w:firstRow="0" w:noVBand="1" w:lastRow="0" w:firstColumn="0" w:lastColumn="0" w:noHBand="0" w:val="0400"/>
+        <w:tblLook w:val="0400" w:firstRow="0" w:lastRow="0" w:firstColumn="0" w:lastColumn="0" w:noHBand="0" w:noVBand="1"/>
       </w:tblPr>
       <w:tblGrid>
         <w:gridCol w:w="9628"/>
       </w:tblGrid>
       <w:tr>
-        <w:trPr/>
         <w:tc>
           <w:tcPr>
             <w:tcW w:w="9628" w:type="dxa"/>
@@ -874,10 +710,8 @@
           </w:tcPr>
           <w:p>
             <w:pPr>
-              <w:pStyle w:val="Normal"/>
-              <w:spacing w:lineRule="auto" w:line="360"/>
+              <w:spacing w:line="360" w:lineRule="auto"/>
               <w:jc w:val="center"/>
-              <w:rPr/>
             </w:pPr>
             <w:r>
               <w:rPr>
@@ -891,7 +725,6 @@
         </w:tc>
       </w:tr>
       <w:tr>
-        <w:trPr/>
         <w:tc>
           <w:tcPr>
             <w:tcW w:w="9628" w:type="dxa"/>
@@ -904,10 +737,8 @@
           </w:tcPr>
           <w:p>
             <w:pPr>
-              <w:pStyle w:val="Normal"/>
-              <w:spacing w:lineRule="auto" w:line="360"/>
+              <w:spacing w:line="360" w:lineRule="auto"/>
               <w:jc w:val="both"/>
-              <w:rPr/>
             </w:pPr>
             <w:r>
               <w:rPr>
@@ -934,10 +765,8 @@
           </w:p>
           <w:p>
             <w:pPr>
-              <w:pStyle w:val="Normal"/>
-              <w:spacing w:lineRule="auto" w:line="360"/>
+              <w:spacing w:line="360" w:lineRule="auto"/>
               <w:jc w:val="both"/>
-              <w:rPr/>
             </w:pPr>
             <w:r>
               <w:rPr>
@@ -964,10 +793,8 @@
           </w:p>
           <w:p>
             <w:pPr>
-              <w:pStyle w:val="Normal"/>
-              <w:spacing w:lineRule="auto" w:line="360"/>
+              <w:spacing w:line="360" w:lineRule="auto"/>
               <w:jc w:val="both"/>
-              <w:rPr/>
             </w:pPr>
             <w:r>
               <w:rPr>
@@ -994,16 +821,15 @@
           </w:p>
           <w:p>
             <w:pPr>
-              <w:pStyle w:val="Normal"/>
-              <w:spacing w:lineRule="auto" w:line="360"/>
+              <w:spacing w:line="360" w:lineRule="auto"/>
               <w:jc w:val="both"/>
-              <w:rPr/>
-            </w:pPr>
-            <w:r>
-              <w:rPr>
-                <w:sz w:val="28"/>
-                <w:szCs w:val="28"/>
-              </w:rPr>
+            </w:pPr>
+            <w:r>
+              <w:rPr>
+                <w:sz w:val="28"/>
+                <w:szCs w:val="28"/>
+              </w:rPr>
+              <w:lastRenderedPageBreak/>
               <w:t>4. Ator seleciona gestor e pressiona o botão “</w:t>
             </w:r>
             <w:r>
@@ -1040,10 +866,8 @@
           </w:p>
           <w:p>
             <w:pPr>
-              <w:pStyle w:val="Normal"/>
-              <w:spacing w:lineRule="auto" w:line="360"/>
+              <w:spacing w:line="360" w:lineRule="auto"/>
               <w:jc w:val="both"/>
-              <w:rPr/>
             </w:pPr>
             <w:r>
               <w:rPr>
@@ -1070,16 +894,75 @@
           </w:p>
           <w:p>
             <w:pPr>
-              <w:pStyle w:val="Normal"/>
-              <w:spacing w:lineRule="auto" w:line="360"/>
-              <w:rPr/>
-            </w:pPr>
-            <w:r>
-              <w:rPr>
-                <w:sz w:val="28"/>
-                <w:szCs w:val="28"/>
-              </w:rPr>
-              <w:t>6. Ator seleciona os campos para inserir nome, data de nascimento, Email, Telefone, CEP, Número, Logradouro, complemento, Bairro, Cidade, Estado. (</w:t>
+              <w:spacing w:line="360" w:lineRule="auto"/>
+              <w:rPr>
+                <w:sz w:val="28"/>
+                <w:szCs w:val="28"/>
+              </w:rPr>
+            </w:pPr>
+            <w:r>
+              <w:rPr>
+                <w:sz w:val="28"/>
+                <w:szCs w:val="28"/>
+              </w:rPr>
+              <w:t xml:space="preserve">6. </w:t>
+            </w:r>
+            <w:r>
+              <w:rPr>
+                <w:sz w:val="28"/>
+                <w:szCs w:val="28"/>
+              </w:rPr>
+              <w:t xml:space="preserve">O ator insere as informações cadastrais solicitadas nos campos correspondentes. Ao clicar em </w:t>
+            </w:r>
+            <w:r>
+              <w:rPr>
+                <w:sz w:val="28"/>
+                <w:szCs w:val="28"/>
+              </w:rPr>
+              <w:t>"</w:t>
+            </w:r>
+            <w:r>
+              <w:rPr>
+                <w:b/>
+                <w:bCs/>
+                <w:sz w:val="28"/>
+                <w:szCs w:val="28"/>
+              </w:rPr>
+              <w:t>Salvar</w:t>
+            </w:r>
+            <w:r>
+              <w:rPr>
+                <w:sz w:val="28"/>
+                <w:szCs w:val="28"/>
+              </w:rPr>
+              <w:t>"</w:t>
+            </w:r>
+            <w:r>
+              <w:rPr>
+                <w:sz w:val="28"/>
+                <w:szCs w:val="28"/>
+              </w:rPr>
+              <w:t>, os dados informados serão validados pelo sistema.</w:t>
+            </w:r>
+            <w:r>
+              <w:rPr>
+                <w:color w:val="FF0000"/>
+                <w:sz w:val="28"/>
+                <w:szCs w:val="28"/>
+              </w:rPr>
+              <w:t>(Tela 14)</w:t>
+            </w:r>
+          </w:p>
+          <w:p>
+            <w:pPr>
+              <w:spacing w:line="360" w:lineRule="auto"/>
+            </w:pPr>
+            <w:r>
+              <w:rPr>
+                <w:sz w:val="28"/>
+                <w:szCs w:val="28"/>
+              </w:rPr>
+              <w:t>7. Ator adiciona foto. (</w:t>
             </w:r>
             <w:r>
               <w:rPr>
@@ -1099,16 +982,30 @@
           </w:p>
           <w:p>
             <w:pPr>
-              <w:pStyle w:val="Normal"/>
-              <w:spacing w:lineRule="auto" w:line="360"/>
-              <w:rPr/>
-            </w:pPr>
-            <w:r>
-              <w:rPr>
-                <w:sz w:val="28"/>
-                <w:szCs w:val="28"/>
-              </w:rPr>
-              <w:t>7. Ator adiciona foto. (</w:t>
+              <w:spacing w:line="360" w:lineRule="auto"/>
+            </w:pPr>
+            <w:r>
+              <w:rPr>
+                <w:sz w:val="28"/>
+                <w:szCs w:val="28"/>
+              </w:rPr>
+              <w:t>8. Ator pressiona no botão “</w:t>
+            </w:r>
+            <w:r>
+              <w:rPr>
+                <w:b/>
+                <w:bCs/>
+                <w:sz w:val="28"/>
+                <w:szCs w:val="28"/>
+              </w:rPr>
+              <w:t>Salvar</w:t>
+            </w:r>
+            <w:r>
+              <w:rPr>
+                <w:sz w:val="28"/>
+                <w:szCs w:val="28"/>
+              </w:rPr>
+              <w:t>”. (</w:t>
             </w:r>
             <w:r>
               <w:rPr>
@@ -1128,61 +1025,21 @@
           </w:p>
           <w:p>
             <w:pPr>
-              <w:pStyle w:val="Normal"/>
-              <w:spacing w:lineRule="auto" w:line="360"/>
-              <w:rPr/>
-            </w:pPr>
-            <w:r>
-              <w:rPr>
-                <w:sz w:val="28"/>
-                <w:szCs w:val="28"/>
-              </w:rPr>
-              <w:t>8. Ator pressiona no botão “</w:t>
-            </w:r>
-            <w:r>
-              <w:rPr>
-                <w:b/>
-                <w:bCs/>
-                <w:sz w:val="28"/>
-                <w:szCs w:val="28"/>
-              </w:rPr>
-              <w:t>Salvar</w:t>
-            </w:r>
-            <w:r>
-              <w:rPr>
-                <w:sz w:val="28"/>
-                <w:szCs w:val="28"/>
-              </w:rPr>
-              <w:t>”. (</w:t>
-            </w:r>
-            <w:r>
-              <w:rPr>
-                <w:color w:val="C9211E"/>
-                <w:sz w:val="28"/>
-                <w:szCs w:val="28"/>
-              </w:rPr>
-              <w:t>Tela 14</w:t>
-            </w:r>
-            <w:r>
-              <w:rPr>
-                <w:sz w:val="28"/>
-                <w:szCs w:val="28"/>
-              </w:rPr>
-              <w:t>)</w:t>
-            </w:r>
-          </w:p>
-          <w:p>
-            <w:pPr>
-              <w:pStyle w:val="Normal"/>
-              <w:spacing w:lineRule="auto" w:line="360"/>
-              <w:rPr/>
-            </w:pPr>
-            <w:r>
-              <w:rPr>
-                <w:sz w:val="28"/>
-                <w:szCs w:val="28"/>
-              </w:rPr>
-              <w:t>9. Sistema grava dados informados em meio persistente. (</w:t>
+              <w:spacing w:line="360" w:lineRule="auto"/>
+            </w:pPr>
+            <w:r>
+              <w:rPr>
+                <w:sz w:val="28"/>
+                <w:szCs w:val="28"/>
+              </w:rPr>
+              <w:t xml:space="preserve">9. Sistema grava dados informados em meio persistente. </w:t>
+            </w:r>
+            <w:r>
+              <w:rPr>
+                <w:sz w:val="28"/>
+                <w:szCs w:val="28"/>
+              </w:rPr>
+              <w:t>(</w:t>
             </w:r>
             <w:r>
               <w:rPr>
@@ -1203,7 +1060,6 @@
         </w:tc>
       </w:tr>
       <w:tr>
-        <w:trPr/>
         <w:tc>
           <w:tcPr>
             <w:tcW w:w="9628" w:type="dxa"/>
@@ -1216,24 +1072,24 @@
           </w:tcPr>
           <w:p>
             <w:pPr>
-              <w:pStyle w:val="Normal"/>
-              <w:spacing w:lineRule="auto" w:line="360"/>
+              <w:spacing w:line="360" w:lineRule="auto"/>
               <w:jc w:val="center"/>
-              <w:rPr/>
-            </w:pPr>
-            <w:r>
-              <w:rPr>
-                <w:b/>
-                <w:sz w:val="28"/>
-                <w:szCs w:val="28"/>
-              </w:rPr>
+            </w:pPr>
+            <w:bookmarkStart w:id="1" w:name="_heading=h.2ew0ivxtnfk7"/>
+            <w:bookmarkEnd w:id="1"/>
+            <w:r>
+              <w:rPr>
+                <w:b/>
+                <w:sz w:val="28"/>
+                <w:szCs w:val="28"/>
+              </w:rPr>
+              <w:lastRenderedPageBreak/>
               <w:t>Fluxos de Exceção</w:t>
             </w:r>
           </w:p>
         </w:tc>
       </w:tr>
       <w:tr>
-        <w:trPr/>
         <w:tc>
           <w:tcPr>
             <w:tcW w:w="9628" w:type="dxa"/>
@@ -1246,41 +1102,90 @@
           </w:tcPr>
           <w:p>
             <w:pPr>
-              <w:pStyle w:val="Normal"/>
-              <w:spacing w:lineRule="auto" w:line="360"/>
+              <w:spacing w:line="360" w:lineRule="auto"/>
               <w:jc w:val="both"/>
-              <w:rPr/>
-            </w:pPr>
-            <w:r>
-              <w:rPr>
-                <w:b/>
-                <w:sz w:val="28"/>
-                <w:szCs w:val="28"/>
-              </w:rPr>
-              <w:t xml:space="preserve">Passo 1: </w:t>
-            </w:r>
-            <w:r>
-              <w:rPr>
-                <w:sz w:val="28"/>
-                <w:szCs w:val="28"/>
-              </w:rPr>
-              <w:t>Usuário não possui cadastro. Sistema exibe mensagem “</w:t>
-            </w:r>
-            <w:r>
-              <w:rPr>
-                <w:b/>
+            </w:pPr>
+            <w:r>
+              <w:rPr>
+                <w:b/>
+                <w:sz w:val="28"/>
+                <w:szCs w:val="28"/>
+              </w:rPr>
+              <w:t xml:space="preserve">Passo </w:t>
+            </w:r>
+            <w:r>
+              <w:rPr>
+                <w:b/>
+                <w:sz w:val="28"/>
+                <w:szCs w:val="28"/>
+              </w:rPr>
+              <w:t>8</w:t>
+            </w:r>
+            <w:r>
+              <w:rPr>
+                <w:b/>
+                <w:sz w:val="28"/>
+                <w:szCs w:val="28"/>
+              </w:rPr>
+              <w:t xml:space="preserve">: </w:t>
+            </w:r>
+            <w:r>
+              <w:rPr>
                 <w:bCs/>
                 <w:sz w:val="28"/>
                 <w:szCs w:val="28"/>
               </w:rPr>
-              <w:t>Usuário ou senha incorreta</w:t>
-            </w:r>
-            <w:r>
-              <w:rPr>
-                <w:sz w:val="28"/>
-                <w:szCs w:val="28"/>
-              </w:rPr>
-              <w:t>”. (</w:t>
+              <w:t>O ator visualiza os erros, corrige as informações nos campos indicados e preenche os que estavam faltando</w:t>
+            </w:r>
+            <w:r>
+              <w:rPr>
+                <w:bCs/>
+                <w:sz w:val="28"/>
+                <w:szCs w:val="28"/>
+              </w:rPr>
+              <w:t>,</w:t>
+            </w:r>
+            <w:r>
+              <w:t xml:space="preserve"> </w:t>
+            </w:r>
+            <w:r>
+              <w:rPr>
+                <w:bCs/>
+                <w:sz w:val="28"/>
+                <w:szCs w:val="28"/>
+              </w:rPr>
+              <w:t>o</w:t>
+            </w:r>
+            <w:r>
+              <w:rPr>
+                <w:bCs/>
+                <w:sz w:val="28"/>
+                <w:szCs w:val="28"/>
+              </w:rPr>
+              <w:t xml:space="preserve"> ator pressiona novamente o botão </w:t>
+            </w:r>
+            <w:r>
+              <w:rPr>
+                <w:b/>
+                <w:sz w:val="28"/>
+                <w:szCs w:val="28"/>
+              </w:rPr>
+              <w:t>"Salvar"</w:t>
+            </w:r>
+            <w:r>
+              <w:rPr>
+                <w:bCs/>
+                <w:sz w:val="28"/>
+                <w:szCs w:val="28"/>
+              </w:rPr>
+              <w:t xml:space="preserve"> para submeter os dados corrigidos.</w:t>
+            </w:r>
+            <w:r>
+              <w:rPr>
+                <w:sz w:val="28"/>
+                <w:szCs w:val="28"/>
+              </w:rPr>
+              <w:t xml:space="preserve"> (</w:t>
             </w:r>
             <w:r>
               <w:rPr>
@@ -1288,7 +1193,141 @@
                 <w:sz w:val="28"/>
                 <w:szCs w:val="28"/>
               </w:rPr>
-              <w:t>Tela 35</w:t>
+              <w:t>Tela 14</w:t>
+            </w:r>
+            <w:r>
+              <w:rPr>
+                <w:sz w:val="28"/>
+                <w:szCs w:val="28"/>
+              </w:rPr>
+              <w:t>)</w:t>
+            </w:r>
+          </w:p>
+        </w:tc>
+      </w:tr>
+      <w:tr>
+        <w:tc>
+          <w:tcPr>
+            <w:tcW w:w="9628" w:type="dxa"/>
+            <w:tcBorders>
+              <w:top w:val="single" w:sz="4" w:space="0" w:color="000000"/>
+              <w:left w:val="single" w:sz="4" w:space="0" w:color="000000"/>
+              <w:bottom w:val="single" w:sz="4" w:space="0" w:color="000000"/>
+              <w:right w:val="single" w:sz="4" w:space="0" w:color="000000"/>
+            </w:tcBorders>
+          </w:tcPr>
+          <w:p>
+            <w:pPr>
+              <w:tabs>
+                <w:tab w:val="left" w:pos="3881"/>
+              </w:tabs>
+              <w:spacing w:line="360" w:lineRule="auto"/>
+              <w:jc w:val="both"/>
+              <w:rPr>
+                <w:b/>
+                <w:sz w:val="28"/>
+                <w:szCs w:val="28"/>
+              </w:rPr>
+            </w:pPr>
+            <w:r>
+              <w:rPr>
+                <w:b/>
+                <w:sz w:val="28"/>
+                <w:szCs w:val="28"/>
+              </w:rPr>
+              <w:tab/>
+              <w:t>Fluxos Alternativo</w:t>
+            </w:r>
+          </w:p>
+        </w:tc>
+      </w:tr>
+      <w:tr>
+        <w:tc>
+          <w:tcPr>
+            <w:tcW w:w="9628" w:type="dxa"/>
+            <w:tcBorders>
+              <w:top w:val="single" w:sz="4" w:space="0" w:color="000000"/>
+              <w:left w:val="single" w:sz="4" w:space="0" w:color="000000"/>
+              <w:bottom w:val="single" w:sz="4" w:space="0" w:color="000000"/>
+              <w:right w:val="single" w:sz="4" w:space="0" w:color="000000"/>
+            </w:tcBorders>
+          </w:tcPr>
+          <w:p>
+            <w:pPr>
+              <w:tabs>
+                <w:tab w:val="left" w:pos="3881"/>
+              </w:tabs>
+              <w:spacing w:line="360" w:lineRule="auto"/>
+              <w:jc w:val="both"/>
+              <w:rPr>
+                <w:b/>
+                <w:sz w:val="28"/>
+                <w:szCs w:val="28"/>
+              </w:rPr>
+            </w:pPr>
+            <w:r>
+              <w:rPr>
+                <w:b/>
+                <w:sz w:val="28"/>
+                <w:szCs w:val="28"/>
+              </w:rPr>
+              <w:t xml:space="preserve">Passo 5: </w:t>
+            </w:r>
+            <w:r>
+              <w:rPr>
+                <w:bCs/>
+                <w:sz w:val="28"/>
+                <w:szCs w:val="28"/>
+              </w:rPr>
+              <w:t xml:space="preserve">O ator pressiona o botão </w:t>
+            </w:r>
+            <w:r>
+              <w:rPr>
+                <w:b/>
+                <w:color w:val="000000" w:themeColor="text1"/>
+                <w:sz w:val="28"/>
+                <w:szCs w:val="28"/>
+              </w:rPr>
+              <w:t>"Voltar"</w:t>
+            </w:r>
+            <w:r>
+              <w:rPr>
+                <w:bCs/>
+                <w:sz w:val="28"/>
+                <w:szCs w:val="28"/>
+              </w:rPr>
+              <w:t xml:space="preserve"> e o sistema o redireciona para a "Tela de Gestores"</w:t>
+            </w:r>
+            <w:r>
+              <w:rPr>
+                <w:bCs/>
+                <w:sz w:val="28"/>
+                <w:szCs w:val="28"/>
+              </w:rPr>
+              <w:t xml:space="preserve">, </w:t>
+            </w:r>
+            <w:r>
+              <w:rPr>
+                <w:bCs/>
+                <w:sz w:val="28"/>
+                <w:szCs w:val="28"/>
+              </w:rPr>
+              <w:t>descartando quaisquer alterações não salvas.</w:t>
+            </w:r>
+            <w:r>
+              <w:rPr>
+                <w:sz w:val="28"/>
+                <w:szCs w:val="28"/>
+              </w:rPr>
+              <w:t xml:space="preserve"> (</w:t>
+            </w:r>
+            <w:r>
+              <w:rPr>
+                <w:color w:val="C9211E"/>
+                <w:sz w:val="28"/>
+                <w:szCs w:val="28"/>
+              </w:rPr>
+              <w:t>Tela 11</w:t>
             </w:r>
             <w:r>
               <w:rPr>
@@ -1303,30 +1342,17 @@
     </w:tbl>
     <w:p>
       <w:pPr>
-        <w:pStyle w:val="Normal"/>
-        <w:spacing w:lineRule="auto" w:line="360"/>
+        <w:spacing w:line="360" w:lineRule="auto"/>
         <w:rPr>
           <w:b/>
           <w:sz w:val="32"/>
           <w:szCs w:val="32"/>
         </w:rPr>
       </w:pPr>
-      <w:r>
-        <w:rPr>
-          <w:b/>
-          <w:sz w:val="32"/>
-          <w:szCs w:val="32"/>
-        </w:rPr>
-      </w:r>
-      <w:bookmarkStart w:id="2" w:name="_heading=h.2ew0ivxtnfk7"/>
-      <w:bookmarkStart w:id="3" w:name="_heading=h.2ew0ivxtnfk7"/>
-      <w:bookmarkEnd w:id="3"/>
     </w:p>
     <w:p>
       <w:pPr>
-        <w:pStyle w:val="Normal"/>
-        <w:spacing w:lineRule="auto" w:line="360"/>
-        <w:rPr/>
+        <w:spacing w:line="360" w:lineRule="auto"/>
       </w:pPr>
       <w:r>
         <w:rPr>
@@ -1347,23 +1373,14 @@
     <w:tbl>
       <w:tblPr>
         <w:tblW w:w="9628" w:type="dxa"/>
-        <w:jc w:val="left"/>
-        <w:tblInd w:w="0" w:type="dxa"/>
         <w:tblLayout w:type="fixed"/>
-        <w:tblCellMar>
-          <w:top w:w="0" w:type="dxa"/>
-          <w:left w:w="108" w:type="dxa"/>
-          <w:bottom w:w="0" w:type="dxa"/>
-          <w:right w:w="108" w:type="dxa"/>
-        </w:tblCellMar>
-        <w:tblLook w:firstRow="0" w:noVBand="1" w:lastRow="0" w:firstColumn="0" w:lastColumn="0" w:noHBand="0" w:val="0400"/>
+        <w:tblLook w:val="0400" w:firstRow="0" w:lastRow="0" w:firstColumn="0" w:lastColumn="0" w:noHBand="0" w:noVBand="1"/>
       </w:tblPr>
       <w:tblGrid>
         <w:gridCol w:w="2689"/>
-        <w:gridCol w:w="6938"/>
+        <w:gridCol w:w="6939"/>
       </w:tblGrid>
       <w:tr>
-        <w:trPr/>
         <w:tc>
           <w:tcPr>
             <w:tcW w:w="2689" w:type="dxa"/>
@@ -1376,9 +1393,7 @@
           </w:tcPr>
           <w:p>
             <w:pPr>
-              <w:pStyle w:val="Normal"/>
-              <w:spacing w:lineRule="auto" w:line="360"/>
-              <w:rPr/>
+              <w:spacing w:line="360" w:lineRule="auto"/>
             </w:pPr>
             <w:r>
               <w:rPr>
@@ -1402,9 +1417,7 @@
           </w:tcPr>
           <w:p>
             <w:pPr>
-              <w:pStyle w:val="Normal"/>
-              <w:spacing w:lineRule="auto" w:line="360"/>
-              <w:rPr/>
+              <w:spacing w:line="360" w:lineRule="auto"/>
             </w:pPr>
             <w:r>
               <w:rPr>
@@ -1419,39 +1432,23 @@
     </w:tbl>
     <w:p>
       <w:pPr>
-        <w:pStyle w:val="Normal"/>
-        <w:spacing w:lineRule="auto" w:line="360"/>
+        <w:spacing w:line="360" w:lineRule="auto"/>
         <w:rPr>
           <w:sz w:val="32"/>
           <w:szCs w:val="32"/>
         </w:rPr>
       </w:pPr>
-      <w:r>
-        <w:rPr>
-          <w:sz w:val="32"/>
-          <w:szCs w:val="32"/>
-        </w:rPr>
-      </w:r>
     </w:p>
     <w:tbl>
       <w:tblPr>
         <w:tblW w:w="9628" w:type="dxa"/>
-        <w:jc w:val="left"/>
-        <w:tblInd w:w="0" w:type="dxa"/>
         <w:tblLayout w:type="fixed"/>
-        <w:tblCellMar>
-          <w:top w:w="0" w:type="dxa"/>
-          <w:left w:w="108" w:type="dxa"/>
-          <w:bottom w:w="0" w:type="dxa"/>
-          <w:right w:w="108" w:type="dxa"/>
-        </w:tblCellMar>
-        <w:tblLook w:firstRow="0" w:noVBand="1" w:lastRow="0" w:firstColumn="0" w:lastColumn="0" w:noHBand="0" w:val="0400"/>
+        <w:tblLook w:val="0400" w:firstRow="0" w:lastRow="0" w:firstColumn="0" w:lastColumn="0" w:noHBand="0" w:noVBand="1"/>
       </w:tblPr>
       <w:tblGrid>
         <w:gridCol w:w="9628"/>
       </w:tblGrid>
       <w:tr>
-        <w:trPr/>
         <w:tc>
           <w:tcPr>
             <w:tcW w:w="9628" w:type="dxa"/>
@@ -1464,10 +1461,8 @@
           </w:tcPr>
           <w:p>
             <w:pPr>
-              <w:pStyle w:val="Normal"/>
-              <w:spacing w:lineRule="auto" w:line="360"/>
+              <w:spacing w:line="360" w:lineRule="auto"/>
               <w:jc w:val="center"/>
-              <w:rPr/>
             </w:pPr>
             <w:r>
               <w:rPr>
@@ -1481,7 +1476,6 @@
         </w:tc>
       </w:tr>
       <w:tr>
-        <w:trPr/>
         <w:tc>
           <w:tcPr>
             <w:tcW w:w="9628" w:type="dxa"/>
@@ -1494,10 +1488,8 @@
           </w:tcPr>
           <w:p>
             <w:pPr>
-              <w:pStyle w:val="Normal"/>
-              <w:spacing w:lineRule="auto" w:line="360"/>
+              <w:spacing w:line="360" w:lineRule="auto"/>
               <w:jc w:val="both"/>
-              <w:rPr/>
             </w:pPr>
             <w:r>
               <w:rPr>
@@ -1524,10 +1516,8 @@
           </w:p>
           <w:p>
             <w:pPr>
-              <w:pStyle w:val="Normal"/>
-              <w:spacing w:lineRule="auto" w:line="360"/>
+              <w:spacing w:line="360" w:lineRule="auto"/>
               <w:jc w:val="both"/>
-              <w:rPr/>
             </w:pPr>
             <w:r>
               <w:rPr>
@@ -1554,10 +1544,8 @@
           </w:p>
           <w:p>
             <w:pPr>
-              <w:pStyle w:val="Normal"/>
-              <w:spacing w:lineRule="auto" w:line="360"/>
+              <w:spacing w:line="360" w:lineRule="auto"/>
               <w:jc w:val="both"/>
-              <w:rPr/>
             </w:pPr>
             <w:r>
               <w:rPr>
@@ -1584,10 +1572,8 @@
           </w:p>
           <w:p>
             <w:pPr>
-              <w:pStyle w:val="Normal"/>
-              <w:spacing w:lineRule="auto" w:line="360"/>
+              <w:spacing w:line="360" w:lineRule="auto"/>
               <w:jc w:val="both"/>
-              <w:rPr/>
             </w:pPr>
             <w:r>
               <w:rPr>
@@ -1630,10 +1616,8 @@
           </w:p>
           <w:p>
             <w:pPr>
-              <w:pStyle w:val="Normal"/>
-              <w:spacing w:lineRule="auto" w:line="360"/>
+              <w:spacing w:line="360" w:lineRule="auto"/>
               <w:jc w:val="both"/>
-              <w:rPr/>
             </w:pPr>
             <w:r>
               <w:rPr>
@@ -1663,13 +1647,37 @@
     </w:tbl>
     <w:p>
       <w:pPr>
-        <w:pStyle w:val="Normal"/>
-        <w:spacing w:lineRule="auto" w:line="360"/>
+        <w:spacing w:line="360" w:lineRule="auto"/>
         <w:rPr>
           <w:b/>
           <w:sz w:val="32"/>
           <w:szCs w:val="32"/>
         </w:rPr>
+      </w:pPr>
+    </w:p>
+    <w:p>
+      <w:pPr>
+        <w:spacing w:line="360" w:lineRule="auto"/>
+        <w:rPr>
+          <w:b/>
+          <w:sz w:val="32"/>
+          <w:szCs w:val="32"/>
+        </w:rPr>
+      </w:pPr>
+    </w:p>
+    <w:p>
+      <w:pPr>
+        <w:spacing w:line="360" w:lineRule="auto"/>
+        <w:rPr>
+          <w:b/>
+          <w:sz w:val="32"/>
+          <w:szCs w:val="32"/>
+        </w:rPr>
+      </w:pPr>
+    </w:p>
+    <w:p>
+      <w:pPr>
+        <w:spacing w:line="360" w:lineRule="auto"/>
       </w:pPr>
       <w:r>
         <w:rPr>
@@ -1677,56 +1685,7 @@
           <w:sz w:val="32"/>
           <w:szCs w:val="32"/>
         </w:rPr>
-      </w:r>
-    </w:p>
-    <w:p>
-      <w:pPr>
-        <w:pStyle w:val="Normal"/>
-        <w:spacing w:lineRule="auto" w:line="360"/>
-        <w:rPr>
-          <w:b/>
-          <w:sz w:val="32"/>
-          <w:szCs w:val="32"/>
-        </w:rPr>
-      </w:pPr>
-      <w:r>
-        <w:rPr>
-          <w:b/>
-          <w:sz w:val="32"/>
-          <w:szCs w:val="32"/>
-        </w:rPr>
-      </w:r>
-    </w:p>
-    <w:p>
-      <w:pPr>
-        <w:pStyle w:val="Normal"/>
-        <w:spacing w:lineRule="auto" w:line="360"/>
-        <w:rPr>
-          <w:b/>
-          <w:sz w:val="32"/>
-          <w:szCs w:val="32"/>
-        </w:rPr>
-      </w:pPr>
-      <w:r>
-        <w:rPr>
-          <w:b/>
-          <w:sz w:val="32"/>
-          <w:szCs w:val="32"/>
-        </w:rPr>
-      </w:r>
-    </w:p>
-    <w:p>
-      <w:pPr>
-        <w:pStyle w:val="Normal"/>
-        <w:spacing w:lineRule="auto" w:line="360"/>
-        <w:rPr/>
-      </w:pPr>
-      <w:r>
-        <w:rPr>
-          <w:b/>
-          <w:sz w:val="32"/>
-          <w:szCs w:val="32"/>
-        </w:rPr>
+        <w:lastRenderedPageBreak/>
         <w:t>Seção:</w:t>
       </w:r>
       <w:r>
@@ -1740,23 +1699,14 @@
     <w:tbl>
       <w:tblPr>
         <w:tblW w:w="9628" w:type="dxa"/>
-        <w:jc w:val="left"/>
-        <w:tblInd w:w="0" w:type="dxa"/>
         <w:tblLayout w:type="fixed"/>
-        <w:tblCellMar>
-          <w:top w:w="0" w:type="dxa"/>
-          <w:left w:w="108" w:type="dxa"/>
-          <w:bottom w:w="0" w:type="dxa"/>
-          <w:right w:w="108" w:type="dxa"/>
-        </w:tblCellMar>
-        <w:tblLook w:firstRow="0" w:noVBand="1" w:lastRow="0" w:firstColumn="0" w:lastColumn="0" w:noHBand="0" w:val="0400"/>
+        <w:tblLook w:val="0400" w:firstRow="0" w:lastRow="0" w:firstColumn="0" w:lastColumn="0" w:noHBand="0" w:noVBand="1"/>
       </w:tblPr>
       <w:tblGrid>
         <w:gridCol w:w="2689"/>
-        <w:gridCol w:w="6938"/>
+        <w:gridCol w:w="6939"/>
       </w:tblGrid>
       <w:tr>
-        <w:trPr/>
         <w:tc>
           <w:tcPr>
             <w:tcW w:w="2689" w:type="dxa"/>
@@ -1769,9 +1719,7 @@
           </w:tcPr>
           <w:p>
             <w:pPr>
-              <w:pStyle w:val="Normal"/>
-              <w:spacing w:lineRule="auto" w:line="360"/>
-              <w:rPr/>
+              <w:spacing w:line="360" w:lineRule="auto"/>
             </w:pPr>
             <w:r>
               <w:rPr>
@@ -1795,9 +1743,7 @@
           </w:tcPr>
           <w:p>
             <w:pPr>
-              <w:pStyle w:val="Normal"/>
-              <w:spacing w:lineRule="auto" w:line="360"/>
-              <w:rPr/>
+              <w:spacing w:line="360" w:lineRule="auto"/>
             </w:pPr>
             <w:r>
               <w:rPr>
@@ -1812,39 +1758,23 @@
     </w:tbl>
     <w:p>
       <w:pPr>
-        <w:pStyle w:val="Normal"/>
-        <w:spacing w:lineRule="auto" w:line="360"/>
+        <w:spacing w:line="360" w:lineRule="auto"/>
         <w:rPr>
           <w:sz w:val="32"/>
           <w:szCs w:val="32"/>
         </w:rPr>
       </w:pPr>
-      <w:r>
-        <w:rPr>
-          <w:sz w:val="32"/>
-          <w:szCs w:val="32"/>
-        </w:rPr>
-      </w:r>
     </w:p>
     <w:tbl>
       <w:tblPr>
         <w:tblW w:w="9628" w:type="dxa"/>
-        <w:jc w:val="left"/>
-        <w:tblInd w:w="0" w:type="dxa"/>
         <w:tblLayout w:type="fixed"/>
-        <w:tblCellMar>
-          <w:top w:w="0" w:type="dxa"/>
-          <w:left w:w="108" w:type="dxa"/>
-          <w:bottom w:w="0" w:type="dxa"/>
-          <w:right w:w="108" w:type="dxa"/>
-        </w:tblCellMar>
-        <w:tblLook w:firstRow="0" w:noVBand="1" w:lastRow="0" w:firstColumn="0" w:lastColumn="0" w:noHBand="0" w:val="0400"/>
+        <w:tblLook w:val="0400" w:firstRow="0" w:lastRow="0" w:firstColumn="0" w:lastColumn="0" w:noHBand="0" w:noVBand="1"/>
       </w:tblPr>
       <w:tblGrid>
         <w:gridCol w:w="9628"/>
       </w:tblGrid>
       <w:tr>
-        <w:trPr/>
         <w:tc>
           <w:tcPr>
             <w:tcW w:w="9628" w:type="dxa"/>
@@ -1857,10 +1787,8 @@
           </w:tcPr>
           <w:p>
             <w:pPr>
-              <w:pStyle w:val="Normal"/>
-              <w:spacing w:lineRule="auto" w:line="360"/>
+              <w:spacing w:line="360" w:lineRule="auto"/>
               <w:jc w:val="center"/>
-              <w:rPr/>
             </w:pPr>
             <w:r>
               <w:rPr>
@@ -1874,7 +1802,6 @@
         </w:tc>
       </w:tr>
       <w:tr>
-        <w:trPr/>
         <w:tc>
           <w:tcPr>
             <w:tcW w:w="9628" w:type="dxa"/>
@@ -1887,10 +1814,8 @@
           </w:tcPr>
           <w:p>
             <w:pPr>
-              <w:pStyle w:val="Normal"/>
-              <w:spacing w:lineRule="auto" w:line="360"/>
+              <w:spacing w:line="360" w:lineRule="auto"/>
               <w:jc w:val="both"/>
-              <w:rPr/>
             </w:pPr>
             <w:r>
               <w:rPr>
@@ -1917,10 +1842,8 @@
           </w:p>
           <w:p>
             <w:pPr>
-              <w:pStyle w:val="Normal"/>
-              <w:spacing w:lineRule="auto" w:line="360"/>
+              <w:spacing w:line="360" w:lineRule="auto"/>
               <w:jc w:val="both"/>
-              <w:rPr/>
             </w:pPr>
             <w:r>
               <w:rPr>
@@ -1947,10 +1870,8 @@
           </w:p>
           <w:p>
             <w:pPr>
-              <w:pStyle w:val="Normal"/>
-              <w:spacing w:lineRule="auto" w:line="360"/>
+              <w:spacing w:line="360" w:lineRule="auto"/>
               <w:jc w:val="both"/>
-              <w:rPr/>
             </w:pPr>
             <w:r>
               <w:rPr>
@@ -1977,10 +1898,8 @@
           </w:p>
           <w:p>
             <w:pPr>
-              <w:pStyle w:val="Normal"/>
-              <w:spacing w:lineRule="auto" w:line="360"/>
+              <w:spacing w:line="360" w:lineRule="auto"/>
               <w:jc w:val="both"/>
-              <w:rPr/>
             </w:pPr>
             <w:r>
               <w:rPr>
@@ -2023,10 +1942,8 @@
           </w:p>
           <w:p>
             <w:pPr>
-              <w:pStyle w:val="Normal"/>
-              <w:spacing w:lineRule="auto" w:line="360"/>
+              <w:spacing w:line="360" w:lineRule="auto"/>
               <w:jc w:val="both"/>
-              <w:rPr/>
             </w:pPr>
             <w:r>
               <w:rPr>
@@ -2053,10 +1970,12 @@
           </w:p>
           <w:p>
             <w:pPr>
-              <w:pStyle w:val="Normal"/>
-              <w:spacing w:lineRule="auto" w:line="360"/>
+              <w:spacing w:line="360" w:lineRule="auto"/>
               <w:jc w:val="both"/>
-              <w:rPr/>
+              <w:rPr>
+                <w:sz w:val="28"/>
+                <w:szCs w:val="28"/>
+              </w:rPr>
             </w:pPr>
             <w:r>
               <w:rPr>
@@ -2099,10 +2018,8 @@
           </w:p>
           <w:p>
             <w:pPr>
-              <w:pStyle w:val="Normal"/>
-              <w:spacing w:lineRule="auto" w:line="360"/>
+              <w:spacing w:line="360" w:lineRule="auto"/>
               <w:jc w:val="both"/>
-              <w:rPr/>
             </w:pPr>
             <w:r>
               <w:rPr>
@@ -2126,31 +2043,362 @@
               </w:rPr>
               <w:t>)</w:t>
             </w:r>
+          </w:p>
+        </w:tc>
+      </w:tr>
+      <w:tr>
+        <w:tc>
+          <w:tcPr>
+            <w:tcW w:w="9628" w:type="dxa"/>
+            <w:tcBorders>
+              <w:top w:val="single" w:sz="4" w:space="0" w:color="000000"/>
+              <w:left w:val="single" w:sz="4" w:space="0" w:color="000000"/>
+              <w:bottom w:val="single" w:sz="4" w:space="0" w:color="000000"/>
+              <w:right w:val="single" w:sz="4" w:space="0" w:color="000000"/>
+            </w:tcBorders>
+          </w:tcPr>
+          <w:p>
+            <w:pPr>
+              <w:spacing w:line="360" w:lineRule="auto"/>
+              <w:jc w:val="center"/>
+              <w:rPr>
+                <w:sz w:val="28"/>
+                <w:szCs w:val="28"/>
+              </w:rPr>
+            </w:pPr>
+            <w:r>
+              <w:rPr>
+                <w:b/>
+                <w:sz w:val="28"/>
+                <w:szCs w:val="28"/>
+              </w:rPr>
+              <w:t>Fluxos de Exceção</w:t>
+            </w:r>
+          </w:p>
+        </w:tc>
+      </w:tr>
+      <w:tr>
+        <w:tc>
+          <w:tcPr>
+            <w:tcW w:w="9628" w:type="dxa"/>
+            <w:tcBorders>
+              <w:top w:val="single" w:sz="4" w:space="0" w:color="000000"/>
+              <w:left w:val="single" w:sz="4" w:space="0" w:color="000000"/>
+              <w:bottom w:val="single" w:sz="4" w:space="0" w:color="000000"/>
+              <w:right w:val="single" w:sz="4" w:space="0" w:color="000000"/>
+            </w:tcBorders>
+          </w:tcPr>
+          <w:p>
+            <w:pPr>
+              <w:spacing w:line="360" w:lineRule="auto"/>
+              <w:rPr>
+                <w:b/>
+                <w:sz w:val="28"/>
+                <w:szCs w:val="28"/>
+              </w:rPr>
+            </w:pPr>
+            <w:r>
+              <w:rPr>
+                <w:b/>
+                <w:sz w:val="28"/>
+                <w:szCs w:val="28"/>
+              </w:rPr>
+              <w:t xml:space="preserve">Passo 6: </w:t>
+            </w:r>
+            <w:r>
+              <w:rPr>
+                <w:bCs/>
+                <w:sz w:val="28"/>
+                <w:szCs w:val="28"/>
+              </w:rPr>
+              <w:t>O ator visualiza os erros, corrige as informações nos campos indicados e preenche os que estavam faltando</w:t>
+            </w:r>
+            <w:r>
+              <w:rPr>
+                <w:bCs/>
+                <w:sz w:val="28"/>
+                <w:szCs w:val="28"/>
+              </w:rPr>
+              <w:t>,</w:t>
+            </w:r>
+            <w:r>
+              <w:t xml:space="preserve"> </w:t>
+            </w:r>
+            <w:r>
+              <w:rPr>
+                <w:bCs/>
+                <w:sz w:val="28"/>
+                <w:szCs w:val="28"/>
+              </w:rPr>
+              <w:t>o</w:t>
+            </w:r>
+            <w:r>
+              <w:rPr>
+                <w:bCs/>
+                <w:sz w:val="28"/>
+                <w:szCs w:val="28"/>
+              </w:rPr>
+              <w:t xml:space="preserve"> ator pressiona novamente o botão </w:t>
+            </w:r>
+            <w:r>
+              <w:rPr>
+                <w:b/>
+                <w:sz w:val="28"/>
+                <w:szCs w:val="28"/>
+              </w:rPr>
+              <w:t>"Salvar"</w:t>
+            </w:r>
+            <w:r>
+              <w:rPr>
+                <w:bCs/>
+                <w:sz w:val="28"/>
+                <w:szCs w:val="28"/>
+              </w:rPr>
+              <w:t xml:space="preserve"> para submeter os dados corrigidos.</w:t>
+            </w:r>
+            <w:r>
+              <w:rPr>
+                <w:sz w:val="28"/>
+                <w:szCs w:val="28"/>
+              </w:rPr>
+              <w:t xml:space="preserve"> (</w:t>
+            </w:r>
+            <w:r>
+              <w:rPr>
+                <w:color w:val="C9211E"/>
+                <w:sz w:val="28"/>
+                <w:szCs w:val="28"/>
+              </w:rPr>
+              <w:t>Tela 27</w:t>
+            </w:r>
+            <w:r>
+              <w:rPr>
+                <w:sz w:val="28"/>
+                <w:szCs w:val="28"/>
+              </w:rPr>
+              <w:t>)</w:t>
+            </w:r>
+          </w:p>
+        </w:tc>
+      </w:tr>
+      <w:tr>
+        <w:tc>
+          <w:tcPr>
+            <w:tcW w:w="9628" w:type="dxa"/>
+            <w:tcBorders>
+              <w:top w:val="single" w:sz="4" w:space="0" w:color="000000"/>
+              <w:left w:val="single" w:sz="4" w:space="0" w:color="000000"/>
+              <w:bottom w:val="single" w:sz="4" w:space="0" w:color="000000"/>
+              <w:right w:val="single" w:sz="4" w:space="0" w:color="000000"/>
+            </w:tcBorders>
+          </w:tcPr>
+          <w:p>
+            <w:pPr>
+              <w:spacing w:line="360" w:lineRule="auto"/>
+              <w:jc w:val="center"/>
+              <w:rPr>
+                <w:b/>
+                <w:sz w:val="28"/>
+                <w:szCs w:val="28"/>
+              </w:rPr>
+            </w:pPr>
+            <w:r>
+              <w:rPr>
+                <w:b/>
+                <w:sz w:val="28"/>
+                <w:szCs w:val="28"/>
+              </w:rPr>
+              <w:t>Fluxos Alternativo</w:t>
+            </w:r>
+          </w:p>
+        </w:tc>
+      </w:tr>
+      <w:tr>
+        <w:tc>
+          <w:tcPr>
+            <w:tcW w:w="9628" w:type="dxa"/>
+            <w:tcBorders>
+              <w:top w:val="single" w:sz="4" w:space="0" w:color="000000"/>
+              <w:left w:val="single" w:sz="4" w:space="0" w:color="000000"/>
+              <w:bottom w:val="single" w:sz="4" w:space="0" w:color="000000"/>
+              <w:right w:val="single" w:sz="4" w:space="0" w:color="000000"/>
+            </w:tcBorders>
+          </w:tcPr>
+          <w:p>
+            <w:pPr>
+              <w:spacing w:line="360" w:lineRule="auto"/>
+              <w:rPr>
+                <w:sz w:val="28"/>
+                <w:szCs w:val="28"/>
+              </w:rPr>
+            </w:pPr>
+            <w:r>
+              <w:rPr>
+                <w:b/>
+                <w:sz w:val="28"/>
+                <w:szCs w:val="28"/>
+              </w:rPr>
+              <w:t xml:space="preserve">Passo 3: </w:t>
+            </w:r>
+            <w:r>
+              <w:rPr>
+                <w:bCs/>
+                <w:sz w:val="28"/>
+                <w:szCs w:val="28"/>
+              </w:rPr>
+              <w:t xml:space="preserve">O ator pressiona o botão </w:t>
+            </w:r>
+            <w:r>
+              <w:rPr>
+                <w:b/>
+                <w:color w:val="000000" w:themeColor="text1"/>
+                <w:sz w:val="28"/>
+                <w:szCs w:val="28"/>
+              </w:rPr>
+              <w:t>"Voltar"</w:t>
+            </w:r>
+            <w:r>
+              <w:rPr>
+                <w:bCs/>
+                <w:sz w:val="28"/>
+                <w:szCs w:val="28"/>
+              </w:rPr>
+              <w:t xml:space="preserve"> e o sistema o redireciona para a "Tela de Gestores"</w:t>
+            </w:r>
+            <w:r>
+              <w:rPr>
+                <w:bCs/>
+                <w:sz w:val="28"/>
+                <w:szCs w:val="28"/>
+              </w:rPr>
+              <w:t xml:space="preserve">, </w:t>
+            </w:r>
+            <w:r>
+              <w:rPr>
+                <w:bCs/>
+                <w:sz w:val="28"/>
+                <w:szCs w:val="28"/>
+              </w:rPr>
+              <w:t>descartando quaisquer alterações não salvas.</w:t>
+            </w:r>
+            <w:r>
+              <w:rPr>
+                <w:sz w:val="28"/>
+                <w:szCs w:val="28"/>
+              </w:rPr>
+              <w:t xml:space="preserve"> (</w:t>
+            </w:r>
+            <w:r>
+              <w:rPr>
+                <w:color w:val="C9211E"/>
+                <w:sz w:val="28"/>
+                <w:szCs w:val="28"/>
+              </w:rPr>
+              <w:t>Tela 11</w:t>
+            </w:r>
+            <w:r>
+              <w:rPr>
+                <w:sz w:val="28"/>
+                <w:szCs w:val="28"/>
+              </w:rPr>
+              <w:t>)</w:t>
+            </w:r>
+          </w:p>
+          <w:p>
+            <w:pPr>
+              <w:spacing w:line="360" w:lineRule="auto"/>
+              <w:rPr>
+                <w:sz w:val="28"/>
+                <w:szCs w:val="28"/>
+              </w:rPr>
+            </w:pPr>
+            <w:r>
+              <w:rPr>
+                <w:b/>
+                <w:sz w:val="28"/>
+                <w:szCs w:val="28"/>
+              </w:rPr>
+              <w:t xml:space="preserve">Passo 6: </w:t>
+            </w:r>
+            <w:r>
+              <w:rPr>
+                <w:bCs/>
+                <w:sz w:val="28"/>
+                <w:szCs w:val="28"/>
+              </w:rPr>
+              <w:t xml:space="preserve">O ator pressiona o botão </w:t>
+            </w:r>
+            <w:r>
+              <w:rPr>
+                <w:b/>
+                <w:sz w:val="28"/>
+                <w:szCs w:val="28"/>
+              </w:rPr>
+              <w:t>"Salvar"</w:t>
+            </w:r>
+            <w:r>
+              <w:rPr>
+                <w:bCs/>
+                <w:sz w:val="28"/>
+                <w:szCs w:val="28"/>
+              </w:rPr>
+              <w:t xml:space="preserve"> e o sistema valida os dados inseridos, </w:t>
+            </w:r>
+            <w:r>
+              <w:rPr>
+                <w:sz w:val="28"/>
+                <w:szCs w:val="28"/>
+              </w:rPr>
+              <w:t>salvando as informações e exibindo uma mensagem de sucesso.</w:t>
+            </w:r>
+            <w:r>
+              <w:rPr>
+                <w:sz w:val="28"/>
+                <w:szCs w:val="28"/>
+              </w:rPr>
+              <w:t xml:space="preserve"> (</w:t>
+            </w:r>
+            <w:r>
+              <w:rPr>
+                <w:color w:val="C9211E"/>
+                <w:sz w:val="28"/>
+                <w:szCs w:val="28"/>
+              </w:rPr>
+              <w:t>Tela 27</w:t>
+            </w:r>
+            <w:r>
+              <w:rPr>
+                <w:sz w:val="28"/>
+                <w:szCs w:val="28"/>
+              </w:rPr>
+              <w:t>)</w:t>
+            </w:r>
+          </w:p>
+          <w:p>
+            <w:pPr>
+              <w:spacing w:line="360" w:lineRule="auto"/>
+              <w:rPr>
+                <w:b/>
+                <w:sz w:val="28"/>
+                <w:szCs w:val="28"/>
+              </w:rPr>
+            </w:pPr>
           </w:p>
         </w:tc>
       </w:tr>
     </w:tbl>
     <w:p>
       <w:pPr>
-        <w:pStyle w:val="Normal"/>
-        <w:spacing w:lineRule="auto" w:line="360"/>
+        <w:spacing w:line="360" w:lineRule="auto"/>
         <w:rPr>
           <w:sz w:val="32"/>
           <w:szCs w:val="32"/>
         </w:rPr>
       </w:pPr>
-      <w:r>
-        <w:rPr>
-          <w:sz w:val="32"/>
-          <w:szCs w:val="32"/>
-        </w:rPr>
-      </w:r>
     </w:p>
     <w:p>
       <w:pPr>
-        <w:pStyle w:val="Normal"/>
-        <w:spacing w:lineRule="auto" w:line="360"/>
-        <w:rPr/>
+        <w:spacing w:line="360" w:lineRule="auto"/>
       </w:pPr>
       <w:r>
         <w:rPr>
@@ -2171,23 +2419,14 @@
     <w:tbl>
       <w:tblPr>
         <w:tblW w:w="9628" w:type="dxa"/>
-        <w:jc w:val="left"/>
-        <w:tblInd w:w="0" w:type="dxa"/>
         <w:tblLayout w:type="fixed"/>
-        <w:tblCellMar>
-          <w:top w:w="0" w:type="dxa"/>
-          <w:left w:w="108" w:type="dxa"/>
-          <w:bottom w:w="0" w:type="dxa"/>
-          <w:right w:w="108" w:type="dxa"/>
-        </w:tblCellMar>
-        <w:tblLook w:firstRow="0" w:noVBand="1" w:lastRow="0" w:firstColumn="0" w:lastColumn="0" w:noHBand="0" w:val="0400"/>
+        <w:tblLook w:val="0400" w:firstRow="0" w:lastRow="0" w:firstColumn="0" w:lastColumn="0" w:noHBand="0" w:noVBand="1"/>
       </w:tblPr>
       <w:tblGrid>
         <w:gridCol w:w="2689"/>
-        <w:gridCol w:w="6938"/>
+        <w:gridCol w:w="6939"/>
       </w:tblGrid>
       <w:tr>
-        <w:trPr/>
         <w:tc>
           <w:tcPr>
             <w:tcW w:w="2689" w:type="dxa"/>
@@ -2200,9 +2439,7 @@
           </w:tcPr>
           <w:p>
             <w:pPr>
-              <w:pStyle w:val="Normal"/>
-              <w:spacing w:lineRule="auto" w:line="360"/>
-              <w:rPr/>
+              <w:spacing w:line="360" w:lineRule="auto"/>
             </w:pPr>
             <w:r>
               <w:rPr>
@@ -2226,9 +2463,7 @@
           </w:tcPr>
           <w:p>
             <w:pPr>
-              <w:pStyle w:val="Normal"/>
-              <w:spacing w:lineRule="auto" w:line="360"/>
-              <w:rPr/>
+              <w:spacing w:line="360" w:lineRule="auto"/>
             </w:pPr>
             <w:r>
               <w:rPr>
@@ -2243,39 +2478,23 @@
     </w:tbl>
     <w:p>
       <w:pPr>
-        <w:pStyle w:val="Normal"/>
-        <w:spacing w:lineRule="auto" w:line="360"/>
+        <w:spacing w:line="360" w:lineRule="auto"/>
         <w:rPr>
           <w:sz w:val="32"/>
           <w:szCs w:val="32"/>
         </w:rPr>
       </w:pPr>
-      <w:r>
-        <w:rPr>
-          <w:sz w:val="32"/>
-          <w:szCs w:val="32"/>
-        </w:rPr>
-      </w:r>
     </w:p>
     <w:tbl>
       <w:tblPr>
         <w:tblW w:w="9628" w:type="dxa"/>
-        <w:jc w:val="left"/>
-        <w:tblInd w:w="0" w:type="dxa"/>
         <w:tblLayout w:type="fixed"/>
-        <w:tblCellMar>
-          <w:top w:w="0" w:type="dxa"/>
-          <w:left w:w="108" w:type="dxa"/>
-          <w:bottom w:w="0" w:type="dxa"/>
-          <w:right w:w="108" w:type="dxa"/>
-        </w:tblCellMar>
-        <w:tblLook w:firstRow="0" w:noVBand="1" w:lastRow="0" w:firstColumn="0" w:lastColumn="0" w:noHBand="0" w:val="0400"/>
+        <w:tblLook w:val="0400" w:firstRow="0" w:lastRow="0" w:firstColumn="0" w:lastColumn="0" w:noHBand="0" w:noVBand="1"/>
       </w:tblPr>
       <w:tblGrid>
         <w:gridCol w:w="9628"/>
       </w:tblGrid>
       <w:tr>
-        <w:trPr/>
         <w:tc>
           <w:tcPr>
             <w:tcW w:w="9628" w:type="dxa"/>
@@ -2288,10 +2507,8 @@
           </w:tcPr>
           <w:p>
             <w:pPr>
-              <w:pStyle w:val="Normal"/>
-              <w:spacing w:lineRule="auto" w:line="360"/>
+              <w:spacing w:line="360" w:lineRule="auto"/>
               <w:jc w:val="center"/>
-              <w:rPr/>
             </w:pPr>
             <w:r>
               <w:rPr>
@@ -2305,7 +2522,6 @@
         </w:tc>
       </w:tr>
       <w:tr>
-        <w:trPr/>
         <w:tc>
           <w:tcPr>
             <w:tcW w:w="9628" w:type="dxa"/>
@@ -2318,16 +2534,15 @@
           </w:tcPr>
           <w:p>
             <w:pPr>
-              <w:pStyle w:val="Normal"/>
-              <w:spacing w:lineRule="auto" w:line="360"/>
+              <w:spacing w:line="360" w:lineRule="auto"/>
               <w:jc w:val="both"/>
-              <w:rPr/>
-            </w:pPr>
-            <w:r>
-              <w:rPr>
-                <w:sz w:val="28"/>
-                <w:szCs w:val="28"/>
-              </w:rPr>
+            </w:pPr>
+            <w:r>
+              <w:rPr>
+                <w:sz w:val="28"/>
+                <w:szCs w:val="28"/>
+              </w:rPr>
+              <w:lastRenderedPageBreak/>
               <w:t>1. Sistema exibe tela de início. (</w:t>
             </w:r>
             <w:r>
@@ -2348,10 +2563,8 @@
           </w:p>
           <w:p>
             <w:pPr>
-              <w:pStyle w:val="Normal"/>
-              <w:spacing w:lineRule="auto" w:line="360"/>
+              <w:spacing w:line="360" w:lineRule="auto"/>
               <w:jc w:val="both"/>
-              <w:rPr/>
             </w:pPr>
             <w:r>
               <w:rPr>
@@ -2378,10 +2591,8 @@
           </w:p>
           <w:p>
             <w:pPr>
-              <w:pStyle w:val="Normal"/>
-              <w:spacing w:lineRule="auto" w:line="360"/>
+              <w:spacing w:line="360" w:lineRule="auto"/>
               <w:jc w:val="both"/>
-              <w:rPr/>
             </w:pPr>
             <w:r>
               <w:rPr>
@@ -2408,10 +2619,8 @@
           </w:p>
           <w:p>
             <w:pPr>
-              <w:pStyle w:val="Normal"/>
-              <w:spacing w:lineRule="auto" w:line="360"/>
+              <w:spacing w:line="360" w:lineRule="auto"/>
               <w:jc w:val="both"/>
-              <w:rPr/>
             </w:pPr>
             <w:r>
               <w:rPr>
@@ -2454,10 +2663,8 @@
           </w:p>
           <w:p>
             <w:pPr>
-              <w:pStyle w:val="Normal"/>
-              <w:spacing w:lineRule="auto" w:line="360"/>
+              <w:spacing w:line="360" w:lineRule="auto"/>
               <w:jc w:val="both"/>
-              <w:rPr/>
             </w:pPr>
             <w:r>
               <w:rPr>
@@ -2484,9 +2691,7 @@
           </w:p>
           <w:p>
             <w:pPr>
-              <w:pStyle w:val="Normal"/>
-              <w:spacing w:lineRule="auto" w:line="360"/>
-              <w:rPr/>
+              <w:spacing w:line="360" w:lineRule="auto"/>
             </w:pPr>
             <w:r>
               <w:rPr>
@@ -2529,9 +2734,7 @@
           </w:p>
           <w:p>
             <w:pPr>
-              <w:pStyle w:val="Normal"/>
-              <w:spacing w:lineRule="auto" w:line="360"/>
-              <w:rPr/>
+              <w:spacing w:line="360" w:lineRule="auto"/>
             </w:pPr>
             <w:r>
               <w:rPr>
@@ -2547,6 +2750,230 @@
                 <w:szCs w:val="28"/>
               </w:rPr>
               <w:t>Tela 20</w:t>
+            </w:r>
+            <w:r>
+              <w:rPr>
+                <w:sz w:val="28"/>
+                <w:szCs w:val="28"/>
+              </w:rPr>
+              <w:t>)</w:t>
+            </w:r>
+          </w:p>
+        </w:tc>
+      </w:tr>
+      <w:tr>
+        <w:tc>
+          <w:tcPr>
+            <w:tcW w:w="9628" w:type="dxa"/>
+            <w:tcBorders>
+              <w:top w:val="single" w:sz="4" w:space="0" w:color="000000"/>
+              <w:left w:val="single" w:sz="4" w:space="0" w:color="000000"/>
+              <w:bottom w:val="single" w:sz="4" w:space="0" w:color="000000"/>
+              <w:right w:val="single" w:sz="4" w:space="0" w:color="000000"/>
+            </w:tcBorders>
+          </w:tcPr>
+          <w:p>
+            <w:pPr>
+              <w:spacing w:line="360" w:lineRule="auto"/>
+              <w:jc w:val="center"/>
+              <w:rPr>
+                <w:sz w:val="28"/>
+                <w:szCs w:val="28"/>
+              </w:rPr>
+            </w:pPr>
+            <w:r>
+              <w:rPr>
+                <w:b/>
+                <w:sz w:val="28"/>
+                <w:szCs w:val="28"/>
+              </w:rPr>
+              <w:t>Fluxos Alternativo</w:t>
+            </w:r>
+          </w:p>
+        </w:tc>
+      </w:tr>
+      <w:tr>
+        <w:tc>
+          <w:tcPr>
+            <w:tcW w:w="9628" w:type="dxa"/>
+            <w:tcBorders>
+              <w:top w:val="single" w:sz="4" w:space="0" w:color="000000"/>
+              <w:left w:val="single" w:sz="4" w:space="0" w:color="000000"/>
+              <w:bottom w:val="single" w:sz="4" w:space="0" w:color="000000"/>
+              <w:right w:val="single" w:sz="4" w:space="0" w:color="000000"/>
+            </w:tcBorders>
+          </w:tcPr>
+          <w:p>
+            <w:pPr>
+              <w:spacing w:line="360" w:lineRule="auto"/>
+              <w:rPr>
+                <w:sz w:val="28"/>
+                <w:szCs w:val="28"/>
+              </w:rPr>
+            </w:pPr>
+            <w:r>
+              <w:rPr>
+                <w:b/>
+                <w:sz w:val="28"/>
+                <w:szCs w:val="28"/>
+              </w:rPr>
+              <w:t xml:space="preserve">Passo 3: </w:t>
+            </w:r>
+            <w:r>
+              <w:rPr>
+                <w:bCs/>
+                <w:sz w:val="28"/>
+                <w:szCs w:val="28"/>
+              </w:rPr>
+              <w:t xml:space="preserve">O ator pressiona o botão </w:t>
+            </w:r>
+            <w:r>
+              <w:rPr>
+                <w:b/>
+                <w:color w:val="000000" w:themeColor="text1"/>
+                <w:sz w:val="28"/>
+                <w:szCs w:val="28"/>
+              </w:rPr>
+              <w:t>"Voltar"</w:t>
+            </w:r>
+            <w:r>
+              <w:rPr>
+                <w:bCs/>
+                <w:sz w:val="28"/>
+                <w:szCs w:val="28"/>
+              </w:rPr>
+              <w:t xml:space="preserve"> e o sistema o redireciona para a "Tela de Gestores"</w:t>
+            </w:r>
+            <w:r>
+              <w:rPr>
+                <w:bCs/>
+                <w:sz w:val="28"/>
+                <w:szCs w:val="28"/>
+              </w:rPr>
+              <w:t xml:space="preserve">, </w:t>
+            </w:r>
+            <w:r>
+              <w:rPr>
+                <w:bCs/>
+                <w:sz w:val="28"/>
+                <w:szCs w:val="28"/>
+              </w:rPr>
+              <w:t>descartando quaisquer alterações não salvas.</w:t>
+            </w:r>
+            <w:r>
+              <w:rPr>
+                <w:sz w:val="28"/>
+                <w:szCs w:val="28"/>
+              </w:rPr>
+              <w:t xml:space="preserve"> (</w:t>
+            </w:r>
+            <w:r>
+              <w:rPr>
+                <w:color w:val="C9211E"/>
+                <w:sz w:val="28"/>
+                <w:szCs w:val="28"/>
+              </w:rPr>
+              <w:t>Tela 11</w:t>
+            </w:r>
+            <w:r>
+              <w:rPr>
+                <w:sz w:val="28"/>
+                <w:szCs w:val="28"/>
+              </w:rPr>
+              <w:t>)</w:t>
+            </w:r>
+          </w:p>
+          <w:p>
+            <w:pPr>
+              <w:spacing w:line="360" w:lineRule="auto"/>
+              <w:rPr>
+                <w:sz w:val="28"/>
+                <w:szCs w:val="28"/>
+              </w:rPr>
+            </w:pPr>
+            <w:r>
+              <w:rPr>
+                <w:b/>
+                <w:sz w:val="28"/>
+                <w:szCs w:val="28"/>
+              </w:rPr>
+              <w:t xml:space="preserve">Passo </w:t>
+            </w:r>
+            <w:r>
+              <w:rPr>
+                <w:b/>
+                <w:sz w:val="28"/>
+                <w:szCs w:val="28"/>
+              </w:rPr>
+              <w:t>6</w:t>
+            </w:r>
+            <w:r>
+              <w:rPr>
+                <w:b/>
+                <w:sz w:val="28"/>
+                <w:szCs w:val="28"/>
+              </w:rPr>
+              <w:t xml:space="preserve">: </w:t>
+            </w:r>
+            <w:r>
+              <w:rPr>
+                <w:sz w:val="28"/>
+                <w:szCs w:val="28"/>
+              </w:rPr>
+              <w:t>Caso o ator pressione o ícone “</w:t>
+            </w:r>
+            <w:r>
+              <w:rPr>
+                <w:b/>
+                <w:bCs/>
+                <w:sz w:val="28"/>
+                <w:szCs w:val="28"/>
+              </w:rPr>
+              <w:t>Deletar</w:t>
+            </w:r>
+            <w:r>
+              <w:rPr>
+                <w:sz w:val="28"/>
+                <w:szCs w:val="28"/>
+              </w:rPr>
+              <w:t xml:space="preserve">”, irá aparecer um pop-up perguntando: “Deseja remover o </w:t>
+            </w:r>
+            <w:r>
+              <w:rPr>
+                <w:sz w:val="28"/>
+                <w:szCs w:val="28"/>
+              </w:rPr>
+              <w:t>remover o Gestor</w:t>
+            </w:r>
+            <w:r>
+              <w:rPr>
+                <w:sz w:val="28"/>
+                <w:szCs w:val="28"/>
+              </w:rPr>
+              <w:t>?”, com as opções sim ou não.</w:t>
+            </w:r>
+            <w:r>
+              <w:rPr>
+                <w:sz w:val="28"/>
+                <w:szCs w:val="28"/>
+              </w:rPr>
+              <w:t xml:space="preserve"> (</w:t>
+            </w:r>
+            <w:r>
+              <w:rPr>
+                <w:color w:val="C9211E"/>
+                <w:sz w:val="28"/>
+                <w:szCs w:val="28"/>
+              </w:rPr>
+              <w:t xml:space="preserve">Tela </w:t>
+            </w:r>
+            <w:r>
+              <w:rPr>
+                <w:color w:val="C9211E"/>
+                <w:sz w:val="28"/>
+                <w:szCs w:val="28"/>
+              </w:rPr>
+              <w:t>20</w:t>
             </w:r>
             <w:r>
               <w:rPr>
@@ -2561,42 +2988,26 @@
     </w:tbl>
     <w:p>
       <w:pPr>
-        <w:pStyle w:val="Normal"/>
-        <w:spacing w:lineRule="auto" w:line="360"/>
+        <w:spacing w:line="360" w:lineRule="auto"/>
         <w:rPr>
           <w:sz w:val="28"/>
           <w:szCs w:val="28"/>
         </w:rPr>
       </w:pPr>
-      <w:r>
-        <w:rPr>
-          <w:sz w:val="28"/>
-          <w:szCs w:val="28"/>
-        </w:rPr>
-      </w:r>
     </w:p>
     <w:p>
       <w:pPr>
-        <w:pStyle w:val="Normal"/>
-        <w:spacing w:lineRule="auto" w:line="360"/>
+        <w:spacing w:line="360" w:lineRule="auto"/>
         <w:rPr>
           <w:sz w:val="28"/>
           <w:szCs w:val="28"/>
         </w:rPr>
       </w:pPr>
-      <w:r>
-        <w:rPr>
-          <w:sz w:val="28"/>
-          <w:szCs w:val="28"/>
-        </w:rPr>
-      </w:r>
     </w:p>
     <w:p>
       <w:pPr>
-        <w:pStyle w:val="Normal"/>
-        <w:spacing w:lineRule="auto" w:line="360"/>
+        <w:spacing w:line="360" w:lineRule="auto"/>
         <w:jc w:val="center"/>
-        <w:rPr/>
       </w:pPr>
       <w:r>
         <w:rPr>
@@ -2610,16 +3021,8 @@
     <w:tbl>
       <w:tblPr>
         <w:tblW w:w="9628" w:type="dxa"/>
-        <w:jc w:val="left"/>
-        <w:tblInd w:w="0" w:type="dxa"/>
         <w:tblLayout w:type="fixed"/>
-        <w:tblCellMar>
-          <w:top w:w="0" w:type="dxa"/>
-          <w:left w:w="108" w:type="dxa"/>
-          <w:bottom w:w="0" w:type="dxa"/>
-          <w:right w:w="108" w:type="dxa"/>
-        </w:tblCellMar>
-        <w:tblLook w:firstRow="0" w:noVBand="1" w:lastRow="0" w:firstColumn="0" w:lastColumn="0" w:noHBand="0" w:val="0400"/>
+        <w:tblLook w:val="0400" w:firstRow="0" w:lastRow="0" w:firstColumn="0" w:lastColumn="0" w:noHBand="0" w:noVBand="1"/>
       </w:tblPr>
       <w:tblGrid>
         <w:gridCol w:w="3209"/>
@@ -2627,7 +3030,6 @@
         <w:gridCol w:w="3210"/>
       </w:tblGrid>
       <w:tr>
-        <w:trPr/>
         <w:tc>
           <w:tcPr>
             <w:tcW w:w="3209" w:type="dxa"/>
@@ -2640,10 +3042,8 @@
           </w:tcPr>
           <w:p>
             <w:pPr>
-              <w:pStyle w:val="Normal"/>
-              <w:spacing w:lineRule="auto" w:line="360"/>
+              <w:spacing w:line="360" w:lineRule="auto"/>
               <w:jc w:val="center"/>
-              <w:rPr/>
             </w:pPr>
             <w:r>
               <w:rPr>
@@ -2666,10 +3066,8 @@
           </w:tcPr>
           <w:p>
             <w:pPr>
-              <w:pStyle w:val="Normal"/>
-              <w:spacing w:lineRule="auto" w:line="360"/>
+              <w:spacing w:line="360" w:lineRule="auto"/>
               <w:jc w:val="center"/>
-              <w:rPr/>
             </w:pPr>
             <w:r>
               <w:rPr>
@@ -2692,10 +3090,8 @@
           </w:tcPr>
           <w:p>
             <w:pPr>
-              <w:pStyle w:val="Normal"/>
-              <w:spacing w:lineRule="auto" w:line="360"/>
+              <w:spacing w:line="360" w:lineRule="auto"/>
               <w:jc w:val="center"/>
-              <w:rPr/>
             </w:pPr>
             <w:r>
               <w:rPr>
@@ -2708,7 +3104,6 @@
         </w:tc>
       </w:tr>
       <w:tr>
-        <w:trPr/>
         <w:tc>
           <w:tcPr>
             <w:tcW w:w="3209" w:type="dxa"/>
@@ -2721,10 +3116,8 @@
           </w:tcPr>
           <w:p>
             <w:pPr>
-              <w:pStyle w:val="Normal"/>
-              <w:spacing w:lineRule="auto" w:line="360"/>
+              <w:spacing w:line="360" w:lineRule="auto"/>
               <w:jc w:val="center"/>
-              <w:rPr/>
             </w:pPr>
             <w:r>
               <w:rPr>
@@ -2747,10 +3140,8 @@
           </w:tcPr>
           <w:p>
             <w:pPr>
-              <w:pStyle w:val="Normal"/>
-              <w:spacing w:lineRule="auto" w:line="360"/>
+              <w:spacing w:line="360" w:lineRule="auto"/>
               <w:jc w:val="center"/>
-              <w:rPr/>
             </w:pPr>
             <w:r>
               <w:rPr>
@@ -2773,10 +3164,8 @@
           </w:tcPr>
           <w:p>
             <w:pPr>
-              <w:pStyle w:val="Normal"/>
-              <w:spacing w:lineRule="auto" w:line="360"/>
+              <w:spacing w:line="360" w:lineRule="auto"/>
               <w:jc w:val="center"/>
-              <w:rPr/>
             </w:pPr>
             <w:r>
               <w:rPr>
@@ -2791,34 +3180,30 @@
     </w:tbl>
     <w:p>
       <w:pPr>
-        <w:pStyle w:val="Normal"/>
-        <w:spacing w:lineRule="auto" w:line="360"/>
+        <w:spacing w:line="360" w:lineRule="auto"/>
         <w:rPr>
           <w:u w:val="single"/>
         </w:rPr>
       </w:pPr>
-      <w:r>
-        <w:rPr>
-          <w:u w:val="single"/>
-        </w:rPr>
-      </w:r>
     </w:p>
     <w:sectPr>
-      <w:type w:val="nextPage"/>
       <w:pgSz w:w="11906" w:h="16838"/>
-      <w:pgMar w:left="1134" w:right="1134" w:gutter="0" w:header="0" w:top="1701" w:footer="0" w:bottom="1701"/>
-      <w:pgNumType w:start="1" w:fmt="decimal"/>
-      <w:formProt w:val="false"/>
-      <w:textDirection w:val="lrTb"/>
-      <w:docGrid w:type="default" w:linePitch="100" w:charSpace="0"/>
+      <w:pgMar w:top="1701" w:right="1134" w:bottom="1701" w:left="1134" w:header="0" w:footer="0" w:gutter="0"/>
+      <w:pgNumType w:start="1"/>
+      <w:cols w:space="720"/>
+      <w:formProt w:val="0"/>
+      <w:docGrid w:linePitch="100"/>
     </w:sectPr>
   </w:body>
 </w:document>
 </file>
 
 <file path=word/numbering.xml><?xml version="1.0" encoding="utf-8"?>
-<w:numbering xmlns:w="http://schemas.openxmlformats.org/wordprocessingml/2006/main" xmlns:o="urn:schemas-microsoft-com:office:office" xmlns:r="http://schemas.openxmlformats.org/officeDocument/2006/relationships" xmlns:v="urn:schemas-microsoft-com:vml" xmlns:mc="http://schemas.openxmlformats.org/markup-compatibility/2006" xmlns:w14="http://schemas.microsoft.com/office/word/2010/wordml" mc:Ignorable="w14">
-  <w:abstractNum w:abstractNumId="1">
+<w:numbering xmlns:wpc="http://schemas.microsoft.com/office/word/2010/wordprocessingCanvas" xmlns:cx="http://schemas.microsoft.com/office/drawing/2014/chartex" xmlns:cx1="http://schemas.microsoft.com/office/drawing/2015/9/8/chartex" xmlns:cx2="http://schemas.microsoft.com/office/drawing/2015/10/21/chartex" xmlns:cx3="http://schemas.microsoft.com/office/drawing/2016/5/9/chartex" xmlns:cx4="http://schemas.microsoft.com/office/drawing/2016/5/10/chartex" xmlns:cx5="http://schemas.microsoft.com/office/drawing/2016/5/11/chartex" xmlns:cx6="http://schemas.microsoft.com/office/drawing/2016/5/12/chartex" xmlns:cx7="http://schemas.microsoft.com/office/drawing/2016/5/13/chartex" xmlns:cx8="http://schemas.microsoft.com/office/drawing/2016/5/14/chartex" xmlns:mc="http://schemas.openxmlformats.org/markup-compatibility/2006" xmlns:aink="http://schemas.microsoft.com/office/drawing/2016/ink" xmlns:am3d="http://schemas.microsoft.com/office/drawing/2017/model3d" xmlns:o="urn:schemas-microsoft-com:office:office" xmlns:oel="http://schemas.microsoft.com/office/2019/extlst" xmlns:r="http://schemas.openxmlformats.org/officeDocument/2006/relationships" xmlns:m="http://schemas.openxmlformats.org/officeDocument/2006/math" xmlns:v="urn:schemas-microsoft-com:vml" xmlns:wp14="http://schemas.microsoft.com/office/word/2010/wordprocessingDrawing" xmlns:wp="http://schemas.openxmlformats.org/drawingml/2006/wordprocessingDrawing" xmlns:w10="urn:schemas-microsoft-com:office:word" xmlns:w="http://schemas.openxmlformats.org/wordprocessingml/2006/main" xmlns:w14="http://schemas.microsoft.com/office/word/2010/wordml" xmlns:w15="http://schemas.microsoft.com/office/word/2012/wordml" xmlns:w16cex="http://schemas.microsoft.com/office/word/2018/wordml/cex" xmlns:w16cid="http://schemas.microsoft.com/office/word/2016/wordml/cid" xmlns:w16="http://schemas.microsoft.com/office/word/2018/wordml" xmlns:w16du="http://schemas.microsoft.com/office/word/2023/wordml/word16du" xmlns:w16sdtdh="http://schemas.microsoft.com/office/word/2020/wordml/sdtdatahash" xmlns:w16se="http://schemas.microsoft.com/office/word/2015/wordml/symex" xmlns:wpg="http://schemas.microsoft.com/office/word/2010/wordprocessingGroup" xmlns:wpi="http://schemas.microsoft.com/office/word/2010/wordprocessingInk" xmlns:wne="http://schemas.microsoft.com/office/word/2006/wordml" xmlns:wps="http://schemas.microsoft.com/office/word/2010/wordprocessingShape" mc:Ignorable="w14 w15 w16se w16cid w16 w16cex w16sdtdh w16du wp14">
+  <w:abstractNum w:abstractNumId="0" w15:restartNumberingAfterBreak="0">
+    <w:nsid w:val="3DB46C11"/>
+    <w:multiLevelType w:val="multilevel"/>
+    <w:tmpl w:val="0ADAA748"/>
     <w:lvl w:ilvl="0">
       <w:start w:val="1"/>
       <w:numFmt w:val="lowerLetter"/>
@@ -2831,8 +3216,8 @@
         <w:ind w:left="720" w:hanging="360"/>
       </w:pPr>
       <w:rPr>
+        <w:color w:val="000000"/>
         <w:u w:val="none"/>
-        <w:color w:val="000000"/>
       </w:rPr>
     </w:lvl>
     <w:lvl w:ilvl="1">
@@ -2956,7 +3341,10 @@
       </w:rPr>
     </w:lvl>
   </w:abstractNum>
-  <w:abstractNum w:abstractNumId="2">
+  <w:abstractNum w:abstractNumId="1" w15:restartNumberingAfterBreak="0">
+    <w:nsid w:val="6FD46D88"/>
+    <w:multiLevelType w:val="multilevel"/>
+    <w:tmpl w:val="9B26A94C"/>
     <w:lvl w:ilvl="0">
       <w:start w:val="1"/>
       <w:numFmt w:val="none"/>
@@ -2967,7 +3355,7 @@
         <w:tabs>
           <w:tab w:val="num" w:pos="0"/>
         </w:tabs>
-        <w:ind w:left="0" w:hanging="0"/>
+        <w:ind w:left="0" w:firstLine="0"/>
       </w:pPr>
     </w:lvl>
     <w:lvl w:ilvl="1">
@@ -2980,7 +3368,7 @@
         <w:tabs>
           <w:tab w:val="num" w:pos="0"/>
         </w:tabs>
-        <w:ind w:left="0" w:hanging="0"/>
+        <w:ind w:left="0" w:firstLine="0"/>
       </w:pPr>
     </w:lvl>
     <w:lvl w:ilvl="2">
@@ -2993,7 +3381,7 @@
         <w:tabs>
           <w:tab w:val="num" w:pos="0"/>
         </w:tabs>
-        <w:ind w:left="0" w:hanging="0"/>
+        <w:ind w:left="0" w:firstLine="0"/>
       </w:pPr>
     </w:lvl>
     <w:lvl w:ilvl="3">
@@ -3006,7 +3394,7 @@
         <w:tabs>
           <w:tab w:val="num" w:pos="0"/>
         </w:tabs>
-        <w:ind w:left="0" w:hanging="0"/>
+        <w:ind w:left="0" w:firstLine="0"/>
       </w:pPr>
     </w:lvl>
     <w:lvl w:ilvl="4">
@@ -3019,7 +3407,7 @@
         <w:tabs>
           <w:tab w:val="num" w:pos="0"/>
         </w:tabs>
-        <w:ind w:left="0" w:hanging="0"/>
+        <w:ind w:left="0" w:firstLine="0"/>
       </w:pPr>
     </w:lvl>
     <w:lvl w:ilvl="5">
@@ -3032,7 +3420,7 @@
         <w:tabs>
           <w:tab w:val="num" w:pos="0"/>
         </w:tabs>
-        <w:ind w:left="0" w:hanging="0"/>
+        <w:ind w:left="0" w:firstLine="0"/>
       </w:pPr>
     </w:lvl>
     <w:lvl w:ilvl="6">
@@ -3045,7 +3433,7 @@
         <w:tabs>
           <w:tab w:val="num" w:pos="0"/>
         </w:tabs>
-        <w:ind w:left="0" w:hanging="0"/>
+        <w:ind w:left="0" w:firstLine="0"/>
       </w:pPr>
     </w:lvl>
     <w:lvl w:ilvl="7">
@@ -3058,7 +3446,7 @@
         <w:tabs>
           <w:tab w:val="num" w:pos="0"/>
         </w:tabs>
-        <w:ind w:left="0" w:hanging="0"/>
+        <w:ind w:left="0" w:firstLine="0"/>
       </w:pPr>
     </w:lvl>
     <w:lvl w:ilvl="8">
@@ -3071,25 +3459,25 @@
         <w:tabs>
           <w:tab w:val="num" w:pos="0"/>
         </w:tabs>
-        <w:ind w:left="0" w:hanging="0"/>
+        <w:ind w:left="0" w:firstLine="0"/>
       </w:pPr>
     </w:lvl>
   </w:abstractNum>
-  <w:num w:numId="1">
+  <w:num w:numId="1" w16cid:durableId="1720664090">
+    <w:abstractNumId w:val="0"/>
+  </w:num>
+  <w:num w:numId="2" w16cid:durableId="666595531">
     <w:abstractNumId w:val="1"/>
-  </w:num>
-  <w:num w:numId="2">
-    <w:abstractNumId w:val="2"/>
   </w:num>
 </w:numbering>
 </file>
 
 <file path=word/styles.xml><?xml version="1.0" encoding="utf-8"?>
-<w:styles xmlns:w="http://schemas.openxmlformats.org/wordprocessingml/2006/main" xmlns:w14="http://schemas.microsoft.com/office/word/2010/wordml" xmlns:mc="http://schemas.openxmlformats.org/markup-compatibility/2006" mc:Ignorable="w14">
+<w:styles xmlns:mc="http://schemas.openxmlformats.org/markup-compatibility/2006" xmlns:r="http://schemas.openxmlformats.org/officeDocument/2006/relationships" xmlns:w="http://schemas.openxmlformats.org/wordprocessingml/2006/main" xmlns:w14="http://schemas.microsoft.com/office/word/2010/wordml" xmlns:w15="http://schemas.microsoft.com/office/word/2012/wordml" xmlns:w16cex="http://schemas.microsoft.com/office/word/2018/wordml/cex" xmlns:w16cid="http://schemas.microsoft.com/office/word/2016/wordml/cid" xmlns:w16="http://schemas.microsoft.com/office/word/2018/wordml" xmlns:w16du="http://schemas.microsoft.com/office/word/2023/wordml/word16du" xmlns:w16sdtdh="http://schemas.microsoft.com/office/word/2020/wordml/sdtdatahash" xmlns:w16se="http://schemas.microsoft.com/office/word/2015/wordml/symex" mc:Ignorable="w14 w15 w16se w16cid w16 w16cex w16sdtdh w16du">
   <w:docDefaults>
     <w:rPrDefault>
       <w:rPr>
-        <w:rFonts w:ascii="Aptos" w:hAnsi="Aptos" w:eastAsia="Aptos" w:cs="" w:asciiTheme="minorHAnsi" w:cstheme="minorBidi" w:eastAsiaTheme="minorHAnsi" w:hAnsiTheme="minorHAnsi"/>
+        <w:rFonts w:asciiTheme="minorHAnsi" w:eastAsiaTheme="minorHAnsi" w:hAnsiTheme="minorHAnsi" w:cstheme="minorBidi"/>
         <w:kern w:val="2"/>
         <w:sz w:val="22"/>
         <w:szCs w:val="22"/>
@@ -3099,21 +3487,21 @@
     </w:rPrDefault>
     <w:pPrDefault>
       <w:pPr>
-        <w:suppressAutoHyphens w:val="true"/>
+        <w:suppressAutoHyphens/>
       </w:pPr>
     </w:pPrDefault>
   </w:docDefaults>
   <w:latentStyles w:defLockedState="0" w:defUIPriority="99" w:defSemiHidden="0" w:defUnhideWhenUsed="0" w:defQFormat="0" w:count="376">
     <w:lsdException w:name="Normal" w:uiPriority="0" w:qFormat="1"/>
     <w:lsdException w:name="heading 1" w:uiPriority="9" w:qFormat="1"/>
-    <w:lsdException w:name="heading 2" w:uiPriority="9" w:semiHidden="1" w:unhideWhenUsed="1" w:qFormat="1"/>
-    <w:lsdException w:name="heading 3" w:uiPriority="9" w:semiHidden="1" w:unhideWhenUsed="1" w:qFormat="1"/>
-    <w:lsdException w:name="heading 4" w:uiPriority="9" w:semiHidden="1" w:unhideWhenUsed="1" w:qFormat="1"/>
-    <w:lsdException w:name="heading 5" w:uiPriority="9" w:semiHidden="1" w:unhideWhenUsed="1" w:qFormat="1"/>
-    <w:lsdException w:name="heading 6" w:uiPriority="9" w:semiHidden="1" w:unhideWhenUsed="1" w:qFormat="1"/>
-    <w:lsdException w:name="heading 7" w:uiPriority="9" w:semiHidden="1" w:unhideWhenUsed="1" w:qFormat="1"/>
-    <w:lsdException w:name="heading 8" w:uiPriority="9" w:semiHidden="1" w:unhideWhenUsed="1" w:qFormat="1"/>
-    <w:lsdException w:name="heading 9" w:uiPriority="9" w:semiHidden="1" w:unhideWhenUsed="1" w:qFormat="1"/>
+    <w:lsdException w:name="heading 2" w:semiHidden="1" w:uiPriority="9" w:unhideWhenUsed="1" w:qFormat="1"/>
+    <w:lsdException w:name="heading 3" w:semiHidden="1" w:uiPriority="9" w:unhideWhenUsed="1" w:qFormat="1"/>
+    <w:lsdException w:name="heading 4" w:semiHidden="1" w:uiPriority="9" w:unhideWhenUsed="1" w:qFormat="1"/>
+    <w:lsdException w:name="heading 5" w:semiHidden="1" w:uiPriority="9" w:unhideWhenUsed="1" w:qFormat="1"/>
+    <w:lsdException w:name="heading 6" w:semiHidden="1" w:uiPriority="9" w:unhideWhenUsed="1" w:qFormat="1"/>
+    <w:lsdException w:name="heading 7" w:semiHidden="1" w:uiPriority="9" w:unhideWhenUsed="1" w:qFormat="1"/>
+    <w:lsdException w:name="heading 8" w:semiHidden="1" w:uiPriority="9" w:unhideWhenUsed="1" w:qFormat="1"/>
+    <w:lsdException w:name="heading 9" w:semiHidden="1" w:uiPriority="9" w:unhideWhenUsed="1" w:qFormat="1"/>
     <w:lsdException w:name="index 1" w:semiHidden="1" w:unhideWhenUsed="1"/>
     <w:lsdException w:name="index 2" w:semiHidden="1" w:unhideWhenUsed="1"/>
     <w:lsdException w:name="index 3" w:semiHidden="1" w:unhideWhenUsed="1"/>
@@ -3123,22 +3511,22 @@
     <w:lsdException w:name="index 7" w:semiHidden="1" w:unhideWhenUsed="1"/>
     <w:lsdException w:name="index 8" w:semiHidden="1" w:unhideWhenUsed="1"/>
     <w:lsdException w:name="index 9" w:semiHidden="1" w:unhideWhenUsed="1"/>
-    <w:lsdException w:name="toc 1" w:uiPriority="39" w:semiHidden="1" w:unhideWhenUsed="1"/>
-    <w:lsdException w:name="toc 2" w:uiPriority="39" w:semiHidden="1" w:unhideWhenUsed="1"/>
-    <w:lsdException w:name="toc 3" w:uiPriority="39" w:semiHidden="1" w:unhideWhenUsed="1"/>
-    <w:lsdException w:name="toc 4" w:uiPriority="39" w:semiHidden="1" w:unhideWhenUsed="1"/>
-    <w:lsdException w:name="toc 5" w:uiPriority="39" w:semiHidden="1" w:unhideWhenUsed="1"/>
-    <w:lsdException w:name="toc 6" w:uiPriority="39" w:semiHidden="1" w:unhideWhenUsed="1"/>
-    <w:lsdException w:name="toc 7" w:uiPriority="39" w:semiHidden="1" w:unhideWhenUsed="1"/>
-    <w:lsdException w:name="toc 8" w:uiPriority="39" w:semiHidden="1" w:unhideWhenUsed="1"/>
-    <w:lsdException w:name="toc 9" w:uiPriority="39" w:semiHidden="1" w:unhideWhenUsed="1"/>
+    <w:lsdException w:name="toc 1" w:semiHidden="1" w:uiPriority="39" w:unhideWhenUsed="1"/>
+    <w:lsdException w:name="toc 2" w:semiHidden="1" w:uiPriority="39" w:unhideWhenUsed="1"/>
+    <w:lsdException w:name="toc 3" w:semiHidden="1" w:uiPriority="39" w:unhideWhenUsed="1"/>
+    <w:lsdException w:name="toc 4" w:semiHidden="1" w:uiPriority="39" w:unhideWhenUsed="1"/>
+    <w:lsdException w:name="toc 5" w:semiHidden="1" w:uiPriority="39" w:unhideWhenUsed="1"/>
+    <w:lsdException w:name="toc 6" w:semiHidden="1" w:uiPriority="39" w:unhideWhenUsed="1"/>
+    <w:lsdException w:name="toc 7" w:semiHidden="1" w:uiPriority="39" w:unhideWhenUsed="1"/>
+    <w:lsdException w:name="toc 8" w:semiHidden="1" w:uiPriority="39" w:unhideWhenUsed="1"/>
+    <w:lsdException w:name="toc 9" w:semiHidden="1" w:uiPriority="39" w:unhideWhenUsed="1"/>
     <w:lsdException w:name="Normal Indent" w:semiHidden="1" w:unhideWhenUsed="1"/>
     <w:lsdException w:name="footnote text" w:semiHidden="1" w:unhideWhenUsed="1"/>
     <w:lsdException w:name="annotation text" w:semiHidden="1" w:unhideWhenUsed="1"/>
     <w:lsdException w:name="header" w:semiHidden="1" w:unhideWhenUsed="1"/>
     <w:lsdException w:name="footer" w:semiHidden="1" w:unhideWhenUsed="1"/>
     <w:lsdException w:name="index heading" w:semiHidden="1" w:unhideWhenUsed="1"/>
-    <w:lsdException w:name="caption" w:uiPriority="35" w:semiHidden="1" w:unhideWhenUsed="1" w:qFormat="1"/>
+    <w:lsdException w:name="caption" w:semiHidden="1" w:uiPriority="35" w:unhideWhenUsed="1" w:qFormat="1"/>
     <w:lsdException w:name="table of figures" w:semiHidden="1" w:unhideWhenUsed="1"/>
     <w:lsdException w:name="envelope address" w:semiHidden="1" w:unhideWhenUsed="1"/>
     <w:lsdException w:name="envelope return" w:semiHidden="1" w:unhideWhenUsed="1"/>
@@ -3169,7 +3557,7 @@
     <w:lsdException w:name="Title" w:uiPriority="10" w:qFormat="1"/>
     <w:lsdException w:name="Closing" w:semiHidden="1" w:unhideWhenUsed="1"/>
     <w:lsdException w:name="Signature" w:semiHidden="1" w:unhideWhenUsed="1"/>
-    <w:lsdException w:name="Default Paragraph Font" w:uiPriority="1" w:semiHidden="1" w:unhideWhenUsed="1"/>
+    <w:lsdException w:name="Default Paragraph Font" w:semiHidden="1" w:uiPriority="1" w:unhideWhenUsed="1"/>
     <w:lsdException w:name="Body Text" w:semiHidden="1" w:unhideWhenUsed="1"/>
     <w:lsdException w:name="Body Text Indent" w:semiHidden="1" w:unhideWhenUsed="1"/>
     <w:lsdException w:name="List Continue" w:semiHidden="1" w:unhideWhenUsed="1"/>
@@ -3369,8 +3757,8 @@
     <w:lsdException w:name="Subtle Reference" w:uiPriority="31" w:qFormat="1"/>
     <w:lsdException w:name="Intense Reference" w:uiPriority="32" w:qFormat="1"/>
     <w:lsdException w:name="Book Title" w:uiPriority="33" w:qFormat="1"/>
-    <w:lsdException w:name="Bibliography" w:uiPriority="37" w:semiHidden="1" w:unhideWhenUsed="1"/>
-    <w:lsdException w:name="TOC Heading" w:uiPriority="39" w:semiHidden="1" w:unhideWhenUsed="1" w:qFormat="1"/>
+    <w:lsdException w:name="Bibliography" w:semiHidden="1" w:uiPriority="37" w:unhideWhenUsed="1"/>
+    <w:lsdException w:name="TOC Heading" w:semiHidden="1" w:uiPriority="39" w:unhideWhenUsed="1" w:qFormat="1"/>
     <w:lsdException w:name="Plain Table 1" w:uiPriority="41"/>
     <w:lsdException w:name="Plain Table 2" w:uiPriority="42"/>
     <w:lsdException w:name="Plain Table 3" w:uiPriority="43"/>
@@ -3481,50 +3869,41 @@
     <w:lsdException w:name="Unresolved Mention" w:semiHidden="1" w:unhideWhenUsed="1"/>
     <w:lsdException w:name="Smart Link" w:semiHidden="1" w:unhideWhenUsed="1"/>
   </w:latentStyles>
-  <w:style w:type="paragraph" w:styleId="Normal" w:default="1">
+  <w:style w:type="paragraph" w:default="1" w:styleId="Normal">
     <w:name w:val="Normal"/>
     <w:qFormat/>
-    <w:rsid w:val="004c3f10"/>
-    <w:pPr>
-      <w:widowControl/>
-      <w:suppressAutoHyphens w:val="true"/>
-      <w:bidi w:val="0"/>
-      <w:spacing w:lineRule="auto" w:line="240" w:before="0" w:after="0"/>
-      <w:jc w:val="left"/>
-    </w:pPr>
+    <w:rsid w:val="003622D3"/>
     <w:rPr>
-      <w:rFonts w:ascii="Times New Roman" w:hAnsi="Times New Roman" w:eastAsia="Times New Roman" w:cs="Times New Roman"/>
-      <w:color w:val="auto"/>
+      <w:rFonts w:ascii="Times New Roman" w:eastAsia="Times New Roman" w:hAnsi="Times New Roman" w:cs="Times New Roman"/>
       <w:kern w:val="0"/>
       <w:sz w:val="24"/>
       <w:szCs w:val="24"/>
-      <w:lang w:val="pt-BR" w:eastAsia="pt-BR" w:bidi="ar-SA"/>
-      <w14:ligatures w14:val="none"/>
+      <w:lang w:eastAsia="pt-BR"/>
     </w:rPr>
   </w:style>
-  <w:style w:type="paragraph" w:styleId="Heading1">
-    <w:name w:val="Heading 1"/>
+  <w:style w:type="paragraph" w:styleId="Ttulo1">
+    <w:name w:val="heading 1"/>
     <w:basedOn w:val="Normal"/>
     <w:next w:val="Normal"/>
     <w:link w:val="Ttulo1Char"/>
     <w:uiPriority w:val="9"/>
     <w:qFormat/>
-    <w:rsid w:val="003f5048"/>
+    <w:rsid w:val="003F5048"/>
     <w:pPr>
-      <w:keepNext w:val="true"/>
+      <w:keepNext/>
       <w:keepLines/>
       <w:spacing w:before="360" w:after="80"/>
       <w:outlineLvl w:val="0"/>
     </w:pPr>
     <w:rPr>
-      <w:rFonts w:ascii="Aptos Display" w:hAnsi="Aptos Display" w:eastAsia="" w:cs="" w:asciiTheme="majorHAnsi" w:cstheme="majorBidi" w:eastAsiaTheme="majorEastAsia" w:hAnsiTheme="majorHAnsi"/>
-      <w:color w:themeColor="accent1" w:themeShade="bf" w:val="0F4761"/>
+      <w:rFonts w:asciiTheme="majorHAnsi" w:eastAsiaTheme="majorEastAsia" w:hAnsiTheme="majorHAnsi" w:cstheme="majorBidi"/>
+      <w:color w:val="0F4761" w:themeColor="accent1" w:themeShade="BF"/>
       <w:sz w:val="40"/>
       <w:szCs w:val="40"/>
     </w:rPr>
   </w:style>
-  <w:style w:type="paragraph" w:styleId="Heading2">
-    <w:name w:val="Heading 2"/>
+  <w:style w:type="paragraph" w:styleId="Ttulo2">
+    <w:name w:val="heading 2"/>
     <w:basedOn w:val="Normal"/>
     <w:next w:val="Normal"/>
     <w:link w:val="Ttulo2Char"/>
@@ -3532,22 +3911,22 @@
     <w:semiHidden/>
     <w:unhideWhenUsed/>
     <w:qFormat/>
-    <w:rsid w:val="003f5048"/>
+    <w:rsid w:val="003F5048"/>
     <w:pPr>
-      <w:keepNext w:val="true"/>
+      <w:keepNext/>
       <w:keepLines/>
       <w:spacing w:before="160" w:after="80"/>
       <w:outlineLvl w:val="1"/>
     </w:pPr>
     <w:rPr>
-      <w:rFonts w:ascii="Aptos Display" w:hAnsi="Aptos Display" w:eastAsia="" w:cs="" w:asciiTheme="majorHAnsi" w:cstheme="majorBidi" w:eastAsiaTheme="majorEastAsia" w:hAnsiTheme="majorHAnsi"/>
-      <w:color w:themeColor="accent1" w:themeShade="bf" w:val="0F4761"/>
+      <w:rFonts w:asciiTheme="majorHAnsi" w:eastAsiaTheme="majorEastAsia" w:hAnsiTheme="majorHAnsi" w:cstheme="majorBidi"/>
+      <w:color w:val="0F4761" w:themeColor="accent1" w:themeShade="BF"/>
       <w:sz w:val="32"/>
       <w:szCs w:val="32"/>
     </w:rPr>
   </w:style>
-  <w:style w:type="paragraph" w:styleId="Heading3">
-    <w:name w:val="Heading 3"/>
+  <w:style w:type="paragraph" w:styleId="Ttulo3">
+    <w:name w:val="heading 3"/>
     <w:basedOn w:val="Normal"/>
     <w:next w:val="Normal"/>
     <w:link w:val="Ttulo3Char"/>
@@ -3555,22 +3934,22 @@
     <w:semiHidden/>
     <w:unhideWhenUsed/>
     <w:qFormat/>
-    <w:rsid w:val="003f5048"/>
+    <w:rsid w:val="003F5048"/>
     <w:pPr>
-      <w:keepNext w:val="true"/>
+      <w:keepNext/>
       <w:keepLines/>
       <w:spacing w:before="160" w:after="80"/>
       <w:outlineLvl w:val="2"/>
     </w:pPr>
     <w:rPr>
-      <w:rFonts w:eastAsia="" w:cs="" w:cstheme="majorBidi" w:eastAsiaTheme="majorEastAsia"/>
-      <w:color w:themeColor="accent1" w:themeShade="bf" w:val="0F4761"/>
+      <w:rFonts w:eastAsiaTheme="majorEastAsia" w:cstheme="majorBidi"/>
+      <w:color w:val="0F4761" w:themeColor="accent1" w:themeShade="BF"/>
       <w:sz w:val="28"/>
       <w:szCs w:val="28"/>
     </w:rPr>
   </w:style>
-  <w:style w:type="paragraph" w:styleId="Heading4">
-    <w:name w:val="Heading 4"/>
+  <w:style w:type="paragraph" w:styleId="Ttulo4">
+    <w:name w:val="heading 4"/>
     <w:basedOn w:val="Normal"/>
     <w:next w:val="Normal"/>
     <w:link w:val="Ttulo4Char"/>
@@ -3578,22 +3957,22 @@
     <w:semiHidden/>
     <w:unhideWhenUsed/>
     <w:qFormat/>
-    <w:rsid w:val="003f5048"/>
+    <w:rsid w:val="003F5048"/>
     <w:pPr>
-      <w:keepNext w:val="true"/>
+      <w:keepNext/>
       <w:keepLines/>
       <w:spacing w:before="80" w:after="40"/>
       <w:outlineLvl w:val="3"/>
     </w:pPr>
     <w:rPr>
-      <w:rFonts w:eastAsia="" w:cs="" w:cstheme="majorBidi" w:eastAsiaTheme="majorEastAsia"/>
+      <w:rFonts w:eastAsiaTheme="majorEastAsia" w:cstheme="majorBidi"/>
       <w:i/>
       <w:iCs/>
-      <w:color w:themeColor="accent1" w:themeShade="bf" w:val="0F4761"/>
+      <w:color w:val="0F4761" w:themeColor="accent1" w:themeShade="BF"/>
     </w:rPr>
   </w:style>
-  <w:style w:type="paragraph" w:styleId="Heading5">
-    <w:name w:val="Heading 5"/>
+  <w:style w:type="paragraph" w:styleId="Ttulo5">
+    <w:name w:val="heading 5"/>
     <w:basedOn w:val="Normal"/>
     <w:next w:val="Normal"/>
     <w:link w:val="Ttulo5Char"/>
@@ -3601,20 +3980,20 @@
     <w:semiHidden/>
     <w:unhideWhenUsed/>
     <w:qFormat/>
-    <w:rsid w:val="003f5048"/>
+    <w:rsid w:val="003F5048"/>
     <w:pPr>
-      <w:keepNext w:val="true"/>
+      <w:keepNext/>
       <w:keepLines/>
       <w:spacing w:before="80" w:after="40"/>
       <w:outlineLvl w:val="4"/>
     </w:pPr>
     <w:rPr>
-      <w:rFonts w:eastAsia="" w:cs="" w:cstheme="majorBidi" w:eastAsiaTheme="majorEastAsia"/>
-      <w:color w:themeColor="accent1" w:themeShade="bf" w:val="0F4761"/>
+      <w:rFonts w:eastAsiaTheme="majorEastAsia" w:cstheme="majorBidi"/>
+      <w:color w:val="0F4761" w:themeColor="accent1" w:themeShade="BF"/>
     </w:rPr>
   </w:style>
-  <w:style w:type="paragraph" w:styleId="Heading6">
-    <w:name w:val="Heading 6"/>
+  <w:style w:type="paragraph" w:styleId="Ttulo6">
+    <w:name w:val="heading 6"/>
     <w:basedOn w:val="Normal"/>
     <w:next w:val="Normal"/>
     <w:link w:val="Ttulo6Char"/>
@@ -3622,22 +4001,22 @@
     <w:semiHidden/>
     <w:unhideWhenUsed/>
     <w:qFormat/>
-    <w:rsid w:val="003f5048"/>
+    <w:rsid w:val="003F5048"/>
     <w:pPr>
-      <w:keepNext w:val="true"/>
+      <w:keepNext/>
       <w:keepLines/>
-      <w:spacing w:before="40" w:after="0"/>
+      <w:spacing w:before="40"/>
       <w:outlineLvl w:val="5"/>
     </w:pPr>
     <w:rPr>
-      <w:rFonts w:eastAsia="" w:cs="" w:cstheme="majorBidi" w:eastAsiaTheme="majorEastAsia"/>
+      <w:rFonts w:eastAsiaTheme="majorEastAsia" w:cstheme="majorBidi"/>
       <w:i/>
       <w:iCs/>
-      <w:color w:themeColor="text1" w:themeTint="a6" w:val="595959"/>
+      <w:color w:val="595959" w:themeColor="text1" w:themeTint="A6"/>
     </w:rPr>
   </w:style>
-  <w:style w:type="paragraph" w:styleId="Heading7">
-    <w:name w:val="Heading 7"/>
+  <w:style w:type="paragraph" w:styleId="Ttulo7">
+    <w:name w:val="heading 7"/>
     <w:basedOn w:val="Normal"/>
     <w:next w:val="Normal"/>
     <w:link w:val="Ttulo7Char"/>
@@ -3645,20 +4024,20 @@
     <w:semiHidden/>
     <w:unhideWhenUsed/>
     <w:qFormat/>
-    <w:rsid w:val="003f5048"/>
+    <w:rsid w:val="003F5048"/>
     <w:pPr>
-      <w:keepNext w:val="true"/>
+      <w:keepNext/>
       <w:keepLines/>
-      <w:spacing w:before="40" w:after="0"/>
+      <w:spacing w:before="40"/>
       <w:outlineLvl w:val="6"/>
     </w:pPr>
     <w:rPr>
-      <w:rFonts w:eastAsia="" w:cs="" w:cstheme="majorBidi" w:eastAsiaTheme="majorEastAsia"/>
-      <w:color w:themeColor="text1" w:themeTint="a6" w:val="595959"/>
+      <w:rFonts w:eastAsiaTheme="majorEastAsia" w:cstheme="majorBidi"/>
+      <w:color w:val="595959" w:themeColor="text1" w:themeTint="A6"/>
     </w:rPr>
   </w:style>
-  <w:style w:type="paragraph" w:styleId="Heading8">
-    <w:name w:val="Heading 8"/>
+  <w:style w:type="paragraph" w:styleId="Ttulo8">
+    <w:name w:val="heading 8"/>
     <w:basedOn w:val="Normal"/>
     <w:next w:val="Normal"/>
     <w:link w:val="Ttulo8Char"/>
@@ -3666,21 +4045,21 @@
     <w:semiHidden/>
     <w:unhideWhenUsed/>
     <w:qFormat/>
-    <w:rsid w:val="003f5048"/>
+    <w:rsid w:val="003F5048"/>
     <w:pPr>
-      <w:keepNext w:val="true"/>
+      <w:keepNext/>
       <w:keepLines/>
       <w:outlineLvl w:val="7"/>
     </w:pPr>
     <w:rPr>
-      <w:rFonts w:eastAsia="" w:cs="" w:cstheme="majorBidi" w:eastAsiaTheme="majorEastAsia"/>
+      <w:rFonts w:eastAsiaTheme="majorEastAsia" w:cstheme="majorBidi"/>
       <w:i/>
       <w:iCs/>
-      <w:color w:themeColor="text1" w:themeTint="d8" w:val="272727"/>
+      <w:color w:val="272727" w:themeColor="text1" w:themeTint="D8"/>
     </w:rPr>
   </w:style>
-  <w:style w:type="paragraph" w:styleId="Heading9">
-    <w:name w:val="Heading 9"/>
+  <w:style w:type="paragraph" w:styleId="Ttulo9">
+    <w:name w:val="heading 9"/>
     <w:basedOn w:val="Normal"/>
     <w:next w:val="Normal"/>
     <w:link w:val="Ttulo9Char"/>
@@ -3688,257 +4067,290 @@
     <w:semiHidden/>
     <w:unhideWhenUsed/>
     <w:qFormat/>
-    <w:rsid w:val="003f5048"/>
+    <w:rsid w:val="003F5048"/>
     <w:pPr>
-      <w:keepNext w:val="true"/>
+      <w:keepNext/>
       <w:keepLines/>
       <w:outlineLvl w:val="8"/>
     </w:pPr>
     <w:rPr>
-      <w:rFonts w:eastAsia="" w:cs="" w:cstheme="majorBidi" w:eastAsiaTheme="majorEastAsia"/>
-      <w:color w:themeColor="text1" w:themeTint="d8" w:val="272727"/>
+      <w:rFonts w:eastAsiaTheme="majorEastAsia" w:cstheme="majorBidi"/>
+      <w:color w:val="272727" w:themeColor="text1" w:themeTint="D8"/>
     </w:rPr>
   </w:style>
-  <w:style w:type="character" w:styleId="DefaultParagraphFont" w:default="1">
+  <w:style w:type="character" w:default="1" w:styleId="Fontepargpadro">
     <w:name w:val="Default Paragraph Font"/>
     <w:uiPriority w:val="1"/>
     <w:semiHidden/>
     <w:unhideWhenUsed/>
-    <w:qFormat/>
-    <w:rPr/>
   </w:style>
-  <w:style w:type="character" w:styleId="Ttulo1Char" w:customStyle="1">
+  <w:style w:type="table" w:default="1" w:styleId="Tabelanormal">
+    <w:name w:val="Normal Table"/>
+    <w:uiPriority w:val="99"/>
+    <w:semiHidden/>
+    <w:unhideWhenUsed/>
+    <w:tblPr>
+      <w:tblInd w:w="0" w:type="dxa"/>
+      <w:tblCellMar>
+        <w:top w:w="0" w:type="dxa"/>
+        <w:left w:w="108" w:type="dxa"/>
+        <w:bottom w:w="0" w:type="dxa"/>
+        <w:right w:w="108" w:type="dxa"/>
+      </w:tblCellMar>
+    </w:tblPr>
+  </w:style>
+  <w:style w:type="numbering" w:default="1" w:styleId="Semlista">
+    <w:name w:val="No List"/>
+    <w:uiPriority w:val="99"/>
+    <w:semiHidden/>
+    <w:unhideWhenUsed/>
+  </w:style>
+  <w:style w:type="character" w:customStyle="1" w:styleId="Ttulo1Char">
     <w:name w:val="Título 1 Char"/>
-    <w:basedOn w:val="DefaultParagraphFont"/>
+    <w:basedOn w:val="Fontepargpadro"/>
+    <w:link w:val="Ttulo1"/>
     <w:uiPriority w:val="9"/>
     <w:qFormat/>
-    <w:rsid w:val="003f5048"/>
+    <w:rsid w:val="003F5048"/>
     <w:rPr>
-      <w:rFonts w:ascii="Aptos Display" w:hAnsi="Aptos Display" w:eastAsia="" w:cs="" w:asciiTheme="majorHAnsi" w:cstheme="majorBidi" w:eastAsiaTheme="majorEastAsia" w:hAnsiTheme="majorHAnsi"/>
-      <w:color w:themeColor="accent1" w:themeShade="bf" w:val="0F4761"/>
+      <w:rFonts w:asciiTheme="majorHAnsi" w:eastAsiaTheme="majorEastAsia" w:hAnsiTheme="majorHAnsi" w:cstheme="majorBidi"/>
+      <w:color w:val="0F4761" w:themeColor="accent1" w:themeShade="BF"/>
       <w:sz w:val="40"/>
       <w:szCs w:val="40"/>
     </w:rPr>
   </w:style>
-  <w:style w:type="character" w:styleId="Ttulo2Char" w:customStyle="1">
+  <w:style w:type="character" w:customStyle="1" w:styleId="Ttulo2Char">
     <w:name w:val="Título 2 Char"/>
-    <w:basedOn w:val="DefaultParagraphFont"/>
+    <w:basedOn w:val="Fontepargpadro"/>
+    <w:link w:val="Ttulo2"/>
     <w:uiPriority w:val="9"/>
     <w:semiHidden/>
     <w:qFormat/>
-    <w:rsid w:val="003f5048"/>
+    <w:rsid w:val="003F5048"/>
     <w:rPr>
-      <w:rFonts w:ascii="Aptos Display" w:hAnsi="Aptos Display" w:eastAsia="" w:cs="" w:asciiTheme="majorHAnsi" w:cstheme="majorBidi" w:eastAsiaTheme="majorEastAsia" w:hAnsiTheme="majorHAnsi"/>
-      <w:color w:themeColor="accent1" w:themeShade="bf" w:val="0F4761"/>
+      <w:rFonts w:asciiTheme="majorHAnsi" w:eastAsiaTheme="majorEastAsia" w:hAnsiTheme="majorHAnsi" w:cstheme="majorBidi"/>
+      <w:color w:val="0F4761" w:themeColor="accent1" w:themeShade="BF"/>
       <w:sz w:val="32"/>
       <w:szCs w:val="32"/>
     </w:rPr>
   </w:style>
-  <w:style w:type="character" w:styleId="Ttulo3Char" w:customStyle="1">
+  <w:style w:type="character" w:customStyle="1" w:styleId="Ttulo3Char">
     <w:name w:val="Título 3 Char"/>
-    <w:basedOn w:val="DefaultParagraphFont"/>
+    <w:basedOn w:val="Fontepargpadro"/>
+    <w:link w:val="Ttulo3"/>
     <w:uiPriority w:val="9"/>
     <w:semiHidden/>
     <w:qFormat/>
-    <w:rsid w:val="003f5048"/>
+    <w:rsid w:val="003F5048"/>
     <w:rPr>
-      <w:rFonts w:eastAsia="" w:cs="" w:cstheme="majorBidi" w:eastAsiaTheme="majorEastAsia"/>
-      <w:color w:themeColor="accent1" w:themeShade="bf" w:val="0F4761"/>
+      <w:rFonts w:eastAsiaTheme="majorEastAsia" w:cstheme="majorBidi"/>
+      <w:color w:val="0F4761" w:themeColor="accent1" w:themeShade="BF"/>
       <w:sz w:val="28"/>
       <w:szCs w:val="28"/>
     </w:rPr>
   </w:style>
-  <w:style w:type="character" w:styleId="Ttulo4Char" w:customStyle="1">
+  <w:style w:type="character" w:customStyle="1" w:styleId="Ttulo4Char">
     <w:name w:val="Título 4 Char"/>
-    <w:basedOn w:val="DefaultParagraphFont"/>
+    <w:basedOn w:val="Fontepargpadro"/>
+    <w:link w:val="Ttulo4"/>
     <w:uiPriority w:val="9"/>
     <w:semiHidden/>
     <w:qFormat/>
-    <w:rsid w:val="003f5048"/>
+    <w:rsid w:val="003F5048"/>
     <w:rPr>
-      <w:rFonts w:eastAsia="" w:cs="" w:cstheme="majorBidi" w:eastAsiaTheme="majorEastAsia"/>
+      <w:rFonts w:eastAsiaTheme="majorEastAsia" w:cstheme="majorBidi"/>
       <w:i/>
       <w:iCs/>
-      <w:color w:themeColor="accent1" w:themeShade="bf" w:val="0F4761"/>
+      <w:color w:val="0F4761" w:themeColor="accent1" w:themeShade="BF"/>
     </w:rPr>
   </w:style>
-  <w:style w:type="character" w:styleId="Ttulo5Char" w:customStyle="1">
+  <w:style w:type="character" w:customStyle="1" w:styleId="Ttulo5Char">
     <w:name w:val="Título 5 Char"/>
-    <w:basedOn w:val="DefaultParagraphFont"/>
+    <w:basedOn w:val="Fontepargpadro"/>
+    <w:link w:val="Ttulo5"/>
     <w:uiPriority w:val="9"/>
     <w:semiHidden/>
     <w:qFormat/>
-    <w:rsid w:val="003f5048"/>
+    <w:rsid w:val="003F5048"/>
     <w:rPr>
-      <w:rFonts w:eastAsia="" w:cs="" w:cstheme="majorBidi" w:eastAsiaTheme="majorEastAsia"/>
-      <w:color w:themeColor="accent1" w:themeShade="bf" w:val="0F4761"/>
+      <w:rFonts w:eastAsiaTheme="majorEastAsia" w:cstheme="majorBidi"/>
+      <w:color w:val="0F4761" w:themeColor="accent1" w:themeShade="BF"/>
     </w:rPr>
   </w:style>
-  <w:style w:type="character" w:styleId="Ttulo6Char" w:customStyle="1">
+  <w:style w:type="character" w:customStyle="1" w:styleId="Ttulo6Char">
     <w:name w:val="Título 6 Char"/>
-    <w:basedOn w:val="DefaultParagraphFont"/>
+    <w:basedOn w:val="Fontepargpadro"/>
+    <w:link w:val="Ttulo6"/>
     <w:uiPriority w:val="9"/>
     <w:semiHidden/>
     <w:qFormat/>
-    <w:rsid w:val="003f5048"/>
+    <w:rsid w:val="003F5048"/>
     <w:rPr>
-      <w:rFonts w:eastAsia="" w:cs="" w:cstheme="majorBidi" w:eastAsiaTheme="majorEastAsia"/>
+      <w:rFonts w:eastAsiaTheme="majorEastAsia" w:cstheme="majorBidi"/>
       <w:i/>
       <w:iCs/>
-      <w:color w:themeColor="text1" w:themeTint="a6" w:val="595959"/>
+      <w:color w:val="595959" w:themeColor="text1" w:themeTint="A6"/>
     </w:rPr>
   </w:style>
-  <w:style w:type="character" w:styleId="Ttulo7Char" w:customStyle="1">
+  <w:style w:type="character" w:customStyle="1" w:styleId="Ttulo7Char">
     <w:name w:val="Título 7 Char"/>
-    <w:basedOn w:val="DefaultParagraphFont"/>
+    <w:basedOn w:val="Fontepargpadro"/>
+    <w:link w:val="Ttulo7"/>
     <w:uiPriority w:val="9"/>
     <w:semiHidden/>
     <w:qFormat/>
-    <w:rsid w:val="003f5048"/>
+    <w:rsid w:val="003F5048"/>
     <w:rPr>
-      <w:rFonts w:eastAsia="" w:cs="" w:cstheme="majorBidi" w:eastAsiaTheme="majorEastAsia"/>
-      <w:color w:themeColor="text1" w:themeTint="a6" w:val="595959"/>
+      <w:rFonts w:eastAsiaTheme="majorEastAsia" w:cstheme="majorBidi"/>
+      <w:color w:val="595959" w:themeColor="text1" w:themeTint="A6"/>
     </w:rPr>
   </w:style>
-  <w:style w:type="character" w:styleId="Ttulo8Char" w:customStyle="1">
+  <w:style w:type="character" w:customStyle="1" w:styleId="Ttulo8Char">
     <w:name w:val="Título 8 Char"/>
-    <w:basedOn w:val="DefaultParagraphFont"/>
+    <w:basedOn w:val="Fontepargpadro"/>
+    <w:link w:val="Ttulo8"/>
     <w:uiPriority w:val="9"/>
     <w:semiHidden/>
     <w:qFormat/>
-    <w:rsid w:val="003f5048"/>
+    <w:rsid w:val="003F5048"/>
     <w:rPr>
-      <w:rFonts w:eastAsia="" w:cs="" w:cstheme="majorBidi" w:eastAsiaTheme="majorEastAsia"/>
+      <w:rFonts w:eastAsiaTheme="majorEastAsia" w:cstheme="majorBidi"/>
       <w:i/>
       <w:iCs/>
-      <w:color w:themeColor="text1" w:themeTint="d8" w:val="272727"/>
+      <w:color w:val="272727" w:themeColor="text1" w:themeTint="D8"/>
     </w:rPr>
   </w:style>
-  <w:style w:type="character" w:styleId="Ttulo9Char" w:customStyle="1">
+  <w:style w:type="character" w:customStyle="1" w:styleId="Ttulo9Char">
     <w:name w:val="Título 9 Char"/>
-    <w:basedOn w:val="DefaultParagraphFont"/>
+    <w:basedOn w:val="Fontepargpadro"/>
+    <w:link w:val="Ttulo9"/>
     <w:uiPriority w:val="9"/>
     <w:semiHidden/>
     <w:qFormat/>
-    <w:rsid w:val="003f5048"/>
+    <w:rsid w:val="003F5048"/>
     <w:rPr>
-      <w:rFonts w:eastAsia="" w:cs="" w:cstheme="majorBidi" w:eastAsiaTheme="majorEastAsia"/>
-      <w:color w:themeColor="text1" w:themeTint="d8" w:val="272727"/>
+      <w:rFonts w:eastAsiaTheme="majorEastAsia" w:cstheme="majorBidi"/>
+      <w:color w:val="272727" w:themeColor="text1" w:themeTint="D8"/>
     </w:rPr>
   </w:style>
-  <w:style w:type="character" w:styleId="TtuloChar" w:customStyle="1">
+  <w:style w:type="character" w:customStyle="1" w:styleId="TtuloChar">
     <w:name w:val="Título Char"/>
-    <w:basedOn w:val="DefaultParagraphFont"/>
+    <w:basedOn w:val="Fontepargpadro"/>
+    <w:link w:val="Ttulo"/>
     <w:uiPriority w:val="10"/>
     <w:qFormat/>
-    <w:rsid w:val="003f5048"/>
+    <w:rsid w:val="003F5048"/>
     <w:rPr>
-      <w:rFonts w:ascii="Aptos Display" w:hAnsi="Aptos Display" w:eastAsia="" w:cs="" w:asciiTheme="majorHAnsi" w:cstheme="majorBidi" w:eastAsiaTheme="majorEastAsia" w:hAnsiTheme="majorHAnsi"/>
+      <w:rFonts w:asciiTheme="majorHAnsi" w:eastAsiaTheme="majorEastAsia" w:hAnsiTheme="majorHAnsi" w:cstheme="majorBidi"/>
       <w:spacing w:val="-10"/>
       <w:kern w:val="2"/>
       <w:sz w:val="56"/>
       <w:szCs w:val="56"/>
     </w:rPr>
   </w:style>
-  <w:style w:type="character" w:styleId="SubttuloChar" w:customStyle="1">
+  <w:style w:type="character" w:customStyle="1" w:styleId="SubttuloChar">
     <w:name w:val="Subtítulo Char"/>
-    <w:basedOn w:val="DefaultParagraphFont"/>
+    <w:basedOn w:val="Fontepargpadro"/>
+    <w:link w:val="Subttulo"/>
     <w:uiPriority w:val="11"/>
     <w:qFormat/>
-    <w:rsid w:val="003f5048"/>
+    <w:rsid w:val="003F5048"/>
     <w:rPr>
-      <w:rFonts w:eastAsia="" w:cs="" w:cstheme="majorBidi" w:eastAsiaTheme="majorEastAsia"/>
-      <w:color w:themeColor="text1" w:themeTint="a6" w:val="595959"/>
+      <w:rFonts w:eastAsiaTheme="majorEastAsia" w:cstheme="majorBidi"/>
+      <w:color w:val="595959" w:themeColor="text1" w:themeTint="A6"/>
       <w:spacing w:val="15"/>
       <w:sz w:val="28"/>
       <w:szCs w:val="28"/>
     </w:rPr>
   </w:style>
-  <w:style w:type="character" w:styleId="CitaoChar" w:customStyle="1">
+  <w:style w:type="character" w:customStyle="1" w:styleId="CitaoChar">
     <w:name w:val="Citação Char"/>
-    <w:basedOn w:val="DefaultParagraphFont"/>
-    <w:link w:val="Quote"/>
+    <w:basedOn w:val="Fontepargpadro"/>
+    <w:link w:val="Citao"/>
     <w:uiPriority w:val="29"/>
     <w:qFormat/>
-    <w:rsid w:val="003f5048"/>
+    <w:rsid w:val="003F5048"/>
     <w:rPr>
       <w:i/>
       <w:iCs/>
-      <w:color w:themeColor="text1" w:themeTint="bf" w:val="404040"/>
+      <w:color w:val="404040" w:themeColor="text1" w:themeTint="BF"/>
     </w:rPr>
   </w:style>
-  <w:style w:type="character" w:styleId="IntenseEmphasis">
+  <w:style w:type="character" w:styleId="nfaseIntensa">
     <w:name w:val="Intense Emphasis"/>
-    <w:basedOn w:val="DefaultParagraphFont"/>
+    <w:basedOn w:val="Fontepargpadro"/>
     <w:uiPriority w:val="21"/>
     <w:qFormat/>
-    <w:rsid w:val="003f5048"/>
+    <w:rsid w:val="003F5048"/>
     <w:rPr>
       <w:i/>
       <w:iCs/>
-      <w:color w:themeColor="accent1" w:themeShade="bf" w:val="0F4761"/>
+      <w:color w:val="0F4761" w:themeColor="accent1" w:themeShade="BF"/>
     </w:rPr>
   </w:style>
-  <w:style w:type="character" w:styleId="CitaoIntensaChar" w:customStyle="1">
+  <w:style w:type="character" w:customStyle="1" w:styleId="CitaoIntensaChar">
     <w:name w:val="Citação Intensa Char"/>
-    <w:basedOn w:val="DefaultParagraphFont"/>
-    <w:link w:val="IntenseQuote"/>
+    <w:basedOn w:val="Fontepargpadro"/>
+    <w:link w:val="CitaoIntensa"/>
     <w:uiPriority w:val="30"/>
     <w:qFormat/>
-    <w:rsid w:val="003f5048"/>
+    <w:rsid w:val="003F5048"/>
     <w:rPr>
       <w:i/>
       <w:iCs/>
-      <w:color w:themeColor="accent1" w:themeShade="bf" w:val="0F4761"/>
+      <w:color w:val="0F4761" w:themeColor="accent1" w:themeShade="BF"/>
     </w:rPr>
   </w:style>
-  <w:style w:type="character" w:styleId="IntenseReference">
+  <w:style w:type="character" w:styleId="RefernciaIntensa">
     <w:name w:val="Intense Reference"/>
-    <w:basedOn w:val="DefaultParagraphFont"/>
+    <w:basedOn w:val="Fontepargpadro"/>
     <w:uiPriority w:val="32"/>
     <w:qFormat/>
-    <w:rsid w:val="003f5048"/>
+    <w:rsid w:val="003F5048"/>
     <w:rPr>
       <w:b/>
       <w:bCs/>
       <w:smallCaps/>
-      <w:color w:themeColor="accent1" w:themeShade="bf" w:val="0F4761"/>
+      <w:color w:val="0F4761" w:themeColor="accent1" w:themeShade="BF"/>
       <w:spacing w:val="5"/>
     </w:rPr>
   </w:style>
   <w:style w:type="paragraph" w:styleId="Ttulo">
-    <w:name w:val="Título"/>
+    <w:name w:val="Title"/>
     <w:basedOn w:val="Normal"/>
-    <w:next w:val="BodyText"/>
+    <w:next w:val="Corpodetexto"/>
+    <w:link w:val="TtuloChar"/>
+    <w:uiPriority w:val="10"/>
     <w:qFormat/>
+    <w:rsid w:val="003F5048"/>
     <w:pPr>
-      <w:keepNext w:val="true"/>
-      <w:spacing w:before="240" w:after="120"/>
+      <w:spacing w:after="80"/>
+      <w:contextualSpacing/>
     </w:pPr>
     <w:rPr>
-      <w:rFonts w:ascii="Liberation Sans" w:hAnsi="Liberation Sans" w:eastAsia="Microsoft YaHei" w:cs="Lucida Sans"/>
-      <w:sz w:val="28"/>
-      <w:szCs w:val="28"/>
+      <w:rFonts w:asciiTheme="majorHAnsi" w:eastAsiaTheme="majorEastAsia" w:hAnsiTheme="majorHAnsi" w:cstheme="majorBidi"/>
+      <w:spacing w:val="-10"/>
+      <w:kern w:val="2"/>
+      <w:sz w:val="56"/>
+      <w:szCs w:val="56"/>
     </w:rPr>
   </w:style>
-  <w:style w:type="paragraph" w:styleId="BodyText">
+  <w:style w:type="paragraph" w:styleId="Corpodetexto">
     <w:name w:val="Body Text"/>
     <w:basedOn w:val="Normal"/>
     <w:pPr>
-      <w:spacing w:lineRule="auto" w:line="276" w:before="0" w:after="140"/>
+      <w:spacing w:after="140" w:line="276" w:lineRule="auto"/>
     </w:pPr>
-    <w:rPr/>
   </w:style>
-  <w:style w:type="paragraph" w:styleId="List">
+  <w:style w:type="paragraph" w:styleId="Lista">
     <w:name w:val="List"/>
-    <w:basedOn w:val="BodyText"/>
-    <w:pPr/>
+    <w:basedOn w:val="Corpodetexto"/>
     <w:rPr>
       <w:rFonts w:cs="Lucida Sans"/>
     </w:rPr>
   </w:style>
-  <w:style w:type="paragraph" w:styleId="Caption">
-    <w:name w:val="Caption"/>
+  <w:style w:type="paragraph" w:styleId="Legenda">
+    <w:name w:val="caption"/>
     <w:basedOn w:val="Normal"/>
     <w:qFormat/>
     <w:pPr>
@@ -3949,11 +4361,9 @@
       <w:rFonts w:cs="Lucida Sans"/>
       <w:i/>
       <w:iCs/>
-      <w:sz w:val="24"/>
-      <w:szCs w:val="24"/>
     </w:rPr>
   </w:style>
-  <w:style w:type="paragraph" w:styleId="ndice">
+  <w:style w:type="paragraph" w:customStyle="1" w:styleId="ndice">
     <w:name w:val="Índice"/>
     <w:basedOn w:val="Normal"/>
     <w:qFormat/>
@@ -3964,86 +4374,63 @@
       <w:rFonts w:cs="Lucida Sans"/>
     </w:rPr>
   </w:style>
-  <w:style w:type="paragraph" w:styleId="Title">
-    <w:name w:val="Title"/>
-    <w:basedOn w:val="Normal"/>
-    <w:next w:val="Normal"/>
-    <w:link w:val="TtuloChar"/>
-    <w:uiPriority w:val="10"/>
-    <w:qFormat/>
-    <w:rsid w:val="003f5048"/>
-    <w:pPr>
-      <w:spacing w:before="0" w:after="80"/>
-      <w:contextualSpacing/>
-    </w:pPr>
-    <w:rPr>
-      <w:rFonts w:ascii="Aptos Display" w:hAnsi="Aptos Display" w:eastAsia="" w:cs="" w:asciiTheme="majorHAnsi" w:cstheme="majorBidi" w:eastAsiaTheme="majorEastAsia" w:hAnsiTheme="majorHAnsi"/>
-      <w:spacing w:val="-10"/>
-      <w:kern w:val="2"/>
-      <w:sz w:val="56"/>
-      <w:szCs w:val="56"/>
-    </w:rPr>
-  </w:style>
-  <w:style w:type="paragraph" w:styleId="Subtitle">
+  <w:style w:type="paragraph" w:styleId="Subttulo">
     <w:name w:val="Subtitle"/>
     <w:basedOn w:val="Normal"/>
     <w:next w:val="Normal"/>
     <w:link w:val="SubttuloChar"/>
     <w:uiPriority w:val="11"/>
     <w:qFormat/>
-    <w:rsid w:val="003f5048"/>
-    <w:pPr/>
+    <w:rsid w:val="003F5048"/>
     <w:rPr>
-      <w:rFonts w:eastAsia="" w:cs="" w:cstheme="majorBidi" w:eastAsiaTheme="majorEastAsia"/>
-      <w:color w:themeColor="text1" w:themeTint="a6" w:val="595959"/>
+      <w:rFonts w:eastAsiaTheme="majorEastAsia" w:cstheme="majorBidi"/>
+      <w:color w:val="595959" w:themeColor="text1" w:themeTint="A6"/>
       <w:spacing w:val="15"/>
       <w:sz w:val="28"/>
       <w:szCs w:val="28"/>
     </w:rPr>
   </w:style>
-  <w:style w:type="paragraph" w:styleId="Quote">
+  <w:style w:type="paragraph" w:styleId="Citao">
     <w:name w:val="Quote"/>
     <w:basedOn w:val="Normal"/>
     <w:next w:val="Normal"/>
     <w:link w:val="CitaoChar"/>
     <w:uiPriority w:val="29"/>
     <w:qFormat/>
-    <w:rsid w:val="003f5048"/>
+    <w:rsid w:val="003F5048"/>
     <w:pPr>
-      <w:spacing w:before="160" w:after="0"/>
+      <w:spacing w:before="160"/>
       <w:jc w:val="center"/>
     </w:pPr>
     <w:rPr>
       <w:i/>
       <w:iCs/>
-      <w:color w:themeColor="text1" w:themeTint="bf" w:val="404040"/>
+      <w:color w:val="404040" w:themeColor="text1" w:themeTint="BF"/>
     </w:rPr>
   </w:style>
-  <w:style w:type="paragraph" w:styleId="ListParagraph">
+  <w:style w:type="paragraph" w:styleId="PargrafodaLista">
     <w:name w:val="List Paragraph"/>
     <w:basedOn w:val="Normal"/>
     <w:uiPriority w:val="34"/>
     <w:qFormat/>
-    <w:rsid w:val="003f5048"/>
+    <w:rsid w:val="003F5048"/>
     <w:pPr>
-      <w:spacing w:before="0" w:after="0"/>
       <w:ind w:left="720"/>
       <w:contextualSpacing/>
     </w:pPr>
-    <w:rPr/>
   </w:style>
-  <w:style w:type="paragraph" w:styleId="IntenseQuote">
+  <w:style w:type="paragraph" w:styleId="CitaoIntensa">
     <w:name w:val="Intense Quote"/>
     <w:basedOn w:val="Normal"/>
     <w:next w:val="Normal"/>
     <w:link w:val="CitaoIntensaChar"/>
     <w:uiPriority w:val="30"/>
     <w:qFormat/>
-    <w:rsid w:val="003f5048"/>
+    <w:rsid w:val="003F5048"/>
     <w:pPr>
       <w:pBdr>
-        <w:top w:val="single" w:sz="4" w:space="10" w:color="0F4761" w:themeColor="accent1" w:themeShade="bf"/>
-        <w:bottom w:val="single" w:sz="4" w:space="10" w:color="0F4761" w:themeColor="accent1" w:themeShade="bf"/>
+        <w:top w:val="single" w:sz="4" w:space="10" w:color="0F4761" w:themeColor="accent1" w:themeShade="BF"/>
+        <w:bottom w:val="single" w:sz="4" w:space="10" w:color="0F4761" w:themeColor="accent1" w:themeShade="BF"/>
       </w:pBdr>
       <w:spacing w:before="360" w:after="360"/>
       <w:ind w:left="864" w:right="864"/>
@@ -4052,82 +4439,61 @@
     <w:rPr>
       <w:i/>
       <w:iCs/>
-      <w:color w:themeColor="accent1" w:themeShade="bf" w:val="0F4761"/>
+      <w:color w:val="0F4761" w:themeColor="accent1" w:themeShade="BF"/>
     </w:rPr>
-  </w:style>
-  <w:style w:type="numbering" w:styleId="Semlista" w:default="1">
-    <w:name w:val="Sem lista"/>
-    <w:uiPriority w:val="99"/>
-    <w:semiHidden/>
-    <w:unhideWhenUsed/>
-    <w:qFormat/>
-  </w:style>
-  <w:style w:type="table" w:default="1" w:styleId="Tabelanormal">
-    <w:name w:val="Normal Table"/>
-    <w:uiPriority w:val="99"/>
-    <w:semiHidden/>
-    <w:unhideWhenUsed/>
-    <w:tblPr>
-      <w:tblCellMar>
-        <w:top w:w="0" w:type="dxa"/>
-        <w:left w:w="108" w:type="dxa"/>
-        <w:bottom w:w="0" w:type="dxa"/>
-        <w:right w:w="108" w:type="dxa"/>
-      </w:tblCellMar>
-    </w:tblPr>
   </w:style>
 </w:styles>
 </file>
 
 <file path=word/theme/theme1.xml><?xml version="1.0" encoding="utf-8"?>
-<a:theme xmlns:a="http://schemas.openxmlformats.org/drawingml/2006/main" xmlns:r="http://schemas.openxmlformats.org/officeDocument/2006/relationships" name="Tema do Office">
+<a:theme xmlns:a="http://schemas.openxmlformats.org/drawingml/2006/main" name="Tema do Office">
   <a:themeElements>
     <a:clrScheme name="Office">
       <a:dk1>
         <a:srgbClr val="000000"/>
       </a:dk1>
       <a:lt1>
-        <a:srgbClr val="ffffff"/>
+        <a:srgbClr val="FFFFFF"/>
       </a:lt1>
       <a:dk2>
-        <a:srgbClr val="0e2841"/>
+        <a:srgbClr val="0E2841"/>
       </a:dk2>
       <a:lt2>
-        <a:srgbClr val="e8e8e8"/>
+        <a:srgbClr val="E8E8E8"/>
       </a:lt2>
       <a:accent1>
         <a:srgbClr val="156082"/>
       </a:accent1>
       <a:accent2>
-        <a:srgbClr val="e97132"/>
+        <a:srgbClr val="E97132"/>
       </a:accent2>
       <a:accent3>
-        <a:srgbClr val="196b24"/>
+        <a:srgbClr val="196B24"/>
       </a:accent3>
       <a:accent4>
-        <a:srgbClr val="0f9ed5"/>
+        <a:srgbClr val="0F9ED5"/>
       </a:accent4>
       <a:accent5>
-        <a:srgbClr val="a02b93"/>
+        <a:srgbClr val="A02B93"/>
       </a:accent5>
       <a:accent6>
-        <a:srgbClr val="4ea72e"/>
+        <a:srgbClr val="4EA72E"/>
       </a:accent6>
       <a:hlink>
         <a:srgbClr val="467886"/>
       </a:hlink>
       <a:folHlink>
-        <a:srgbClr val="96607d"/>
+        <a:srgbClr val="96607D"/>
       </a:folHlink>
     </a:clrScheme>
     <a:fontScheme name="Office">
       <a:majorFont>
-        <a:latin typeface="Aptos Display" panose="02110004020202020204" pitchFamily="0" charset="1"/>
+        <a:latin typeface="Aptos Display" panose="02110004020202020204"/>
         <a:ea typeface=""/>
         <a:cs typeface=""/>
       </a:majorFont>
       <a:minorFont>
-        <a:latin typeface="Aptos" panose="02110004020202020204" pitchFamily="0" charset="1"/>
+        <a:latin typeface="Aptos" panose="02110004020202020204"/>
         <a:ea typeface=""/>
         <a:cs typeface=""/>
       </a:minorFont>
@@ -4159,7 +4525,7 @@
             </a:gs>
           </a:gsLst>
           <a:lin ang="5400000" scaled="0"/>
-          <a:tileRect l="0" t="0" r="0" b="0"/>
+          <a:tileRect/>
         </a:gradFill>
         <a:gradFill>
           <a:gsLst>
@@ -4183,7 +4549,7 @@
             </a:gs>
           </a:gsLst>
           <a:lin ang="5400000" scaled="0"/>
-          <a:tileRect l="0" t="0" r="0" b="0"/>
+          <a:tileRect/>
         </a:gradFill>
       </a:fillStyleLst>
       <a:lnStyleLst>
@@ -4243,10 +4609,12 @@
             </a:gs>
           </a:gsLst>
           <a:lin ang="5400000" scaled="0"/>
-          <a:tileRect l="0" t="0" r="0" b="0"/>
+          <a:tileRect/>
         </a:gradFill>
       </a:bgFillStyleLst>
     </a:fmtScheme>
   </a:themeElements>
+  <a:objectDefaults/>
+  <a:extraClrSchemeLst/>
 </a:theme>
 </file>
</xml_diff>

<commit_message>
Adicionado Historico das pendências #106 Resolve
</commit_message>
<xml_diff>
--- a/Requisitos/CSU07 - Manter gestor.docx
+++ b/Requisitos/CSU07 - Manter gestor.docx
@@ -3143,12 +3143,21 @@
               <w:spacing w:line="360" w:lineRule="auto"/>
               <w:jc w:val="center"/>
             </w:pPr>
-            <w:r>
-              <w:rPr>
-                <w:sz w:val="28"/>
-                <w:szCs w:val="28"/>
-              </w:rPr>
-              <w:t>Talysson Vasconcelos</w:t>
+            <w:proofErr w:type="spellStart"/>
+            <w:r>
+              <w:rPr>
+                <w:sz w:val="28"/>
+                <w:szCs w:val="28"/>
+              </w:rPr>
+              <w:t>Talysson</w:t>
+            </w:r>
+            <w:proofErr w:type="spellEnd"/>
+            <w:r>
+              <w:rPr>
+                <w:sz w:val="28"/>
+                <w:szCs w:val="28"/>
+              </w:rPr>
+              <w:t xml:space="preserve"> Vasconcelos</w:t>
             </w:r>
           </w:p>
         </w:tc>
@@ -3173,6 +3182,134 @@
                 <w:szCs w:val="28"/>
               </w:rPr>
               <w:t>Criação da descrição do caso de uso</w:t>
+            </w:r>
+          </w:p>
+        </w:tc>
+      </w:tr>
+      <w:tr>
+        <w:tc>
+          <w:tcPr>
+            <w:tcW w:w="3209" w:type="dxa"/>
+            <w:tcBorders>
+              <w:top w:val="single" w:sz="4" w:space="0" w:color="000000"/>
+              <w:left w:val="single" w:sz="4" w:space="0" w:color="000000"/>
+              <w:bottom w:val="single" w:sz="4" w:space="0" w:color="000000"/>
+              <w:right w:val="single" w:sz="4" w:space="0" w:color="000000"/>
+            </w:tcBorders>
+          </w:tcPr>
+          <w:p>
+            <w:pPr>
+              <w:spacing w:line="360" w:lineRule="auto"/>
+              <w:jc w:val="center"/>
+              <w:rPr>
+                <w:sz w:val="28"/>
+                <w:szCs w:val="28"/>
+              </w:rPr>
+            </w:pPr>
+            <w:r>
+              <w:rPr>
+                <w:sz w:val="28"/>
+                <w:szCs w:val="28"/>
+              </w:rPr>
+              <w:t>30</w:t>
+            </w:r>
+            <w:r>
+              <w:rPr>
+                <w:sz w:val="28"/>
+                <w:szCs w:val="28"/>
+              </w:rPr>
+              <w:t>/0</w:t>
+            </w:r>
+            <w:r>
+              <w:rPr>
+                <w:sz w:val="28"/>
+                <w:szCs w:val="28"/>
+              </w:rPr>
+              <w:t>7</w:t>
+            </w:r>
+            <w:r>
+              <w:rPr>
+                <w:sz w:val="28"/>
+                <w:szCs w:val="28"/>
+              </w:rPr>
+              <w:t>/2025</w:t>
+            </w:r>
+          </w:p>
+        </w:tc>
+        <w:tc>
+          <w:tcPr>
+            <w:tcW w:w="3209" w:type="dxa"/>
+            <w:tcBorders>
+              <w:top w:val="single" w:sz="4" w:space="0" w:color="000000"/>
+              <w:left w:val="single" w:sz="4" w:space="0" w:color="000000"/>
+              <w:bottom w:val="single" w:sz="4" w:space="0" w:color="000000"/>
+              <w:right w:val="single" w:sz="4" w:space="0" w:color="000000"/>
+            </w:tcBorders>
+          </w:tcPr>
+          <w:p>
+            <w:pPr>
+              <w:spacing w:line="360" w:lineRule="auto"/>
+              <w:jc w:val="center"/>
+              <w:rPr>
+                <w:sz w:val="28"/>
+                <w:szCs w:val="28"/>
+              </w:rPr>
+            </w:pPr>
+            <w:r>
+              <w:rPr>
+                <w:sz w:val="28"/>
+                <w:szCs w:val="28"/>
+              </w:rPr>
+              <w:t>Renne Bispo</w:t>
+            </w:r>
+          </w:p>
+        </w:tc>
+        <w:tc>
+          <w:tcPr>
+            <w:tcW w:w="3210" w:type="dxa"/>
+            <w:tcBorders>
+              <w:top w:val="single" w:sz="4" w:space="0" w:color="000000"/>
+              <w:left w:val="single" w:sz="4" w:space="0" w:color="000000"/>
+              <w:bottom w:val="single" w:sz="4" w:space="0" w:color="000000"/>
+              <w:right w:val="single" w:sz="4" w:space="0" w:color="000000"/>
+            </w:tcBorders>
+          </w:tcPr>
+          <w:p>
+            <w:pPr>
+              <w:spacing w:line="360" w:lineRule="auto"/>
+              <w:jc w:val="center"/>
+              <w:rPr>
+                <w:sz w:val="28"/>
+                <w:szCs w:val="28"/>
+              </w:rPr>
+            </w:pPr>
+            <w:r>
+              <w:rPr>
+                <w:sz w:val="28"/>
+                <w:szCs w:val="28"/>
+              </w:rPr>
+              <w:t>Criação da descrição d</w:t>
+            </w:r>
+            <w:r>
+              <w:rPr>
+                <w:sz w:val="28"/>
+                <w:szCs w:val="28"/>
+              </w:rPr>
+              <w:t>e</w:t>
+            </w:r>
+            <w:r>
+              <w:rPr>
+                <w:sz w:val="28"/>
+                <w:szCs w:val="28"/>
+              </w:rPr>
+              <w:t xml:space="preserve"> </w:t>
+            </w:r>
+            <w:r>
+              <w:rPr>
+                <w:sz w:val="28"/>
+                <w:szCs w:val="28"/>
+              </w:rPr>
+              <w:t>Fluxo Alternativo e Exceção</w:t>
             </w:r>
           </w:p>
         </w:tc>

</xml_diff>

<commit_message>
Revolvido os erros dos nomes das Telas 14 e 15, e CSU #106 Close
</commit_message>
<xml_diff>
--- a/Requisitos/CSU07 - Manter gestor.docx
+++ b/Requisitos/CSU07 - Manter gestor.docx
@@ -1,11 +1,13 @@
 
 <file path=word/document.xml><?xml version="1.0" encoding="utf-8"?>
-<w:document xmlns:wpc="http://schemas.microsoft.com/office/word/2010/wordprocessingCanvas" xmlns:cx="http://schemas.microsoft.com/office/drawing/2014/chartex" xmlns:cx1="http://schemas.microsoft.com/office/drawing/2015/9/8/chartex" xmlns:cx2="http://schemas.microsoft.com/office/drawing/2015/10/21/chartex" xmlns:cx3="http://schemas.microsoft.com/office/drawing/2016/5/9/chartex" xmlns:cx4="http://schemas.microsoft.com/office/drawing/2016/5/10/chartex" xmlns:cx5="http://schemas.microsoft.com/office/drawing/2016/5/11/chartex" xmlns:cx6="http://schemas.microsoft.com/office/drawing/2016/5/12/chartex" xmlns:cx7="http://schemas.microsoft.com/office/drawing/2016/5/13/chartex" xmlns:cx8="http://schemas.microsoft.com/office/drawing/2016/5/14/chartex" xmlns:mc="http://schemas.openxmlformats.org/markup-compatibility/2006" xmlns:aink="http://schemas.microsoft.com/office/drawing/2016/ink" xmlns:am3d="http://schemas.microsoft.com/office/drawing/2017/model3d" xmlns:o="urn:schemas-microsoft-com:office:office" xmlns:oel="http://schemas.microsoft.com/office/2019/extlst" xmlns:r="http://schemas.openxmlformats.org/officeDocument/2006/relationships" xmlns:m="http://schemas.openxmlformats.org/officeDocument/2006/math" xmlns:v="urn:schemas-microsoft-com:vml" xmlns:wp14="http://schemas.microsoft.com/office/word/2010/wordprocessingDrawing" xmlns:wp="http://schemas.openxmlformats.org/drawingml/2006/wordprocessingDrawing" xmlns:w10="urn:schemas-microsoft-com:office:word" xmlns:w="http://schemas.openxmlformats.org/wordprocessingml/2006/main" xmlns:w14="http://schemas.microsoft.com/office/word/2010/wordml" xmlns:w15="http://schemas.microsoft.com/office/word/2012/wordml" xmlns:w16cex="http://schemas.microsoft.com/office/word/2018/wordml/cex" xmlns:w16cid="http://schemas.microsoft.com/office/word/2016/wordml/cid" xmlns:w16="http://schemas.microsoft.com/office/word/2018/wordml" xmlns:w16du="http://schemas.microsoft.com/office/word/2023/wordml/word16du" xmlns:w16sdtdh="http://schemas.microsoft.com/office/word/2020/wordml/sdtdatahash" xmlns:w16se="http://schemas.microsoft.com/office/word/2015/wordml/symex" xmlns:wpg="http://schemas.microsoft.com/office/word/2010/wordprocessingGroup" xmlns:wpi="http://schemas.microsoft.com/office/word/2010/wordprocessingInk" xmlns:wne="http://schemas.microsoft.com/office/word/2006/wordml" xmlns:wps="http://schemas.microsoft.com/office/word/2010/wordprocessingShape" mc:Ignorable="w14 w15 w16se w16cid w16 w16cex w16sdtdh w16du wp14">
+<w:document xmlns:o="urn:schemas-microsoft-com:office:office" xmlns:r="http://schemas.openxmlformats.org/officeDocument/2006/relationships" xmlns:v="urn:schemas-microsoft-com:vml" xmlns:w="http://schemas.openxmlformats.org/wordprocessingml/2006/main" xmlns:w10="urn:schemas-microsoft-com:office:word" xmlns:wp="http://schemas.openxmlformats.org/drawingml/2006/wordprocessingDrawing" xmlns:wps="http://schemas.microsoft.com/office/word/2010/wordprocessingShape" xmlns:wpg="http://schemas.microsoft.com/office/word/2010/wordprocessingGroup" xmlns:mc="http://schemas.openxmlformats.org/markup-compatibility/2006" xmlns:wp14="http://schemas.microsoft.com/office/word/2010/wordprocessingDrawing" xmlns:w14="http://schemas.microsoft.com/office/word/2010/wordml" xmlns:w15="http://schemas.microsoft.com/office/word/2012/wordml" mc:Ignorable="w14 wp14 w15">
   <w:body>
     <w:p>
       <w:pPr>
-        <w:spacing w:line="360" w:lineRule="auto"/>
+        <w:pStyle w:val="Normal"/>
+        <w:spacing w:lineRule="auto" w:line="360"/>
         <w:jc w:val="center"/>
+        <w:rPr/>
       </w:pPr>
       <w:r>
         <w:rPr>
@@ -36,7 +38,9 @@
     </w:p>
     <w:p>
       <w:pPr>
-        <w:spacing w:line="360" w:lineRule="auto"/>
+        <w:pStyle w:val="Normal"/>
+        <w:spacing w:lineRule="auto" w:line="360"/>
+        <w:rPr/>
       </w:pPr>
       <w:r>
         <w:rPr>
@@ -57,15 +61,23 @@
     <w:tbl>
       <w:tblPr>
         <w:tblW w:w="9628" w:type="dxa"/>
+        <w:jc w:val="left"/>
         <w:tblInd w:w="-113" w:type="dxa"/>
         <w:tblLayout w:type="fixed"/>
-        <w:tblLook w:val="0400" w:firstRow="0" w:lastRow="0" w:firstColumn="0" w:lastColumn="0" w:noHBand="0" w:noVBand="1"/>
+        <w:tblCellMar>
+          <w:top w:w="0" w:type="dxa"/>
+          <w:left w:w="108" w:type="dxa"/>
+          <w:bottom w:w="0" w:type="dxa"/>
+          <w:right w:w="108" w:type="dxa"/>
+        </w:tblCellMar>
+        <w:tblLook w:firstRow="0" w:noVBand="1" w:lastRow="0" w:firstColumn="0" w:lastColumn="0" w:noHBand="0" w:val="0400"/>
       </w:tblPr>
       <w:tblGrid>
         <w:gridCol w:w="2689"/>
-        <w:gridCol w:w="6939"/>
+        <w:gridCol w:w="6938"/>
       </w:tblGrid>
       <w:tr>
+        <w:trPr/>
         <w:tc>
           <w:tcPr>
             <w:tcW w:w="2689" w:type="dxa"/>
@@ -78,7 +90,9 @@
           </w:tcPr>
           <w:p>
             <w:pPr>
-              <w:spacing w:line="360" w:lineRule="auto"/>
+              <w:pStyle w:val="Normal"/>
+              <w:spacing w:lineRule="auto" w:line="360"/>
+              <w:rPr/>
             </w:pPr>
             <w:r>
               <w:rPr>
@@ -102,7 +116,9 @@
           </w:tcPr>
           <w:p>
             <w:pPr>
-              <w:spacing w:line="360" w:lineRule="auto"/>
+              <w:pStyle w:val="Normal"/>
+              <w:spacing w:lineRule="auto" w:line="360"/>
+              <w:rPr/>
             </w:pPr>
             <w:r>
               <w:rPr>
@@ -115,6 +131,7 @@
         </w:tc>
       </w:tr>
       <w:tr>
+        <w:trPr/>
         <w:tc>
           <w:tcPr>
             <w:tcW w:w="2689" w:type="dxa"/>
@@ -127,7 +144,9 @@
           </w:tcPr>
           <w:p>
             <w:pPr>
-              <w:spacing w:line="360" w:lineRule="auto"/>
+              <w:pStyle w:val="Normal"/>
+              <w:spacing w:lineRule="auto" w:line="360"/>
+              <w:rPr/>
             </w:pPr>
             <w:r>
               <w:rPr>
@@ -151,8 +170,10 @@
           </w:tcPr>
           <w:p>
             <w:pPr>
-              <w:spacing w:line="360" w:lineRule="auto"/>
+              <w:pStyle w:val="Normal"/>
+              <w:spacing w:lineRule="auto" w:line="360"/>
               <w:jc w:val="both"/>
+              <w:rPr/>
             </w:pPr>
             <w:r>
               <w:rPr>
@@ -164,8 +185,10 @@
           </w:p>
           <w:p>
             <w:pPr>
-              <w:spacing w:line="360" w:lineRule="auto"/>
+              <w:pStyle w:val="Normal"/>
+              <w:spacing w:lineRule="auto" w:line="360"/>
               <w:jc w:val="both"/>
+              <w:rPr/>
             </w:pPr>
             <w:r>
               <w:rPr>
@@ -178,6 +201,7 @@
         </w:tc>
       </w:tr>
       <w:tr>
+        <w:trPr/>
         <w:tc>
           <w:tcPr>
             <w:tcW w:w="2689" w:type="dxa"/>
@@ -190,7 +214,9 @@
           </w:tcPr>
           <w:p>
             <w:pPr>
-              <w:spacing w:line="360" w:lineRule="auto"/>
+              <w:pStyle w:val="Normal"/>
+              <w:spacing w:lineRule="auto" w:line="360"/>
+              <w:rPr/>
             </w:pPr>
             <w:r>
               <w:rPr>
@@ -214,7 +240,9 @@
           </w:tcPr>
           <w:p>
             <w:pPr>
-              <w:spacing w:line="360" w:lineRule="auto"/>
+              <w:pStyle w:val="Normal"/>
+              <w:spacing w:lineRule="auto" w:line="360"/>
+              <w:rPr/>
             </w:pPr>
             <w:r>
               <w:rPr>
@@ -227,6 +255,7 @@
         </w:tc>
       </w:tr>
       <w:tr>
+        <w:trPr/>
         <w:tc>
           <w:tcPr>
             <w:tcW w:w="2689" w:type="dxa"/>
@@ -239,7 +268,9 @@
           </w:tcPr>
           <w:p>
             <w:pPr>
-              <w:spacing w:line="360" w:lineRule="auto"/>
+              <w:pStyle w:val="Normal"/>
+              <w:spacing w:lineRule="auto" w:line="360"/>
+              <w:rPr/>
             </w:pPr>
             <w:r>
               <w:rPr>
@@ -263,7 +294,9 @@
           </w:tcPr>
           <w:p>
             <w:pPr>
-              <w:spacing w:line="360" w:lineRule="auto"/>
+              <w:pStyle w:val="Normal"/>
+              <w:spacing w:lineRule="auto" w:line="360"/>
+              <w:rPr/>
             </w:pPr>
             <w:r>
               <w:rPr>
@@ -276,6 +309,7 @@
         </w:tc>
       </w:tr>
       <w:tr>
+        <w:trPr/>
         <w:tc>
           <w:tcPr>
             <w:tcW w:w="2689" w:type="dxa"/>
@@ -288,7 +322,9 @@
           </w:tcPr>
           <w:p>
             <w:pPr>
-              <w:spacing w:line="360" w:lineRule="auto"/>
+              <w:pStyle w:val="Normal"/>
+              <w:spacing w:lineRule="auto" w:line="360"/>
+              <w:rPr/>
             </w:pPr>
             <w:r>
               <w:rPr>
@@ -312,7 +348,9 @@
           </w:tcPr>
           <w:p>
             <w:pPr>
-              <w:spacing w:line="360" w:lineRule="auto"/>
+              <w:pStyle w:val="Normal"/>
+              <w:spacing w:lineRule="auto" w:line="360"/>
+              <w:rPr/>
             </w:pPr>
             <w:r>
               <w:rPr>
@@ -333,6 +371,7 @@
         </w:tc>
       </w:tr>
       <w:tr>
+        <w:trPr/>
         <w:tc>
           <w:tcPr>
             <w:tcW w:w="2689" w:type="dxa"/>
@@ -345,7 +384,9 @@
           </w:tcPr>
           <w:p>
             <w:pPr>
-              <w:spacing w:line="360" w:lineRule="auto"/>
+              <w:pStyle w:val="Normal"/>
+              <w:spacing w:lineRule="auto" w:line="360"/>
+              <w:rPr/>
             </w:pPr>
             <w:r>
               <w:rPr>
@@ -369,7 +410,9 @@
           </w:tcPr>
           <w:p>
             <w:pPr>
-              <w:spacing w:line="360" w:lineRule="auto"/>
+              <w:pStyle w:val="Normal"/>
+              <w:spacing w:lineRule="auto" w:line="360"/>
+              <w:rPr/>
             </w:pPr>
             <w:r>
               <w:rPr>
@@ -384,23 +427,37 @@
     </w:tbl>
     <w:p>
       <w:pPr>
-        <w:spacing w:line="360" w:lineRule="auto"/>
+        <w:pStyle w:val="Normal"/>
+        <w:spacing w:lineRule="auto" w:line="360"/>
         <w:rPr>
           <w:u w:val="single"/>
         </w:rPr>
       </w:pPr>
+      <w:r>
+        <w:rPr>
+          <w:u w:val="single"/>
+        </w:rPr>
+      </w:r>
     </w:p>
     <w:tbl>
       <w:tblPr>
         <w:tblW w:w="9628" w:type="dxa"/>
+        <w:jc w:val="left"/>
         <w:tblInd w:w="-113" w:type="dxa"/>
         <w:tblLayout w:type="fixed"/>
-        <w:tblLook w:val="0400" w:firstRow="0" w:lastRow="0" w:firstColumn="0" w:lastColumn="0" w:noHBand="0" w:noVBand="1"/>
+        <w:tblCellMar>
+          <w:top w:w="0" w:type="dxa"/>
+          <w:left w:w="108" w:type="dxa"/>
+          <w:bottom w:w="0" w:type="dxa"/>
+          <w:right w:w="108" w:type="dxa"/>
+        </w:tblCellMar>
+        <w:tblLook w:firstRow="0" w:noVBand="1" w:lastRow="0" w:firstColumn="0" w:lastColumn="0" w:noHBand="0" w:val="0400"/>
       </w:tblPr>
       <w:tblGrid>
         <w:gridCol w:w="9628"/>
       </w:tblGrid>
       <w:tr>
+        <w:trPr/>
         <w:tc>
           <w:tcPr>
             <w:tcW w:w="9628" w:type="dxa"/>
@@ -413,8 +470,10 @@
           </w:tcPr>
           <w:p>
             <w:pPr>
-              <w:spacing w:line="360" w:lineRule="auto"/>
+              <w:pStyle w:val="Normal"/>
+              <w:spacing w:lineRule="auto" w:line="360"/>
               <w:jc w:val="center"/>
+              <w:rPr/>
             </w:pPr>
             <w:r>
               <w:rPr>
@@ -428,6 +487,7 @@
         </w:tc>
       </w:tr>
       <w:tr>
+        <w:trPr/>
         <w:tc>
           <w:tcPr>
             <w:tcW w:w="9628" w:type="dxa"/>
@@ -440,8 +500,10 @@
           </w:tcPr>
           <w:p>
             <w:pPr>
-              <w:spacing w:line="360" w:lineRule="auto"/>
+              <w:pStyle w:val="Normal"/>
+              <w:spacing w:lineRule="auto" w:line="360"/>
               <w:jc w:val="both"/>
+              <w:rPr/>
             </w:pPr>
             <w:r>
               <w:rPr>
@@ -453,12 +515,14 @@
           </w:p>
           <w:p>
             <w:pPr>
+              <w:pStyle w:val="Normal"/>
               <w:numPr>
                 <w:ilvl w:val="0"/>
                 <w:numId w:val="1"/>
               </w:numPr>
-              <w:spacing w:line="360" w:lineRule="auto"/>
+              <w:spacing w:lineRule="auto" w:line="360"/>
               <w:jc w:val="both"/>
+              <w:rPr/>
             </w:pPr>
             <w:r>
               <w:rPr>
@@ -478,12 +542,14 @@
           </w:p>
           <w:p>
             <w:pPr>
+              <w:pStyle w:val="Normal"/>
               <w:numPr>
                 <w:ilvl w:val="0"/>
                 <w:numId w:val="1"/>
               </w:numPr>
-              <w:spacing w:line="360" w:lineRule="auto"/>
+              <w:spacing w:lineRule="auto" w:line="360"/>
               <w:jc w:val="both"/>
+              <w:rPr/>
             </w:pPr>
             <w:r>
               <w:rPr>
@@ -503,12 +569,14 @@
           </w:p>
           <w:p>
             <w:pPr>
+              <w:pStyle w:val="Normal"/>
               <w:numPr>
                 <w:ilvl w:val="0"/>
                 <w:numId w:val="1"/>
               </w:numPr>
-              <w:spacing w:line="360" w:lineRule="auto"/>
+              <w:spacing w:lineRule="auto" w:line="360"/>
               <w:jc w:val="both"/>
+              <w:rPr/>
             </w:pPr>
             <w:r>
               <w:rPr>
@@ -528,12 +596,14 @@
           </w:p>
           <w:p>
             <w:pPr>
+              <w:pStyle w:val="Normal"/>
               <w:numPr>
                 <w:ilvl w:val="0"/>
                 <w:numId w:val="1"/>
               </w:numPr>
-              <w:spacing w:line="360" w:lineRule="auto"/>
+              <w:spacing w:lineRule="auto" w:line="360"/>
               <w:jc w:val="both"/>
+              <w:rPr/>
             </w:pPr>
             <w:r>
               <w:rPr>
@@ -556,29 +626,48 @@
     </w:tbl>
     <w:p>
       <w:pPr>
-        <w:spacing w:line="360" w:lineRule="auto"/>
+        <w:pStyle w:val="Normal"/>
+        <w:spacing w:lineRule="auto" w:line="360"/>
         <w:rPr>
           <w:b/>
           <w:sz w:val="28"/>
           <w:szCs w:val="28"/>
         </w:rPr>
       </w:pPr>
+      <w:r>
+        <w:rPr>
+          <w:b/>
+          <w:sz w:val="28"/>
+          <w:szCs w:val="28"/>
+        </w:rPr>
+      </w:r>
       <w:bookmarkStart w:id="0" w:name="_heading=h.thy09f3cbfuh"/>
-      <w:bookmarkEnd w:id="0"/>
+      <w:bookmarkStart w:id="1" w:name="_heading=h.thy09f3cbfuh"/>
+      <w:bookmarkEnd w:id="1"/>
     </w:p>
     <w:p>
       <w:pPr>
-        <w:spacing w:line="360" w:lineRule="auto"/>
+        <w:pStyle w:val="Normal"/>
+        <w:spacing w:lineRule="auto" w:line="360"/>
         <w:rPr>
           <w:b/>
           <w:sz w:val="32"/>
           <w:szCs w:val="32"/>
         </w:rPr>
       </w:pPr>
+      <w:r>
+        <w:rPr>
+          <w:b/>
+          <w:sz w:val="32"/>
+          <w:szCs w:val="32"/>
+        </w:rPr>
+      </w:r>
     </w:p>
     <w:p>
       <w:pPr>
-        <w:spacing w:line="360" w:lineRule="auto"/>
+        <w:pStyle w:val="Normal"/>
+        <w:spacing w:lineRule="auto" w:line="360"/>
+        <w:rPr/>
       </w:pPr>
       <w:r>
         <w:rPr>
@@ -597,7 +686,7 @@
       </w:r>
       <w:r>
         <w:rPr>
-          <w:color w:val="000000" w:themeColor="text1"/>
+          <w:color w:themeColor="text1" w:val="000000"/>
           <w:sz w:val="32"/>
           <w:szCs w:val="32"/>
         </w:rPr>
@@ -607,14 +696,23 @@
     <w:tbl>
       <w:tblPr>
         <w:tblW w:w="9628" w:type="dxa"/>
+        <w:jc w:val="left"/>
+        <w:tblInd w:w="0" w:type="dxa"/>
         <w:tblLayout w:type="fixed"/>
-        <w:tblLook w:val="0400" w:firstRow="0" w:lastRow="0" w:firstColumn="0" w:lastColumn="0" w:noHBand="0" w:noVBand="1"/>
+        <w:tblCellMar>
+          <w:top w:w="0" w:type="dxa"/>
+          <w:left w:w="108" w:type="dxa"/>
+          <w:bottom w:w="0" w:type="dxa"/>
+          <w:right w:w="108" w:type="dxa"/>
+        </w:tblCellMar>
+        <w:tblLook w:firstRow="0" w:noVBand="1" w:lastRow="0" w:firstColumn="0" w:lastColumn="0" w:noHBand="0" w:val="0400"/>
       </w:tblPr>
       <w:tblGrid>
         <w:gridCol w:w="2689"/>
-        <w:gridCol w:w="6939"/>
+        <w:gridCol w:w="6938"/>
       </w:tblGrid>
       <w:tr>
+        <w:trPr/>
         <w:tc>
           <w:tcPr>
             <w:tcW w:w="2689" w:type="dxa"/>
@@ -627,7 +725,9 @@
           </w:tcPr>
           <w:p>
             <w:pPr>
-              <w:spacing w:line="360" w:lineRule="auto"/>
+              <w:pStyle w:val="Normal"/>
+              <w:spacing w:lineRule="auto" w:line="360"/>
+              <w:rPr/>
             </w:pPr>
             <w:r>
               <w:rPr>
@@ -651,7 +751,9 @@
           </w:tcPr>
           <w:p>
             <w:pPr>
-              <w:spacing w:line="360" w:lineRule="auto"/>
+              <w:pStyle w:val="Normal"/>
+              <w:spacing w:lineRule="auto" w:line="360"/>
+              <w:rPr/>
             </w:pPr>
             <w:r>
               <w:rPr>
@@ -662,7 +764,7 @@
             </w:r>
             <w:r>
               <w:rPr>
-                <w:color w:val="000000" w:themeColor="text1"/>
+                <w:color w:themeColor="text1" w:val="000000"/>
                 <w:sz w:val="28"/>
                 <w:szCs w:val="28"/>
               </w:rPr>
@@ -681,23 +783,39 @@
     </w:tbl>
     <w:p>
       <w:pPr>
-        <w:spacing w:line="360" w:lineRule="auto"/>
+        <w:pStyle w:val="Normal"/>
+        <w:spacing w:lineRule="auto" w:line="360"/>
         <w:rPr>
           <w:sz w:val="32"/>
           <w:szCs w:val="32"/>
         </w:rPr>
       </w:pPr>
+      <w:r>
+        <w:rPr>
+          <w:sz w:val="32"/>
+          <w:szCs w:val="32"/>
+        </w:rPr>
+      </w:r>
     </w:p>
     <w:tbl>
       <w:tblPr>
         <w:tblW w:w="9628" w:type="dxa"/>
+        <w:jc w:val="left"/>
+        <w:tblInd w:w="0" w:type="dxa"/>
         <w:tblLayout w:type="fixed"/>
-        <w:tblLook w:val="0400" w:firstRow="0" w:lastRow="0" w:firstColumn="0" w:lastColumn="0" w:noHBand="0" w:noVBand="1"/>
+        <w:tblCellMar>
+          <w:top w:w="0" w:type="dxa"/>
+          <w:left w:w="108" w:type="dxa"/>
+          <w:bottom w:w="0" w:type="dxa"/>
+          <w:right w:w="108" w:type="dxa"/>
+        </w:tblCellMar>
+        <w:tblLook w:firstRow="0" w:noVBand="1" w:lastRow="0" w:firstColumn="0" w:lastColumn="0" w:noHBand="0" w:val="0400"/>
       </w:tblPr>
       <w:tblGrid>
         <w:gridCol w:w="9628"/>
       </w:tblGrid>
       <w:tr>
+        <w:trPr/>
         <w:tc>
           <w:tcPr>
             <w:tcW w:w="9628" w:type="dxa"/>
@@ -710,8 +828,10 @@
           </w:tcPr>
           <w:p>
             <w:pPr>
-              <w:spacing w:line="360" w:lineRule="auto"/>
+              <w:pStyle w:val="Normal"/>
+              <w:spacing w:lineRule="auto" w:line="360"/>
               <w:jc w:val="center"/>
+              <w:rPr/>
             </w:pPr>
             <w:r>
               <w:rPr>
@@ -725,6 +845,7 @@
         </w:tc>
       </w:tr>
       <w:tr>
+        <w:trPr/>
         <w:tc>
           <w:tcPr>
             <w:tcW w:w="9628" w:type="dxa"/>
@@ -737,8 +858,10 @@
           </w:tcPr>
           <w:p>
             <w:pPr>
-              <w:spacing w:line="360" w:lineRule="auto"/>
+              <w:pStyle w:val="Normal"/>
+              <w:spacing w:lineRule="auto" w:line="360"/>
               <w:jc w:val="both"/>
+              <w:rPr/>
             </w:pPr>
             <w:r>
               <w:rPr>
@@ -765,8 +888,10 @@
           </w:p>
           <w:p>
             <w:pPr>
-              <w:spacing w:line="360" w:lineRule="auto"/>
+              <w:pStyle w:val="Normal"/>
+              <w:spacing w:lineRule="auto" w:line="360"/>
               <w:jc w:val="both"/>
+              <w:rPr/>
             </w:pPr>
             <w:r>
               <w:rPr>
@@ -793,8 +918,10 @@
           </w:p>
           <w:p>
             <w:pPr>
-              <w:spacing w:line="360" w:lineRule="auto"/>
+              <w:pStyle w:val="Normal"/>
+              <w:spacing w:lineRule="auto" w:line="360"/>
               <w:jc w:val="both"/>
+              <w:rPr/>
             </w:pPr>
             <w:r>
               <w:rPr>
@@ -821,15 +948,16 @@
           </w:p>
           <w:p>
             <w:pPr>
-              <w:spacing w:line="360" w:lineRule="auto"/>
+              <w:pStyle w:val="Normal"/>
+              <w:spacing w:lineRule="auto" w:line="360"/>
               <w:jc w:val="both"/>
-            </w:pPr>
-            <w:r>
-              <w:rPr>
-                <w:sz w:val="28"/>
-                <w:szCs w:val="28"/>
-              </w:rPr>
-              <w:lastRenderedPageBreak/>
+              <w:rPr/>
+            </w:pPr>
+            <w:r>
+              <w:rPr>
+                <w:sz w:val="28"/>
+                <w:szCs w:val="28"/>
+              </w:rPr>
               <w:t>4. Ator seleciona gestor e pressiona o botão “</w:t>
             </w:r>
             <w:r>
@@ -866,8 +994,10 @@
           </w:p>
           <w:p>
             <w:pPr>
-              <w:spacing w:line="360" w:lineRule="auto"/>
+              <w:pStyle w:val="Normal"/>
+              <w:spacing w:lineRule="auto" w:line="360"/>
               <w:jc w:val="both"/>
+              <w:rPr/>
             </w:pPr>
             <w:r>
               <w:rPr>
@@ -894,32 +1024,19 @@
           </w:p>
           <w:p>
             <w:pPr>
-              <w:spacing w:line="360" w:lineRule="auto"/>
-              <w:rPr>
-                <w:sz w:val="28"/>
-                <w:szCs w:val="28"/>
-              </w:rPr>
-            </w:pPr>
-            <w:r>
-              <w:rPr>
-                <w:sz w:val="28"/>
-                <w:szCs w:val="28"/>
-              </w:rPr>
-              <w:t xml:space="preserve">6. </w:t>
-            </w:r>
-            <w:r>
-              <w:rPr>
-                <w:sz w:val="28"/>
-                <w:szCs w:val="28"/>
-              </w:rPr>
-              <w:t xml:space="preserve">O ator insere as informações cadastrais solicitadas nos campos correspondentes. Ao clicar em </w:t>
-            </w:r>
-            <w:r>
-              <w:rPr>
-                <w:sz w:val="28"/>
-                <w:szCs w:val="28"/>
-              </w:rPr>
-              <w:t>"</w:t>
+              <w:pStyle w:val="Normal"/>
+              <w:spacing w:lineRule="auto" w:line="360"/>
+              <w:rPr>
+                <w:sz w:val="28"/>
+                <w:szCs w:val="28"/>
+              </w:rPr>
+            </w:pPr>
+            <w:r>
+              <w:rPr>
+                <w:sz w:val="28"/>
+                <w:szCs w:val="28"/>
+              </w:rPr>
+              <w:t>6. O ator insere as informações cadastrais solicitadas nos campos correspondentes. Ao clicar em "</w:t>
             </w:r>
             <w:r>
               <w:rPr>
@@ -935,14 +1052,7 @@
                 <w:sz w:val="28"/>
                 <w:szCs w:val="28"/>
               </w:rPr>
-              <w:t>"</w:t>
-            </w:r>
-            <w:r>
-              <w:rPr>
-                <w:sz w:val="28"/>
-                <w:szCs w:val="28"/>
-              </w:rPr>
-              <w:t>, os dados informados serão validados pelo sistema.</w:t>
+              <w:t>", os dados informados serão validados pelo sistema.</w:t>
             </w:r>
             <w:r>
               <w:rPr>
@@ -955,7 +1065,9 @@
           </w:p>
           <w:p>
             <w:pPr>
-              <w:spacing w:line="360" w:lineRule="auto"/>
+              <w:pStyle w:val="Normal"/>
+              <w:spacing w:lineRule="auto" w:line="360"/>
+              <w:rPr/>
             </w:pPr>
             <w:r>
               <w:rPr>
@@ -982,7 +1094,9 @@
           </w:p>
           <w:p>
             <w:pPr>
-              <w:spacing w:line="360" w:lineRule="auto"/>
+              <w:pStyle w:val="Normal"/>
+              <w:spacing w:lineRule="auto" w:line="360"/>
+              <w:rPr/>
             </w:pPr>
             <w:r>
               <w:rPr>
@@ -1025,21 +1139,16 @@
           </w:p>
           <w:p>
             <w:pPr>
-              <w:spacing w:line="360" w:lineRule="auto"/>
-            </w:pPr>
-            <w:r>
-              <w:rPr>
-                <w:sz w:val="28"/>
-                <w:szCs w:val="28"/>
-              </w:rPr>
-              <w:t xml:space="preserve">9. Sistema grava dados informados em meio persistente. </w:t>
-            </w:r>
-            <w:r>
-              <w:rPr>
-                <w:sz w:val="28"/>
-                <w:szCs w:val="28"/>
-              </w:rPr>
-              <w:t>(</w:t>
+              <w:pStyle w:val="Normal"/>
+              <w:spacing w:lineRule="auto" w:line="360"/>
+              <w:rPr/>
+            </w:pPr>
+            <w:r>
+              <w:rPr>
+                <w:sz w:val="28"/>
+                <w:szCs w:val="28"/>
+              </w:rPr>
+              <w:t>9. Sistema grava dados informados em meio persistente. (</w:t>
             </w:r>
             <w:r>
               <w:rPr>
@@ -1060,6 +1169,7 @@
         </w:tc>
       </w:tr>
       <w:tr>
+        <w:trPr/>
         <w:tc>
           <w:tcPr>
             <w:tcW w:w="9628" w:type="dxa"/>
@@ -1072,24 +1182,26 @@
           </w:tcPr>
           <w:p>
             <w:pPr>
-              <w:spacing w:line="360" w:lineRule="auto"/>
+              <w:pStyle w:val="Normal"/>
+              <w:spacing w:lineRule="auto" w:line="360"/>
               <w:jc w:val="center"/>
-            </w:pPr>
-            <w:bookmarkStart w:id="1" w:name="_heading=h.2ew0ivxtnfk7"/>
-            <w:bookmarkEnd w:id="1"/>
+              <w:rPr/>
+            </w:pPr>
+            <w:bookmarkStart w:id="2" w:name="_heading=h.2ew0ivxtnfk7"/>
+            <w:bookmarkEnd w:id="2"/>
             <w:r>
               <w:rPr>
                 <w:b/>
                 <w:sz w:val="28"/>
                 <w:szCs w:val="28"/>
               </w:rPr>
-              <w:lastRenderedPageBreak/>
               <w:t>Fluxos de Exceção</w:t>
             </w:r>
           </w:p>
         </w:tc>
       </w:tr>
       <w:tr>
+        <w:trPr/>
         <w:tc>
           <w:tcPr>
             <w:tcW w:w="9628" w:type="dxa"/>
@@ -1102,8 +1214,10 @@
           </w:tcPr>
           <w:p>
             <w:pPr>
-              <w:spacing w:line="360" w:lineRule="auto"/>
+              <w:pStyle w:val="Normal"/>
+              <w:spacing w:lineRule="auto" w:line="360"/>
               <w:jc w:val="both"/>
+              <w:rPr/>
             </w:pPr>
             <w:r>
               <w:rPr>
@@ -1111,23 +1225,7 @@
                 <w:sz w:val="28"/>
                 <w:szCs w:val="28"/>
               </w:rPr>
-              <w:t xml:space="preserve">Passo </w:t>
-            </w:r>
-            <w:r>
-              <w:rPr>
-                <w:b/>
-                <w:sz w:val="28"/>
-                <w:szCs w:val="28"/>
-              </w:rPr>
-              <w:t>8</w:t>
-            </w:r>
-            <w:r>
-              <w:rPr>
-                <w:b/>
-                <w:sz w:val="28"/>
-                <w:szCs w:val="28"/>
-              </w:rPr>
-              <w:t xml:space="preserve">: </w:t>
+              <w:t xml:space="preserve">Passo 8: </w:t>
             </w:r>
             <w:r>
               <w:rPr>
@@ -1135,7 +1233,11 @@
                 <w:sz w:val="28"/>
                 <w:szCs w:val="28"/>
               </w:rPr>
-              <w:t>O ator visualiza os erros, corrige as informações nos campos indicados e preenche os que estavam faltando</w:t>
+              <w:t>O ator visualiza os erros, corrige as informações nos campos indicados e preenche os que estavam faltando,</w:t>
+            </w:r>
+            <w:r>
+              <w:rPr/>
+              <w:t xml:space="preserve"> </w:t>
             </w:r>
             <w:r>
               <w:rPr>
@@ -1143,26 +1245,7 @@
                 <w:sz w:val="28"/>
                 <w:szCs w:val="28"/>
               </w:rPr>
-              <w:t>,</w:t>
-            </w:r>
-            <w:r>
-              <w:t xml:space="preserve"> </w:t>
-            </w:r>
-            <w:r>
-              <w:rPr>
-                <w:bCs/>
-                <w:sz w:val="28"/>
-                <w:szCs w:val="28"/>
-              </w:rPr>
-              <w:t>o</w:t>
-            </w:r>
-            <w:r>
-              <w:rPr>
-                <w:bCs/>
-                <w:sz w:val="28"/>
-                <w:szCs w:val="28"/>
-              </w:rPr>
-              <w:t xml:space="preserve"> ator pressiona novamente o botão </w:t>
+              <w:t xml:space="preserve">o ator pressiona novamente o botão </w:t>
             </w:r>
             <w:r>
               <w:rPr>
@@ -1206,6 +1289,7 @@
         </w:tc>
       </w:tr>
       <w:tr>
+        <w:trPr/>
         <w:tc>
           <w:tcPr>
             <w:tcW w:w="9628" w:type="dxa"/>
@@ -1218,10 +1302,12 @@
           </w:tcPr>
           <w:p>
             <w:pPr>
+              <w:pStyle w:val="Normal"/>
               <w:tabs>
-                <w:tab w:val="left" w:pos="3881"/>
+                <w:tab w:val="clear" w:pos="708"/>
+                <w:tab w:val="left" w:pos="3881" w:leader="none"/>
               </w:tabs>
-              <w:spacing w:line="360" w:lineRule="auto"/>
+              <w:spacing w:lineRule="auto" w:line="360"/>
               <w:jc w:val="both"/>
               <w:rPr>
                 <w:b/>
@@ -1242,6 +1328,7 @@
         </w:tc>
       </w:tr>
       <w:tr>
+        <w:trPr/>
         <w:tc>
           <w:tcPr>
             <w:tcW w:w="9628" w:type="dxa"/>
@@ -1254,10 +1341,12 @@
           </w:tcPr>
           <w:p>
             <w:pPr>
+              <w:pStyle w:val="Normal"/>
               <w:tabs>
-                <w:tab w:val="left" w:pos="3881"/>
+                <w:tab w:val="clear" w:pos="708"/>
+                <w:tab w:val="left" w:pos="3881" w:leader="none"/>
               </w:tabs>
-              <w:spacing w:line="360" w:lineRule="auto"/>
+              <w:spacing w:lineRule="auto" w:line="360"/>
               <w:jc w:val="both"/>
               <w:rPr>
                 <w:b/>
@@ -1284,7 +1373,7 @@
             <w:r>
               <w:rPr>
                 <w:b/>
-                <w:color w:val="000000" w:themeColor="text1"/>
+                <w:color w:themeColor="text1" w:val="000000"/>
                 <w:sz w:val="28"/>
                 <w:szCs w:val="28"/>
               </w:rPr>
@@ -1296,23 +1385,7 @@
                 <w:sz w:val="28"/>
                 <w:szCs w:val="28"/>
               </w:rPr>
-              <w:t xml:space="preserve"> e o sistema o redireciona para a "Tela de Gestores"</w:t>
-            </w:r>
-            <w:r>
-              <w:rPr>
-                <w:bCs/>
-                <w:sz w:val="28"/>
-                <w:szCs w:val="28"/>
-              </w:rPr>
-              <w:t xml:space="preserve">, </w:t>
-            </w:r>
-            <w:r>
-              <w:rPr>
-                <w:bCs/>
-                <w:sz w:val="28"/>
-                <w:szCs w:val="28"/>
-              </w:rPr>
-              <w:t>descartando quaisquer alterações não salvas.</w:t>
+              <w:t xml:space="preserve"> e o sistema o redireciona para a "Tela de Gestores", descartando quaisquer alterações não salvas.</w:t>
             </w:r>
             <w:r>
               <w:rPr>
@@ -1342,17 +1415,27 @@
     </w:tbl>
     <w:p>
       <w:pPr>
-        <w:spacing w:line="360" w:lineRule="auto"/>
+        <w:pStyle w:val="Normal"/>
+        <w:spacing w:lineRule="auto" w:line="360"/>
         <w:rPr>
           <w:b/>
           <w:sz w:val="32"/>
           <w:szCs w:val="32"/>
         </w:rPr>
       </w:pPr>
+      <w:r>
+        <w:rPr>
+          <w:b/>
+          <w:sz w:val="32"/>
+          <w:szCs w:val="32"/>
+        </w:rPr>
+      </w:r>
     </w:p>
     <w:p>
       <w:pPr>
-        <w:spacing w:line="360" w:lineRule="auto"/>
+        <w:pStyle w:val="Normal"/>
+        <w:spacing w:lineRule="auto" w:line="360"/>
+        <w:rPr/>
       </w:pPr>
       <w:r>
         <w:rPr>
@@ -1373,14 +1456,23 @@
     <w:tbl>
       <w:tblPr>
         <w:tblW w:w="9628" w:type="dxa"/>
+        <w:jc w:val="left"/>
+        <w:tblInd w:w="0" w:type="dxa"/>
         <w:tblLayout w:type="fixed"/>
-        <w:tblLook w:val="0400" w:firstRow="0" w:lastRow="0" w:firstColumn="0" w:lastColumn="0" w:noHBand="0" w:noVBand="1"/>
+        <w:tblCellMar>
+          <w:top w:w="0" w:type="dxa"/>
+          <w:left w:w="108" w:type="dxa"/>
+          <w:bottom w:w="0" w:type="dxa"/>
+          <w:right w:w="108" w:type="dxa"/>
+        </w:tblCellMar>
+        <w:tblLook w:firstRow="0" w:noVBand="1" w:lastRow="0" w:firstColumn="0" w:lastColumn="0" w:noHBand="0" w:val="0400"/>
       </w:tblPr>
       <w:tblGrid>
         <w:gridCol w:w="2689"/>
-        <w:gridCol w:w="6939"/>
+        <w:gridCol w:w="6938"/>
       </w:tblGrid>
       <w:tr>
+        <w:trPr/>
         <w:tc>
           <w:tcPr>
             <w:tcW w:w="2689" w:type="dxa"/>
@@ -1393,7 +1485,9 @@
           </w:tcPr>
           <w:p>
             <w:pPr>
-              <w:spacing w:line="360" w:lineRule="auto"/>
+              <w:pStyle w:val="Normal"/>
+              <w:spacing w:lineRule="auto" w:line="360"/>
+              <w:rPr/>
             </w:pPr>
             <w:r>
               <w:rPr>
@@ -1417,7 +1511,9 @@
           </w:tcPr>
           <w:p>
             <w:pPr>
-              <w:spacing w:line="360" w:lineRule="auto"/>
+              <w:pStyle w:val="Normal"/>
+              <w:spacing w:lineRule="auto" w:line="360"/>
+              <w:rPr/>
             </w:pPr>
             <w:r>
               <w:rPr>
@@ -1432,23 +1528,39 @@
     </w:tbl>
     <w:p>
       <w:pPr>
-        <w:spacing w:line="360" w:lineRule="auto"/>
+        <w:pStyle w:val="Normal"/>
+        <w:spacing w:lineRule="auto" w:line="360"/>
         <w:rPr>
           <w:sz w:val="32"/>
           <w:szCs w:val="32"/>
         </w:rPr>
       </w:pPr>
+      <w:r>
+        <w:rPr>
+          <w:sz w:val="32"/>
+          <w:szCs w:val="32"/>
+        </w:rPr>
+      </w:r>
     </w:p>
     <w:tbl>
       <w:tblPr>
         <w:tblW w:w="9628" w:type="dxa"/>
+        <w:jc w:val="left"/>
+        <w:tblInd w:w="0" w:type="dxa"/>
         <w:tblLayout w:type="fixed"/>
-        <w:tblLook w:val="0400" w:firstRow="0" w:lastRow="0" w:firstColumn="0" w:lastColumn="0" w:noHBand="0" w:noVBand="1"/>
+        <w:tblCellMar>
+          <w:top w:w="0" w:type="dxa"/>
+          <w:left w:w="108" w:type="dxa"/>
+          <w:bottom w:w="0" w:type="dxa"/>
+          <w:right w:w="108" w:type="dxa"/>
+        </w:tblCellMar>
+        <w:tblLook w:firstRow="0" w:noVBand="1" w:lastRow="0" w:firstColumn="0" w:lastColumn="0" w:noHBand="0" w:val="0400"/>
       </w:tblPr>
       <w:tblGrid>
         <w:gridCol w:w="9628"/>
       </w:tblGrid>
       <w:tr>
+        <w:trPr/>
         <w:tc>
           <w:tcPr>
             <w:tcW w:w="9628" w:type="dxa"/>
@@ -1461,8 +1573,10 @@
           </w:tcPr>
           <w:p>
             <w:pPr>
-              <w:spacing w:line="360" w:lineRule="auto"/>
+              <w:pStyle w:val="Normal"/>
+              <w:spacing w:lineRule="auto" w:line="360"/>
               <w:jc w:val="center"/>
+              <w:rPr/>
             </w:pPr>
             <w:r>
               <w:rPr>
@@ -1476,6 +1590,7 @@
         </w:tc>
       </w:tr>
       <w:tr>
+        <w:trPr/>
         <w:tc>
           <w:tcPr>
             <w:tcW w:w="9628" w:type="dxa"/>
@@ -1488,8 +1603,10 @@
           </w:tcPr>
           <w:p>
             <w:pPr>
-              <w:spacing w:line="360" w:lineRule="auto"/>
+              <w:pStyle w:val="Normal"/>
+              <w:spacing w:lineRule="auto" w:line="360"/>
               <w:jc w:val="both"/>
+              <w:rPr/>
             </w:pPr>
             <w:r>
               <w:rPr>
@@ -1516,8 +1633,10 @@
           </w:p>
           <w:p>
             <w:pPr>
-              <w:spacing w:line="360" w:lineRule="auto"/>
+              <w:pStyle w:val="Normal"/>
+              <w:spacing w:lineRule="auto" w:line="360"/>
               <w:jc w:val="both"/>
+              <w:rPr/>
             </w:pPr>
             <w:r>
               <w:rPr>
@@ -1544,8 +1663,10 @@
           </w:p>
           <w:p>
             <w:pPr>
-              <w:spacing w:line="360" w:lineRule="auto"/>
+              <w:pStyle w:val="Normal"/>
+              <w:spacing w:lineRule="auto" w:line="360"/>
               <w:jc w:val="both"/>
+              <w:rPr/>
             </w:pPr>
             <w:r>
               <w:rPr>
@@ -1572,8 +1693,10 @@
           </w:p>
           <w:p>
             <w:pPr>
-              <w:spacing w:line="360" w:lineRule="auto"/>
+              <w:pStyle w:val="Normal"/>
+              <w:spacing w:lineRule="auto" w:line="360"/>
               <w:jc w:val="both"/>
+              <w:rPr/>
             </w:pPr>
             <w:r>
               <w:rPr>
@@ -1616,8 +1739,10 @@
           </w:p>
           <w:p>
             <w:pPr>
-              <w:spacing w:line="360" w:lineRule="auto"/>
+              <w:pStyle w:val="Normal"/>
+              <w:spacing w:lineRule="auto" w:line="360"/>
               <w:jc w:val="both"/>
+              <w:rPr/>
             </w:pPr>
             <w:r>
               <w:rPr>
@@ -1647,37 +1772,13 @@
     </w:tbl>
     <w:p>
       <w:pPr>
-        <w:spacing w:line="360" w:lineRule="auto"/>
+        <w:pStyle w:val="Normal"/>
+        <w:spacing w:lineRule="auto" w:line="360"/>
         <w:rPr>
           <w:b/>
           <w:sz w:val="32"/>
           <w:szCs w:val="32"/>
         </w:rPr>
-      </w:pPr>
-    </w:p>
-    <w:p>
-      <w:pPr>
-        <w:spacing w:line="360" w:lineRule="auto"/>
-        <w:rPr>
-          <w:b/>
-          <w:sz w:val="32"/>
-          <w:szCs w:val="32"/>
-        </w:rPr>
-      </w:pPr>
-    </w:p>
-    <w:p>
-      <w:pPr>
-        <w:spacing w:line="360" w:lineRule="auto"/>
-        <w:rPr>
-          <w:b/>
-          <w:sz w:val="32"/>
-          <w:szCs w:val="32"/>
-        </w:rPr>
-      </w:pPr>
-    </w:p>
-    <w:p>
-      <w:pPr>
-        <w:spacing w:line="360" w:lineRule="auto"/>
       </w:pPr>
       <w:r>
         <w:rPr>
@@ -1685,7 +1786,56 @@
           <w:sz w:val="32"/>
           <w:szCs w:val="32"/>
         </w:rPr>
-        <w:lastRenderedPageBreak/>
+      </w:r>
+    </w:p>
+    <w:p>
+      <w:pPr>
+        <w:pStyle w:val="Normal"/>
+        <w:spacing w:lineRule="auto" w:line="360"/>
+        <w:rPr>
+          <w:b/>
+          <w:sz w:val="32"/>
+          <w:szCs w:val="32"/>
+        </w:rPr>
+      </w:pPr>
+      <w:r>
+        <w:rPr>
+          <w:b/>
+          <w:sz w:val="32"/>
+          <w:szCs w:val="32"/>
+        </w:rPr>
+      </w:r>
+    </w:p>
+    <w:p>
+      <w:pPr>
+        <w:pStyle w:val="Normal"/>
+        <w:spacing w:lineRule="auto" w:line="360"/>
+        <w:rPr>
+          <w:b/>
+          <w:sz w:val="32"/>
+          <w:szCs w:val="32"/>
+        </w:rPr>
+      </w:pPr>
+      <w:r>
+        <w:rPr>
+          <w:b/>
+          <w:sz w:val="32"/>
+          <w:szCs w:val="32"/>
+        </w:rPr>
+      </w:r>
+    </w:p>
+    <w:p>
+      <w:pPr>
+        <w:pStyle w:val="Normal"/>
+        <w:spacing w:lineRule="auto" w:line="360"/>
+        <w:rPr/>
+      </w:pPr>
+      <w:r>
+        <w:rPr>
+          <w:b/>
+          <w:sz w:val="32"/>
+          <w:szCs w:val="32"/>
+        </w:rPr>
         <w:t>Seção:</w:t>
       </w:r>
       <w:r>
@@ -1699,14 +1849,23 @@
     <w:tbl>
       <w:tblPr>
         <w:tblW w:w="9628" w:type="dxa"/>
+        <w:jc w:val="left"/>
+        <w:tblInd w:w="0" w:type="dxa"/>
         <w:tblLayout w:type="fixed"/>
-        <w:tblLook w:val="0400" w:firstRow="0" w:lastRow="0" w:firstColumn="0" w:lastColumn="0" w:noHBand="0" w:noVBand="1"/>
+        <w:tblCellMar>
+          <w:top w:w="0" w:type="dxa"/>
+          <w:left w:w="108" w:type="dxa"/>
+          <w:bottom w:w="0" w:type="dxa"/>
+          <w:right w:w="108" w:type="dxa"/>
+        </w:tblCellMar>
+        <w:tblLook w:firstRow="0" w:noVBand="1" w:lastRow="0" w:firstColumn="0" w:lastColumn="0" w:noHBand="0" w:val="0400"/>
       </w:tblPr>
       <w:tblGrid>
         <w:gridCol w:w="2689"/>
-        <w:gridCol w:w="6939"/>
+        <w:gridCol w:w="6938"/>
       </w:tblGrid>
       <w:tr>
+        <w:trPr/>
         <w:tc>
           <w:tcPr>
             <w:tcW w:w="2689" w:type="dxa"/>
@@ -1719,7 +1878,9 @@
           </w:tcPr>
           <w:p>
             <w:pPr>
-              <w:spacing w:line="360" w:lineRule="auto"/>
+              <w:pStyle w:val="Normal"/>
+              <w:spacing w:lineRule="auto" w:line="360"/>
+              <w:rPr/>
             </w:pPr>
             <w:r>
               <w:rPr>
@@ -1743,7 +1904,9 @@
           </w:tcPr>
           <w:p>
             <w:pPr>
-              <w:spacing w:line="360" w:lineRule="auto"/>
+              <w:pStyle w:val="Normal"/>
+              <w:spacing w:lineRule="auto" w:line="360"/>
+              <w:rPr/>
             </w:pPr>
             <w:r>
               <w:rPr>
@@ -1758,23 +1921,39 @@
     </w:tbl>
     <w:p>
       <w:pPr>
-        <w:spacing w:line="360" w:lineRule="auto"/>
+        <w:pStyle w:val="Normal"/>
+        <w:spacing w:lineRule="auto" w:line="360"/>
         <w:rPr>
           <w:sz w:val="32"/>
           <w:szCs w:val="32"/>
         </w:rPr>
       </w:pPr>
+      <w:r>
+        <w:rPr>
+          <w:sz w:val="32"/>
+          <w:szCs w:val="32"/>
+        </w:rPr>
+      </w:r>
     </w:p>
     <w:tbl>
       <w:tblPr>
         <w:tblW w:w="9628" w:type="dxa"/>
+        <w:jc w:val="left"/>
+        <w:tblInd w:w="0" w:type="dxa"/>
         <w:tblLayout w:type="fixed"/>
-        <w:tblLook w:val="0400" w:firstRow="0" w:lastRow="0" w:firstColumn="0" w:lastColumn="0" w:noHBand="0" w:noVBand="1"/>
+        <w:tblCellMar>
+          <w:top w:w="0" w:type="dxa"/>
+          <w:left w:w="108" w:type="dxa"/>
+          <w:bottom w:w="0" w:type="dxa"/>
+          <w:right w:w="108" w:type="dxa"/>
+        </w:tblCellMar>
+        <w:tblLook w:firstRow="0" w:noVBand="1" w:lastRow="0" w:firstColumn="0" w:lastColumn="0" w:noHBand="0" w:val="0400"/>
       </w:tblPr>
       <w:tblGrid>
         <w:gridCol w:w="9628"/>
       </w:tblGrid>
       <w:tr>
+        <w:trPr/>
         <w:tc>
           <w:tcPr>
             <w:tcW w:w="9628" w:type="dxa"/>
@@ -1787,8 +1966,10 @@
           </w:tcPr>
           <w:p>
             <w:pPr>
-              <w:spacing w:line="360" w:lineRule="auto"/>
+              <w:pStyle w:val="Normal"/>
+              <w:spacing w:lineRule="auto" w:line="360"/>
               <w:jc w:val="center"/>
+              <w:rPr/>
             </w:pPr>
             <w:r>
               <w:rPr>
@@ -1802,6 +1983,7 @@
         </w:tc>
       </w:tr>
       <w:tr>
+        <w:trPr/>
         <w:tc>
           <w:tcPr>
             <w:tcW w:w="9628" w:type="dxa"/>
@@ -1814,8 +1996,10 @@
           </w:tcPr>
           <w:p>
             <w:pPr>
-              <w:spacing w:line="360" w:lineRule="auto"/>
+              <w:pStyle w:val="Normal"/>
+              <w:spacing w:lineRule="auto" w:line="360"/>
               <w:jc w:val="both"/>
+              <w:rPr/>
             </w:pPr>
             <w:r>
               <w:rPr>
@@ -1842,8 +2026,10 @@
           </w:p>
           <w:p>
             <w:pPr>
-              <w:spacing w:line="360" w:lineRule="auto"/>
+              <w:pStyle w:val="Normal"/>
+              <w:spacing w:lineRule="auto" w:line="360"/>
               <w:jc w:val="both"/>
+              <w:rPr/>
             </w:pPr>
             <w:r>
               <w:rPr>
@@ -1870,8 +2056,10 @@
           </w:p>
           <w:p>
             <w:pPr>
-              <w:spacing w:line="360" w:lineRule="auto"/>
+              <w:pStyle w:val="Normal"/>
+              <w:spacing w:lineRule="auto" w:line="360"/>
               <w:jc w:val="both"/>
+              <w:rPr/>
             </w:pPr>
             <w:r>
               <w:rPr>
@@ -1898,8 +2086,10 @@
           </w:p>
           <w:p>
             <w:pPr>
-              <w:spacing w:line="360" w:lineRule="auto"/>
+              <w:pStyle w:val="Normal"/>
+              <w:spacing w:lineRule="auto" w:line="360"/>
               <w:jc w:val="both"/>
+              <w:rPr/>
             </w:pPr>
             <w:r>
               <w:rPr>
@@ -1942,8 +2132,10 @@
           </w:p>
           <w:p>
             <w:pPr>
-              <w:spacing w:line="360" w:lineRule="auto"/>
+              <w:pStyle w:val="Normal"/>
+              <w:spacing w:lineRule="auto" w:line="360"/>
               <w:jc w:val="both"/>
+              <w:rPr/>
             </w:pPr>
             <w:r>
               <w:rPr>
@@ -1970,19 +2162,81 @@
           </w:p>
           <w:p>
             <w:pPr>
-              <w:spacing w:line="360" w:lineRule="auto"/>
+              <w:pStyle w:val="Normal"/>
+              <w:spacing w:lineRule="auto" w:line="360"/>
               <w:jc w:val="both"/>
-              <w:rPr>
-                <w:sz w:val="28"/>
-                <w:szCs w:val="28"/>
-              </w:rPr>
-            </w:pPr>
-            <w:r>
-              <w:rPr>
-                <w:sz w:val="28"/>
-                <w:szCs w:val="28"/>
-              </w:rPr>
-              <w:t>6. Ator pressiona botão “</w:t>
+              <w:rPr/>
+            </w:pPr>
+            <w:r>
+              <w:rPr>
+                <w:sz w:val="28"/>
+                <w:szCs w:val="28"/>
+              </w:rPr>
+              <w:t xml:space="preserve">6. </w:t>
+            </w:r>
+            <w:r>
+              <w:rPr>
+                <w:bCs/>
+                <w:sz w:val="28"/>
+                <w:szCs w:val="28"/>
+              </w:rPr>
+              <w:t xml:space="preserve">O ator pressiona o botão </w:t>
+            </w:r>
+            <w:r>
+              <w:rPr>
+                <w:b/>
+                <w:sz w:val="28"/>
+                <w:szCs w:val="28"/>
+              </w:rPr>
+              <w:t>"Salvar"</w:t>
+            </w:r>
+            <w:r>
+              <w:rPr>
+                <w:bCs/>
+                <w:sz w:val="28"/>
+                <w:szCs w:val="28"/>
+              </w:rPr>
+              <w:t xml:space="preserve"> e o sistema valida os dados inseridos, </w:t>
+            </w:r>
+            <w:r>
+              <w:rPr>
+                <w:sz w:val="28"/>
+                <w:szCs w:val="28"/>
+              </w:rPr>
+              <w:t>salvando as informações e exibindo uma mensagem de sucesso. (</w:t>
+            </w:r>
+            <w:r>
+              <w:rPr>
+                <w:color w:val="C9211E"/>
+                <w:sz w:val="28"/>
+                <w:szCs w:val="28"/>
+              </w:rPr>
+              <w:t>Tela 27</w:t>
+            </w:r>
+            <w:r>
+              <w:rPr>
+                <w:sz w:val="28"/>
+                <w:szCs w:val="28"/>
+              </w:rPr>
+              <w:t>)</w:t>
+            </w:r>
+          </w:p>
+          <w:p>
+            <w:pPr>
+              <w:pStyle w:val="Normal"/>
+              <w:spacing w:lineRule="auto" w:line="360"/>
+              <w:jc w:val="both"/>
+              <w:rPr>
+                <w:sz w:val="28"/>
+                <w:szCs w:val="28"/>
+              </w:rPr>
+            </w:pPr>
+            <w:r>
+              <w:rPr>
+                <w:sz w:val="28"/>
+                <w:szCs w:val="28"/>
+              </w:rPr>
+              <w:t>7. Ator pressiona botão “</w:t>
             </w:r>
             <w:r>
               <w:rPr>
@@ -2018,15 +2272,17 @@
           </w:p>
           <w:p>
             <w:pPr>
-              <w:spacing w:line="360" w:lineRule="auto"/>
+              <w:pStyle w:val="Normal"/>
+              <w:spacing w:lineRule="auto" w:line="360"/>
               <w:jc w:val="both"/>
-            </w:pPr>
-            <w:r>
-              <w:rPr>
-                <w:sz w:val="28"/>
-                <w:szCs w:val="28"/>
-              </w:rPr>
-              <w:t>7. Sistema grava dados informados em meio persistente. (</w:t>
+              <w:rPr/>
+            </w:pPr>
+            <w:r>
+              <w:rPr>
+                <w:sz w:val="28"/>
+                <w:szCs w:val="28"/>
+              </w:rPr>
+              <w:t>8. Sistema grava dados informados em meio persistente. (</w:t>
             </w:r>
             <w:r>
               <w:rPr>
@@ -2047,6 +2303,7 @@
         </w:tc>
       </w:tr>
       <w:tr>
+        <w:trPr/>
         <w:tc>
           <w:tcPr>
             <w:tcW w:w="9628" w:type="dxa"/>
@@ -2059,7 +2316,8 @@
           </w:tcPr>
           <w:p>
             <w:pPr>
-              <w:spacing w:line="360" w:lineRule="auto"/>
+              <w:pStyle w:val="Normal"/>
+              <w:spacing w:lineRule="auto" w:line="360"/>
               <w:jc w:val="center"/>
               <w:rPr>
                 <w:sz w:val="28"/>
@@ -2078,6 +2336,7 @@
         </w:tc>
       </w:tr>
       <w:tr>
+        <w:trPr/>
         <w:tc>
           <w:tcPr>
             <w:tcW w:w="9628" w:type="dxa"/>
@@ -2090,7 +2349,8 @@
           </w:tcPr>
           <w:p>
             <w:pPr>
-              <w:spacing w:line="360" w:lineRule="auto"/>
+              <w:pStyle w:val="Normal"/>
+              <w:spacing w:lineRule="auto" w:line="360"/>
               <w:rPr>
                 <w:b/>
                 <w:sz w:val="28"/>
@@ -2103,7 +2363,7 @@
                 <w:sz w:val="28"/>
                 <w:szCs w:val="28"/>
               </w:rPr>
-              <w:t xml:space="preserve">Passo 6: </w:t>
+              <w:t xml:space="preserve">Passo 7: </w:t>
             </w:r>
             <w:r>
               <w:rPr>
@@ -2111,7 +2371,11 @@
                 <w:sz w:val="28"/>
                 <w:szCs w:val="28"/>
               </w:rPr>
-              <w:t>O ator visualiza os erros, corrige as informações nos campos indicados e preenche os que estavam faltando</w:t>
+              <w:t>O ator visualiza os erros, corrige as informações nos campos indicados e preenche os que estavam faltando,</w:t>
+            </w:r>
+            <w:r>
+              <w:rPr/>
+              <w:t xml:space="preserve"> </w:t>
             </w:r>
             <w:r>
               <w:rPr>
@@ -2119,26 +2383,7 @@
                 <w:sz w:val="28"/>
                 <w:szCs w:val="28"/>
               </w:rPr>
-              <w:t>,</w:t>
-            </w:r>
-            <w:r>
-              <w:t xml:space="preserve"> </w:t>
-            </w:r>
-            <w:r>
-              <w:rPr>
-                <w:bCs/>
-                <w:sz w:val="28"/>
-                <w:szCs w:val="28"/>
-              </w:rPr>
-              <w:t>o</w:t>
-            </w:r>
-            <w:r>
-              <w:rPr>
-                <w:bCs/>
-                <w:sz w:val="28"/>
-                <w:szCs w:val="28"/>
-              </w:rPr>
-              <w:t xml:space="preserve"> ator pressiona novamente o botão </w:t>
+              <w:t xml:space="preserve">o ator pressiona novamente o botão </w:t>
             </w:r>
             <w:r>
               <w:rPr>
@@ -2182,6 +2427,7 @@
         </w:tc>
       </w:tr>
       <w:tr>
+        <w:trPr/>
         <w:tc>
           <w:tcPr>
             <w:tcW w:w="9628" w:type="dxa"/>
@@ -2194,7 +2440,8 @@
           </w:tcPr>
           <w:p>
             <w:pPr>
-              <w:spacing w:line="360" w:lineRule="auto"/>
+              <w:pStyle w:val="Normal"/>
+              <w:spacing w:lineRule="auto" w:line="360"/>
               <w:jc w:val="center"/>
               <w:rPr>
                 <w:b/>
@@ -2214,6 +2461,7 @@
         </w:tc>
       </w:tr>
       <w:tr>
+        <w:trPr/>
         <w:tc>
           <w:tcPr>
             <w:tcW w:w="9628" w:type="dxa"/>
@@ -2226,7 +2474,8 @@
           </w:tcPr>
           <w:p>
             <w:pPr>
-              <w:spacing w:line="360" w:lineRule="auto"/>
+              <w:pStyle w:val="Normal"/>
+              <w:spacing w:lineRule="auto" w:line="360"/>
               <w:rPr>
                 <w:sz w:val="28"/>
                 <w:szCs w:val="28"/>
@@ -2251,7 +2500,7 @@
             <w:r>
               <w:rPr>
                 <w:b/>
-                <w:color w:val="000000" w:themeColor="text1"/>
+                <w:color w:themeColor="text1" w:val="000000"/>
                 <w:sz w:val="28"/>
                 <w:szCs w:val="28"/>
               </w:rPr>
@@ -2263,23 +2512,7 @@
                 <w:sz w:val="28"/>
                 <w:szCs w:val="28"/>
               </w:rPr>
-              <w:t xml:space="preserve"> e o sistema o redireciona para a "Tela de Gestores"</w:t>
-            </w:r>
-            <w:r>
-              <w:rPr>
-                <w:bCs/>
-                <w:sz w:val="28"/>
-                <w:szCs w:val="28"/>
-              </w:rPr>
-              <w:t xml:space="preserve">, </w:t>
-            </w:r>
-            <w:r>
-              <w:rPr>
-                <w:bCs/>
-                <w:sz w:val="28"/>
-                <w:szCs w:val="28"/>
-              </w:rPr>
-              <w:t>descartando quaisquer alterações não salvas.</w:t>
+              <w:t xml:space="preserve"> e o sistema o redireciona para a "Tela de Gestores", descartando quaisquer alterações não salvas.</w:t>
             </w:r>
             <w:r>
               <w:rPr>
@@ -2306,99 +2539,44 @@
           </w:p>
           <w:p>
             <w:pPr>
-              <w:spacing w:line="360" w:lineRule="auto"/>
-              <w:rPr>
-                <w:sz w:val="28"/>
-                <w:szCs w:val="28"/>
-              </w:rPr>
-            </w:pPr>
-            <w:r>
-              <w:rPr>
-                <w:b/>
-                <w:sz w:val="28"/>
-                <w:szCs w:val="28"/>
-              </w:rPr>
-              <w:t xml:space="preserve">Passo 6: </w:t>
-            </w:r>
-            <w:r>
-              <w:rPr>
-                <w:bCs/>
-                <w:sz w:val="28"/>
-                <w:szCs w:val="28"/>
-              </w:rPr>
-              <w:t xml:space="preserve">O ator pressiona o botão </w:t>
-            </w:r>
-            <w:r>
-              <w:rPr>
-                <w:b/>
-                <w:sz w:val="28"/>
-                <w:szCs w:val="28"/>
-              </w:rPr>
-              <w:t>"Salvar"</w:t>
-            </w:r>
-            <w:r>
-              <w:rPr>
-                <w:bCs/>
-                <w:sz w:val="28"/>
-                <w:szCs w:val="28"/>
-              </w:rPr>
-              <w:t xml:space="preserve"> e o sistema valida os dados inseridos, </w:t>
-            </w:r>
-            <w:r>
-              <w:rPr>
-                <w:sz w:val="28"/>
-                <w:szCs w:val="28"/>
-              </w:rPr>
-              <w:t>salvando as informações e exibindo uma mensagem de sucesso.</w:t>
-            </w:r>
-            <w:r>
-              <w:rPr>
-                <w:sz w:val="28"/>
-                <w:szCs w:val="28"/>
-              </w:rPr>
-              <w:t xml:space="preserve"> (</w:t>
-            </w:r>
-            <w:r>
-              <w:rPr>
-                <w:color w:val="C9211E"/>
-                <w:sz w:val="28"/>
-                <w:szCs w:val="28"/>
-              </w:rPr>
-              <w:t>Tela 27</w:t>
-            </w:r>
-            <w:r>
-              <w:rPr>
-                <w:sz w:val="28"/>
-                <w:szCs w:val="28"/>
-              </w:rPr>
-              <w:t>)</w:t>
-            </w:r>
-          </w:p>
-          <w:p>
-            <w:pPr>
-              <w:spacing w:line="360" w:lineRule="auto"/>
-              <w:rPr>
-                <w:b/>
-                <w:sz w:val="28"/>
-                <w:szCs w:val="28"/>
-              </w:rPr>
-            </w:pPr>
+              <w:pStyle w:val="Normal"/>
+              <w:spacing w:lineRule="auto" w:line="360"/>
+              <w:rPr>
+                <w:sz w:val="28"/>
+                <w:szCs w:val="28"/>
+              </w:rPr>
+            </w:pPr>
+            <w:r>
+              <w:rPr>
+                <w:sz w:val="28"/>
+                <w:szCs w:val="28"/>
+              </w:rPr>
+            </w:r>
           </w:p>
         </w:tc>
       </w:tr>
     </w:tbl>
     <w:p>
       <w:pPr>
-        <w:spacing w:line="360" w:lineRule="auto"/>
+        <w:pStyle w:val="Normal"/>
+        <w:spacing w:lineRule="auto" w:line="360"/>
         <w:rPr>
           <w:sz w:val="32"/>
           <w:szCs w:val="32"/>
         </w:rPr>
       </w:pPr>
+      <w:r>
+        <w:rPr>
+          <w:sz w:val="32"/>
+          <w:szCs w:val="32"/>
+        </w:rPr>
+      </w:r>
     </w:p>
     <w:p>
       <w:pPr>
-        <w:spacing w:line="360" w:lineRule="auto"/>
+        <w:pStyle w:val="Normal"/>
+        <w:spacing w:lineRule="auto" w:line="360"/>
+        <w:rPr/>
       </w:pPr>
       <w:r>
         <w:rPr>
@@ -2419,14 +2597,23 @@
     <w:tbl>
       <w:tblPr>
         <w:tblW w:w="9628" w:type="dxa"/>
+        <w:jc w:val="left"/>
+        <w:tblInd w:w="0" w:type="dxa"/>
         <w:tblLayout w:type="fixed"/>
-        <w:tblLook w:val="0400" w:firstRow="0" w:lastRow="0" w:firstColumn="0" w:lastColumn="0" w:noHBand="0" w:noVBand="1"/>
+        <w:tblCellMar>
+          <w:top w:w="0" w:type="dxa"/>
+          <w:left w:w="108" w:type="dxa"/>
+          <w:bottom w:w="0" w:type="dxa"/>
+          <w:right w:w="108" w:type="dxa"/>
+        </w:tblCellMar>
+        <w:tblLook w:firstRow="0" w:noVBand="1" w:lastRow="0" w:firstColumn="0" w:lastColumn="0" w:noHBand="0" w:val="0400"/>
       </w:tblPr>
       <w:tblGrid>
         <w:gridCol w:w="2689"/>
-        <w:gridCol w:w="6939"/>
+        <w:gridCol w:w="6938"/>
       </w:tblGrid>
       <w:tr>
+        <w:trPr/>
         <w:tc>
           <w:tcPr>
             <w:tcW w:w="2689" w:type="dxa"/>
@@ -2439,7 +2626,9 @@
           </w:tcPr>
           <w:p>
             <w:pPr>
-              <w:spacing w:line="360" w:lineRule="auto"/>
+              <w:pStyle w:val="Normal"/>
+              <w:spacing w:lineRule="auto" w:line="360"/>
+              <w:rPr/>
             </w:pPr>
             <w:r>
               <w:rPr>
@@ -2463,7 +2652,9 @@
           </w:tcPr>
           <w:p>
             <w:pPr>
-              <w:spacing w:line="360" w:lineRule="auto"/>
+              <w:pStyle w:val="Normal"/>
+              <w:spacing w:lineRule="auto" w:line="360"/>
+              <w:rPr/>
             </w:pPr>
             <w:r>
               <w:rPr>
@@ -2478,23 +2669,39 @@
     </w:tbl>
     <w:p>
       <w:pPr>
-        <w:spacing w:line="360" w:lineRule="auto"/>
+        <w:pStyle w:val="Normal"/>
+        <w:spacing w:lineRule="auto" w:line="360"/>
         <w:rPr>
           <w:sz w:val="32"/>
           <w:szCs w:val="32"/>
         </w:rPr>
       </w:pPr>
+      <w:r>
+        <w:rPr>
+          <w:sz w:val="32"/>
+          <w:szCs w:val="32"/>
+        </w:rPr>
+      </w:r>
     </w:p>
     <w:tbl>
       <w:tblPr>
         <w:tblW w:w="9628" w:type="dxa"/>
+        <w:jc w:val="left"/>
+        <w:tblInd w:w="0" w:type="dxa"/>
         <w:tblLayout w:type="fixed"/>
-        <w:tblLook w:val="0400" w:firstRow="0" w:lastRow="0" w:firstColumn="0" w:lastColumn="0" w:noHBand="0" w:noVBand="1"/>
+        <w:tblCellMar>
+          <w:top w:w="0" w:type="dxa"/>
+          <w:left w:w="108" w:type="dxa"/>
+          <w:bottom w:w="0" w:type="dxa"/>
+          <w:right w:w="108" w:type="dxa"/>
+        </w:tblCellMar>
+        <w:tblLook w:firstRow="0" w:noVBand="1" w:lastRow="0" w:firstColumn="0" w:lastColumn="0" w:noHBand="0" w:val="0400"/>
       </w:tblPr>
       <w:tblGrid>
         <w:gridCol w:w="9628"/>
       </w:tblGrid>
       <w:tr>
+        <w:trPr/>
         <w:tc>
           <w:tcPr>
             <w:tcW w:w="9628" w:type="dxa"/>
@@ -2507,8 +2714,10 @@
           </w:tcPr>
           <w:p>
             <w:pPr>
-              <w:spacing w:line="360" w:lineRule="auto"/>
+              <w:pStyle w:val="Normal"/>
+              <w:spacing w:lineRule="auto" w:line="360"/>
               <w:jc w:val="center"/>
+              <w:rPr/>
             </w:pPr>
             <w:r>
               <w:rPr>
@@ -2522,6 +2731,7 @@
         </w:tc>
       </w:tr>
       <w:tr>
+        <w:trPr/>
         <w:tc>
           <w:tcPr>
             <w:tcW w:w="9628" w:type="dxa"/>
@@ -2534,15 +2744,16 @@
           </w:tcPr>
           <w:p>
             <w:pPr>
-              <w:spacing w:line="360" w:lineRule="auto"/>
+              <w:pStyle w:val="Normal"/>
+              <w:spacing w:lineRule="auto" w:line="360"/>
               <w:jc w:val="both"/>
-            </w:pPr>
-            <w:r>
-              <w:rPr>
-                <w:sz w:val="28"/>
-                <w:szCs w:val="28"/>
-              </w:rPr>
-              <w:lastRenderedPageBreak/>
+              <w:rPr/>
+            </w:pPr>
+            <w:r>
+              <w:rPr>
+                <w:sz w:val="28"/>
+                <w:szCs w:val="28"/>
+              </w:rPr>
               <w:t>1. Sistema exibe tela de início. (</w:t>
             </w:r>
             <w:r>
@@ -2563,8 +2774,10 @@
           </w:p>
           <w:p>
             <w:pPr>
-              <w:spacing w:line="360" w:lineRule="auto"/>
+              <w:pStyle w:val="Normal"/>
+              <w:spacing w:lineRule="auto" w:line="360"/>
               <w:jc w:val="both"/>
+              <w:rPr/>
             </w:pPr>
             <w:r>
               <w:rPr>
@@ -2591,8 +2804,10 @@
           </w:p>
           <w:p>
             <w:pPr>
-              <w:spacing w:line="360" w:lineRule="auto"/>
+              <w:pStyle w:val="Normal"/>
+              <w:spacing w:lineRule="auto" w:line="360"/>
               <w:jc w:val="both"/>
+              <w:rPr/>
             </w:pPr>
             <w:r>
               <w:rPr>
@@ -2619,8 +2834,10 @@
           </w:p>
           <w:p>
             <w:pPr>
-              <w:spacing w:line="360" w:lineRule="auto"/>
+              <w:pStyle w:val="Normal"/>
+              <w:spacing w:lineRule="auto" w:line="360"/>
               <w:jc w:val="both"/>
+              <w:rPr/>
             </w:pPr>
             <w:r>
               <w:rPr>
@@ -2663,8 +2880,10 @@
           </w:p>
           <w:p>
             <w:pPr>
-              <w:spacing w:line="360" w:lineRule="auto"/>
+              <w:pStyle w:val="Normal"/>
+              <w:spacing w:lineRule="auto" w:line="360"/>
               <w:jc w:val="both"/>
+              <w:rPr/>
             </w:pPr>
             <w:r>
               <w:rPr>
@@ -2691,7 +2910,9 @@
           </w:p>
           <w:p>
             <w:pPr>
-              <w:spacing w:line="360" w:lineRule="auto"/>
+              <w:pStyle w:val="Normal"/>
+              <w:spacing w:lineRule="auto" w:line="360"/>
+              <w:rPr/>
             </w:pPr>
             <w:r>
               <w:rPr>
@@ -2734,7 +2955,9 @@
           </w:p>
           <w:p>
             <w:pPr>
-              <w:spacing w:line="360" w:lineRule="auto"/>
+              <w:pStyle w:val="Normal"/>
+              <w:spacing w:lineRule="auto" w:line="360"/>
+              <w:rPr/>
             </w:pPr>
             <w:r>
               <w:rPr>
@@ -2762,6 +2985,7 @@
         </w:tc>
       </w:tr>
       <w:tr>
+        <w:trPr/>
         <w:tc>
           <w:tcPr>
             <w:tcW w:w="9628" w:type="dxa"/>
@@ -2774,7 +2998,8 @@
           </w:tcPr>
           <w:p>
             <w:pPr>
-              <w:spacing w:line="360" w:lineRule="auto"/>
+              <w:pStyle w:val="Normal"/>
+              <w:spacing w:lineRule="auto" w:line="360"/>
               <w:jc w:val="center"/>
               <w:rPr>
                 <w:sz w:val="28"/>
@@ -2793,6 +3018,7 @@
         </w:tc>
       </w:tr>
       <w:tr>
+        <w:trPr/>
         <w:tc>
           <w:tcPr>
             <w:tcW w:w="9628" w:type="dxa"/>
@@ -2805,7 +3031,8 @@
           </w:tcPr>
           <w:p>
             <w:pPr>
-              <w:spacing w:line="360" w:lineRule="auto"/>
+              <w:pStyle w:val="Normal"/>
+              <w:spacing w:lineRule="auto" w:line="360"/>
               <w:rPr>
                 <w:sz w:val="28"/>
                 <w:szCs w:val="28"/>
@@ -2830,7 +3057,7 @@
             <w:r>
               <w:rPr>
                 <w:b/>
-                <w:color w:val="000000" w:themeColor="text1"/>
+                <w:color w:themeColor="text1" w:val="000000"/>
                 <w:sz w:val="28"/>
                 <w:szCs w:val="28"/>
               </w:rPr>
@@ -2842,23 +3069,7 @@
                 <w:sz w:val="28"/>
                 <w:szCs w:val="28"/>
               </w:rPr>
-              <w:t xml:space="preserve"> e o sistema o redireciona para a "Tela de Gestores"</w:t>
-            </w:r>
-            <w:r>
-              <w:rPr>
-                <w:bCs/>
-                <w:sz w:val="28"/>
-                <w:szCs w:val="28"/>
-              </w:rPr>
-              <w:t xml:space="preserve">, </w:t>
-            </w:r>
-            <w:r>
-              <w:rPr>
-                <w:bCs/>
-                <w:sz w:val="28"/>
-                <w:szCs w:val="28"/>
-              </w:rPr>
-              <w:t>descartando quaisquer alterações não salvas.</w:t>
+              <w:t xml:space="preserve"> e o sistema o redireciona para a "Tela de Gestores", descartando quaisquer alterações não salvas.</w:t>
             </w:r>
             <w:r>
               <w:rPr>
@@ -2885,7 +3096,8 @@
           </w:p>
           <w:p>
             <w:pPr>
-              <w:spacing w:line="360" w:lineRule="auto"/>
+              <w:pStyle w:val="Normal"/>
+              <w:spacing w:lineRule="auto" w:line="360"/>
               <w:rPr>
                 <w:sz w:val="28"/>
                 <w:szCs w:val="28"/>
@@ -2897,23 +3109,7 @@
                 <w:sz w:val="28"/>
                 <w:szCs w:val="28"/>
               </w:rPr>
-              <w:t xml:space="preserve">Passo </w:t>
-            </w:r>
-            <w:r>
-              <w:rPr>
-                <w:b/>
-                <w:sz w:val="28"/>
-                <w:szCs w:val="28"/>
-              </w:rPr>
-              <w:t>6</w:t>
-            </w:r>
-            <w:r>
-              <w:rPr>
-                <w:b/>
-                <w:sz w:val="28"/>
-                <w:szCs w:val="28"/>
-              </w:rPr>
-              <w:t xml:space="preserve">: </w:t>
+              <w:t xml:space="preserve">Passo 6: </w:t>
             </w:r>
             <w:r>
               <w:rPr>
@@ -2936,28 +3132,7 @@
                 <w:sz w:val="28"/>
                 <w:szCs w:val="28"/>
               </w:rPr>
-              <w:t xml:space="preserve">”, irá aparecer um pop-up perguntando: “Deseja remover o </w:t>
-            </w:r>
-            <w:r>
-              <w:rPr>
-                <w:sz w:val="28"/>
-                <w:szCs w:val="28"/>
-              </w:rPr>
-              <w:t>remover o Gestor</w:t>
-            </w:r>
-            <w:r>
-              <w:rPr>
-                <w:sz w:val="28"/>
-                <w:szCs w:val="28"/>
-              </w:rPr>
-              <w:t>?”, com as opções sim ou não.</w:t>
-            </w:r>
-            <w:r>
-              <w:rPr>
-                <w:sz w:val="28"/>
-                <w:szCs w:val="28"/>
-              </w:rPr>
-              <w:t xml:space="preserve"> (</w:t>
+              <w:t>”, irá aparecer um pop-up perguntando: “Deseja remover o remover o Gestor?”, com as opções sim ou não. (</w:t>
             </w:r>
             <w:r>
               <w:rPr>
@@ -2965,15 +3140,7 @@
                 <w:sz w:val="28"/>
                 <w:szCs w:val="28"/>
               </w:rPr>
-              <w:t xml:space="preserve">Tela </w:t>
-            </w:r>
-            <w:r>
-              <w:rPr>
-                <w:color w:val="C9211E"/>
-                <w:sz w:val="28"/>
-                <w:szCs w:val="28"/>
-              </w:rPr>
-              <w:t>20</w:t>
+              <w:t>Tela 20</w:t>
             </w:r>
             <w:r>
               <w:rPr>
@@ -2988,26 +3155,42 @@
     </w:tbl>
     <w:p>
       <w:pPr>
-        <w:spacing w:line="360" w:lineRule="auto"/>
+        <w:pStyle w:val="Normal"/>
+        <w:spacing w:lineRule="auto" w:line="360"/>
         <w:rPr>
           <w:sz w:val="28"/>
           <w:szCs w:val="28"/>
         </w:rPr>
       </w:pPr>
+      <w:r>
+        <w:rPr>
+          <w:sz w:val="28"/>
+          <w:szCs w:val="28"/>
+        </w:rPr>
+      </w:r>
     </w:p>
     <w:p>
       <w:pPr>
-        <w:spacing w:line="360" w:lineRule="auto"/>
+        <w:pStyle w:val="Normal"/>
+        <w:spacing w:lineRule="auto" w:line="360"/>
         <w:rPr>
           <w:sz w:val="28"/>
           <w:szCs w:val="28"/>
         </w:rPr>
       </w:pPr>
+      <w:r>
+        <w:rPr>
+          <w:sz w:val="28"/>
+          <w:szCs w:val="28"/>
+        </w:rPr>
+      </w:r>
     </w:p>
     <w:p>
       <w:pPr>
-        <w:spacing w:line="360" w:lineRule="auto"/>
+        <w:pStyle w:val="Normal"/>
+        <w:spacing w:lineRule="auto" w:line="360"/>
         <w:jc w:val="center"/>
+        <w:rPr/>
       </w:pPr>
       <w:r>
         <w:rPr>
@@ -3021,8 +3204,16 @@
     <w:tbl>
       <w:tblPr>
         <w:tblW w:w="9628" w:type="dxa"/>
+        <w:jc w:val="left"/>
+        <w:tblInd w:w="0" w:type="dxa"/>
         <w:tblLayout w:type="fixed"/>
-        <w:tblLook w:val="0400" w:firstRow="0" w:lastRow="0" w:firstColumn="0" w:lastColumn="0" w:noHBand="0" w:noVBand="1"/>
+        <w:tblCellMar>
+          <w:top w:w="0" w:type="dxa"/>
+          <w:left w:w="108" w:type="dxa"/>
+          <w:bottom w:w="0" w:type="dxa"/>
+          <w:right w:w="108" w:type="dxa"/>
+        </w:tblCellMar>
+        <w:tblLook w:firstRow="0" w:noVBand="1" w:lastRow="0" w:firstColumn="0" w:lastColumn="0" w:noHBand="0" w:val="0400"/>
       </w:tblPr>
       <w:tblGrid>
         <w:gridCol w:w="3209"/>
@@ -3030,6 +3221,7 @@
         <w:gridCol w:w="3210"/>
       </w:tblGrid>
       <w:tr>
+        <w:trPr/>
         <w:tc>
           <w:tcPr>
             <w:tcW w:w="3209" w:type="dxa"/>
@@ -3042,8 +3234,10 @@
           </w:tcPr>
           <w:p>
             <w:pPr>
-              <w:spacing w:line="360" w:lineRule="auto"/>
+              <w:pStyle w:val="Normal"/>
+              <w:spacing w:lineRule="auto" w:line="360"/>
               <w:jc w:val="center"/>
+              <w:rPr/>
             </w:pPr>
             <w:r>
               <w:rPr>
@@ -3066,8 +3260,10 @@
           </w:tcPr>
           <w:p>
             <w:pPr>
-              <w:spacing w:line="360" w:lineRule="auto"/>
+              <w:pStyle w:val="Normal"/>
+              <w:spacing w:lineRule="auto" w:line="360"/>
               <w:jc w:val="center"/>
+              <w:rPr/>
             </w:pPr>
             <w:r>
               <w:rPr>
@@ -3090,8 +3286,10 @@
           </w:tcPr>
           <w:p>
             <w:pPr>
-              <w:spacing w:line="360" w:lineRule="auto"/>
+              <w:pStyle w:val="Normal"/>
+              <w:spacing w:lineRule="auto" w:line="360"/>
               <w:jc w:val="center"/>
+              <w:rPr/>
             </w:pPr>
             <w:r>
               <w:rPr>
@@ -3104,6 +3302,7 @@
         </w:tc>
       </w:tr>
       <w:tr>
+        <w:trPr/>
         <w:tc>
           <w:tcPr>
             <w:tcW w:w="3209" w:type="dxa"/>
@@ -3116,8 +3315,10 @@
           </w:tcPr>
           <w:p>
             <w:pPr>
-              <w:spacing w:line="360" w:lineRule="auto"/>
+              <w:pStyle w:val="Normal"/>
+              <w:spacing w:lineRule="auto" w:line="360"/>
               <w:jc w:val="center"/>
+              <w:rPr/>
             </w:pPr>
             <w:r>
               <w:rPr>
@@ -3140,24 +3341,17 @@
           </w:tcPr>
           <w:p>
             <w:pPr>
-              <w:spacing w:line="360" w:lineRule="auto"/>
+              <w:pStyle w:val="Normal"/>
+              <w:spacing w:lineRule="auto" w:line="360"/>
               <w:jc w:val="center"/>
-            </w:pPr>
-            <w:proofErr w:type="spellStart"/>
-            <w:r>
-              <w:rPr>
-                <w:sz w:val="28"/>
-                <w:szCs w:val="28"/>
-              </w:rPr>
-              <w:t>Talysson</w:t>
-            </w:r>
-            <w:proofErr w:type="spellEnd"/>
-            <w:r>
-              <w:rPr>
-                <w:sz w:val="28"/>
-                <w:szCs w:val="28"/>
-              </w:rPr>
-              <w:t xml:space="preserve"> Vasconcelos</w:t>
+              <w:rPr/>
+            </w:pPr>
+            <w:r>
+              <w:rPr>
+                <w:sz w:val="28"/>
+                <w:szCs w:val="28"/>
+              </w:rPr>
+              <w:t>Talysson Vasconcelos</w:t>
             </w:r>
           </w:p>
         </w:tc>
@@ -3173,8 +3367,10 @@
           </w:tcPr>
           <w:p>
             <w:pPr>
-              <w:spacing w:line="360" w:lineRule="auto"/>
+              <w:pStyle w:val="Normal"/>
+              <w:spacing w:lineRule="auto" w:line="360"/>
               <w:jc w:val="center"/>
+              <w:rPr/>
             </w:pPr>
             <w:r>
               <w:rPr>
@@ -3187,6 +3383,7 @@
         </w:tc>
       </w:tr>
       <w:tr>
+        <w:trPr/>
         <w:tc>
           <w:tcPr>
             <w:tcW w:w="3209" w:type="dxa"/>
@@ -3199,7 +3396,8 @@
           </w:tcPr>
           <w:p>
             <w:pPr>
-              <w:spacing w:line="360" w:lineRule="auto"/>
+              <w:pStyle w:val="Normal"/>
+              <w:spacing w:lineRule="auto" w:line="360"/>
               <w:jc w:val="center"/>
               <w:rPr>
                 <w:sz w:val="28"/>
@@ -3211,7 +3409,7 @@
                 <w:sz w:val="28"/>
                 <w:szCs w:val="28"/>
               </w:rPr>
-              <w:t>30</w:t>
+              <w:t>01</w:t>
             </w:r>
             <w:r>
               <w:rPr>
@@ -3225,7 +3423,7 @@
                 <w:sz w:val="28"/>
                 <w:szCs w:val="28"/>
               </w:rPr>
-              <w:t>7</w:t>
+              <w:t>8</w:t>
             </w:r>
             <w:r>
               <w:rPr>
@@ -3248,7 +3446,8 @@
           </w:tcPr>
           <w:p>
             <w:pPr>
-              <w:spacing w:line="360" w:lineRule="auto"/>
+              <w:pStyle w:val="Normal"/>
+              <w:spacing w:lineRule="auto" w:line="360"/>
               <w:jc w:val="center"/>
               <w:rPr>
                 <w:sz w:val="28"/>
@@ -3276,7 +3475,8 @@
           </w:tcPr>
           <w:p>
             <w:pPr>
-              <w:spacing w:line="360" w:lineRule="auto"/>
+              <w:pStyle w:val="Normal"/>
+              <w:spacing w:lineRule="auto" w:line="360"/>
               <w:jc w:val="center"/>
               <w:rPr>
                 <w:sz w:val="28"/>
@@ -3288,28 +3488,7 @@
                 <w:sz w:val="28"/>
                 <w:szCs w:val="28"/>
               </w:rPr>
-              <w:t>Criação da descrição d</w:t>
-            </w:r>
-            <w:r>
-              <w:rPr>
-                <w:sz w:val="28"/>
-                <w:szCs w:val="28"/>
-              </w:rPr>
-              <w:t>e</w:t>
-            </w:r>
-            <w:r>
-              <w:rPr>
-                <w:sz w:val="28"/>
-                <w:szCs w:val="28"/>
-              </w:rPr>
-              <w:t xml:space="preserve"> </w:t>
-            </w:r>
-            <w:r>
-              <w:rPr>
-                <w:sz w:val="28"/>
-                <w:szCs w:val="28"/>
-              </w:rPr>
-              <w:t>Fluxo Alternativo e Exceção</w:t>
+              <w:t>Criação da descrição de Fluxo Alternativo e Exceção</w:t>
             </w:r>
           </w:p>
         </w:tc>
@@ -3317,30 +3496,34 @@
     </w:tbl>
     <w:p>
       <w:pPr>
-        <w:spacing w:line="360" w:lineRule="auto"/>
+        <w:pStyle w:val="Normal"/>
+        <w:spacing w:lineRule="auto" w:line="360"/>
         <w:rPr>
           <w:u w:val="single"/>
         </w:rPr>
       </w:pPr>
+      <w:r>
+        <w:rPr>
+          <w:u w:val="single"/>
+        </w:rPr>
+      </w:r>
     </w:p>
     <w:sectPr>
+      <w:type w:val="nextPage"/>
       <w:pgSz w:w="11906" w:h="16838"/>
-      <w:pgMar w:top="1701" w:right="1134" w:bottom="1701" w:left="1134" w:header="0" w:footer="0" w:gutter="0"/>
-      <w:pgNumType w:start="1"/>
-      <w:cols w:space="720"/>
-      <w:formProt w:val="0"/>
-      <w:docGrid w:linePitch="100"/>
+      <w:pgMar w:left="1134" w:right="1134" w:gutter="0" w:header="0" w:top="1701" w:footer="0" w:bottom="1701"/>
+      <w:pgNumType w:start="1" w:fmt="decimal"/>
+      <w:formProt w:val="false"/>
+      <w:textDirection w:val="lrTb"/>
+      <w:docGrid w:type="default" w:linePitch="100" w:charSpace="0"/>
     </w:sectPr>
   </w:body>
 </w:document>
 </file>
 
 <file path=word/numbering.xml><?xml version="1.0" encoding="utf-8"?>
-<w:numbering xmlns:wpc="http://schemas.microsoft.com/office/word/2010/wordprocessingCanvas" xmlns:cx="http://schemas.microsoft.com/office/drawing/2014/chartex" xmlns:cx1="http://schemas.microsoft.com/office/drawing/2015/9/8/chartex" xmlns:cx2="http://schemas.microsoft.com/office/drawing/2015/10/21/chartex" xmlns:cx3="http://schemas.microsoft.com/office/drawing/2016/5/9/chartex" xmlns:cx4="http://schemas.microsoft.com/office/drawing/2016/5/10/chartex" xmlns:cx5="http://schemas.microsoft.com/office/drawing/2016/5/11/chartex" xmlns:cx6="http://schemas.microsoft.com/office/drawing/2016/5/12/chartex" xmlns:cx7="http://schemas.microsoft.com/office/drawing/2016/5/13/chartex" xmlns:cx8="http://schemas.microsoft.com/office/drawing/2016/5/14/chartex" xmlns:mc="http://schemas.openxmlformats.org/markup-compatibility/2006" xmlns:aink="http://schemas.microsoft.com/office/drawing/2016/ink" xmlns:am3d="http://schemas.microsoft.com/office/drawing/2017/model3d" xmlns:o="urn:schemas-microsoft-com:office:office" xmlns:oel="http://schemas.microsoft.com/office/2019/extlst" xmlns:r="http://schemas.openxmlformats.org/officeDocument/2006/relationships" xmlns:m="http://schemas.openxmlformats.org/officeDocument/2006/math" xmlns:v="urn:schemas-microsoft-com:vml" xmlns:wp14="http://schemas.microsoft.com/office/word/2010/wordprocessingDrawing" xmlns:wp="http://schemas.openxmlformats.org/drawingml/2006/wordprocessingDrawing" xmlns:w10="urn:schemas-microsoft-com:office:word" xmlns:w="http://schemas.openxmlformats.org/wordprocessingml/2006/main" xmlns:w14="http://schemas.microsoft.com/office/word/2010/wordml" xmlns:w15="http://schemas.microsoft.com/office/word/2012/wordml" xmlns:w16cex="http://schemas.microsoft.com/office/word/2018/wordml/cex" xmlns:w16cid="http://schemas.microsoft.com/office/word/2016/wordml/cid" xmlns:w16="http://schemas.microsoft.com/office/word/2018/wordml" xmlns:w16du="http://schemas.microsoft.com/office/word/2023/wordml/word16du" xmlns:w16sdtdh="http://schemas.microsoft.com/office/word/2020/wordml/sdtdatahash" xmlns:w16se="http://schemas.microsoft.com/office/word/2015/wordml/symex" xmlns:wpg="http://schemas.microsoft.com/office/word/2010/wordprocessingGroup" xmlns:wpi="http://schemas.microsoft.com/office/word/2010/wordprocessingInk" xmlns:wne="http://schemas.microsoft.com/office/word/2006/wordml" xmlns:wps="http://schemas.microsoft.com/office/word/2010/wordprocessingShape" mc:Ignorable="w14 w15 w16se w16cid w16 w16cex w16sdtdh w16du wp14">
-  <w:abstractNum w:abstractNumId="0" w15:restartNumberingAfterBreak="0">
-    <w:nsid w:val="3DB46C11"/>
-    <w:multiLevelType w:val="multilevel"/>
-    <w:tmpl w:val="0ADAA748"/>
+<w:numbering xmlns:w="http://schemas.openxmlformats.org/wordprocessingml/2006/main" xmlns:o="urn:schemas-microsoft-com:office:office" xmlns:r="http://schemas.openxmlformats.org/officeDocument/2006/relationships" xmlns:v="urn:schemas-microsoft-com:vml" xmlns:mc="http://schemas.openxmlformats.org/markup-compatibility/2006" xmlns:w14="http://schemas.microsoft.com/office/word/2010/wordml" mc:Ignorable="w14">
+  <w:abstractNum w:abstractNumId="1">
     <w:lvl w:ilvl="0">
       <w:start w:val="1"/>
       <w:numFmt w:val="lowerLetter"/>
@@ -3353,8 +3536,8 @@
         <w:ind w:left="720" w:hanging="360"/>
       </w:pPr>
       <w:rPr>
+        <w:u w:val="none"/>
         <w:color w:val="000000"/>
-        <w:u w:val="none"/>
       </w:rPr>
     </w:lvl>
     <w:lvl w:ilvl="1">
@@ -3478,10 +3661,7 @@
       </w:rPr>
     </w:lvl>
   </w:abstractNum>
-  <w:abstractNum w:abstractNumId="1" w15:restartNumberingAfterBreak="0">
-    <w:nsid w:val="6FD46D88"/>
-    <w:multiLevelType w:val="multilevel"/>
-    <w:tmpl w:val="9B26A94C"/>
+  <w:abstractNum w:abstractNumId="2">
     <w:lvl w:ilvl="0">
       <w:start w:val="1"/>
       <w:numFmt w:val="none"/>
@@ -3492,7 +3672,7 @@
         <w:tabs>
           <w:tab w:val="num" w:pos="0"/>
         </w:tabs>
-        <w:ind w:left="0" w:firstLine="0"/>
+        <w:ind w:left="0" w:hanging="0"/>
       </w:pPr>
     </w:lvl>
     <w:lvl w:ilvl="1">
@@ -3505,7 +3685,7 @@
         <w:tabs>
           <w:tab w:val="num" w:pos="0"/>
         </w:tabs>
-        <w:ind w:left="0" w:firstLine="0"/>
+        <w:ind w:left="0" w:hanging="0"/>
       </w:pPr>
     </w:lvl>
     <w:lvl w:ilvl="2">
@@ -3518,7 +3698,7 @@
         <w:tabs>
           <w:tab w:val="num" w:pos="0"/>
         </w:tabs>
-        <w:ind w:left="0" w:firstLine="0"/>
+        <w:ind w:left="0" w:hanging="0"/>
       </w:pPr>
     </w:lvl>
     <w:lvl w:ilvl="3">
@@ -3531,7 +3711,7 @@
         <w:tabs>
           <w:tab w:val="num" w:pos="0"/>
         </w:tabs>
-        <w:ind w:left="0" w:firstLine="0"/>
+        <w:ind w:left="0" w:hanging="0"/>
       </w:pPr>
     </w:lvl>
     <w:lvl w:ilvl="4">
@@ -3544,7 +3724,7 @@
         <w:tabs>
           <w:tab w:val="num" w:pos="0"/>
         </w:tabs>
-        <w:ind w:left="0" w:firstLine="0"/>
+        <w:ind w:left="0" w:hanging="0"/>
       </w:pPr>
     </w:lvl>
     <w:lvl w:ilvl="5">
@@ -3557,7 +3737,7 @@
         <w:tabs>
           <w:tab w:val="num" w:pos="0"/>
         </w:tabs>
-        <w:ind w:left="0" w:firstLine="0"/>
+        <w:ind w:left="0" w:hanging="0"/>
       </w:pPr>
     </w:lvl>
     <w:lvl w:ilvl="6">
@@ -3570,7 +3750,7 @@
         <w:tabs>
           <w:tab w:val="num" w:pos="0"/>
         </w:tabs>
-        <w:ind w:left="0" w:firstLine="0"/>
+        <w:ind w:left="0" w:hanging="0"/>
       </w:pPr>
     </w:lvl>
     <w:lvl w:ilvl="7">
@@ -3583,7 +3763,7 @@
         <w:tabs>
           <w:tab w:val="num" w:pos="0"/>
         </w:tabs>
-        <w:ind w:left="0" w:firstLine="0"/>
+        <w:ind w:left="0" w:hanging="0"/>
       </w:pPr>
     </w:lvl>
     <w:lvl w:ilvl="8">
@@ -3596,25 +3776,25 @@
         <w:tabs>
           <w:tab w:val="num" w:pos="0"/>
         </w:tabs>
-        <w:ind w:left="0" w:firstLine="0"/>
+        <w:ind w:left="0" w:hanging="0"/>
       </w:pPr>
     </w:lvl>
   </w:abstractNum>
-  <w:num w:numId="1" w16cid:durableId="1720664090">
-    <w:abstractNumId w:val="0"/>
+  <w:num w:numId="1">
+    <w:abstractNumId w:val="1"/>
   </w:num>
-  <w:num w:numId="2" w16cid:durableId="666595531">
-    <w:abstractNumId w:val="1"/>
+  <w:num w:numId="2">
+    <w:abstractNumId w:val="2"/>
   </w:num>
 </w:numbering>
 </file>
 
 <file path=word/styles.xml><?xml version="1.0" encoding="utf-8"?>
-<w:styles xmlns:mc="http://schemas.openxmlformats.org/markup-compatibility/2006" xmlns:r="http://schemas.openxmlformats.org/officeDocument/2006/relationships" xmlns:w="http://schemas.openxmlformats.org/wordprocessingml/2006/main" xmlns:w14="http://schemas.microsoft.com/office/word/2010/wordml" xmlns:w15="http://schemas.microsoft.com/office/word/2012/wordml" xmlns:w16cex="http://schemas.microsoft.com/office/word/2018/wordml/cex" xmlns:w16cid="http://schemas.microsoft.com/office/word/2016/wordml/cid" xmlns:w16="http://schemas.microsoft.com/office/word/2018/wordml" xmlns:w16du="http://schemas.microsoft.com/office/word/2023/wordml/word16du" xmlns:w16sdtdh="http://schemas.microsoft.com/office/word/2020/wordml/sdtdatahash" xmlns:w16se="http://schemas.microsoft.com/office/word/2015/wordml/symex" mc:Ignorable="w14 w15 w16se w16cid w16 w16cex w16sdtdh w16du">
+<w:styles xmlns:w="http://schemas.openxmlformats.org/wordprocessingml/2006/main" xmlns:w14="http://schemas.microsoft.com/office/word/2010/wordml" xmlns:mc="http://schemas.openxmlformats.org/markup-compatibility/2006" mc:Ignorable="w14">
   <w:docDefaults>
     <w:rPrDefault>
       <w:rPr>
-        <w:rFonts w:asciiTheme="minorHAnsi" w:eastAsiaTheme="minorHAnsi" w:hAnsiTheme="minorHAnsi" w:cstheme="minorBidi"/>
+        <w:rFonts w:ascii="Aptos" w:hAnsi="Aptos" w:eastAsia="Aptos" w:cs="" w:asciiTheme="minorHAnsi" w:cstheme="minorBidi" w:eastAsiaTheme="minorHAnsi" w:hAnsiTheme="minorHAnsi"/>
         <w:kern w:val="2"/>
         <w:sz w:val="22"/>
         <w:szCs w:val="22"/>
@@ -3624,21 +3804,21 @@
     </w:rPrDefault>
     <w:pPrDefault>
       <w:pPr>
-        <w:suppressAutoHyphens/>
+        <w:suppressAutoHyphens w:val="true"/>
       </w:pPr>
     </w:pPrDefault>
   </w:docDefaults>
   <w:latentStyles w:defLockedState="0" w:defUIPriority="99" w:defSemiHidden="0" w:defUnhideWhenUsed="0" w:defQFormat="0" w:count="376">
     <w:lsdException w:name="Normal" w:uiPriority="0" w:qFormat="1"/>
     <w:lsdException w:name="heading 1" w:uiPriority="9" w:qFormat="1"/>
-    <w:lsdException w:name="heading 2" w:semiHidden="1" w:uiPriority="9" w:unhideWhenUsed="1" w:qFormat="1"/>
-    <w:lsdException w:name="heading 3" w:semiHidden="1" w:uiPriority="9" w:unhideWhenUsed="1" w:qFormat="1"/>
-    <w:lsdException w:name="heading 4" w:semiHidden="1" w:uiPriority="9" w:unhideWhenUsed="1" w:qFormat="1"/>
-    <w:lsdException w:name="heading 5" w:semiHidden="1" w:uiPriority="9" w:unhideWhenUsed="1" w:qFormat="1"/>
-    <w:lsdException w:name="heading 6" w:semiHidden="1" w:uiPriority="9" w:unhideWhenUsed="1" w:qFormat="1"/>
-    <w:lsdException w:name="heading 7" w:semiHidden="1" w:uiPriority="9" w:unhideWhenUsed="1" w:qFormat="1"/>
-    <w:lsdException w:name="heading 8" w:semiHidden="1" w:uiPriority="9" w:unhideWhenUsed="1" w:qFormat="1"/>
-    <w:lsdException w:name="heading 9" w:semiHidden="1" w:uiPriority="9" w:unhideWhenUsed="1" w:qFormat="1"/>
+    <w:lsdException w:name="heading 2" w:uiPriority="9" w:semiHidden="1" w:unhideWhenUsed="1" w:qFormat="1"/>
+    <w:lsdException w:name="heading 3" w:uiPriority="9" w:semiHidden="1" w:unhideWhenUsed="1" w:qFormat="1"/>
+    <w:lsdException w:name="heading 4" w:uiPriority="9" w:semiHidden="1" w:unhideWhenUsed="1" w:qFormat="1"/>
+    <w:lsdException w:name="heading 5" w:uiPriority="9" w:semiHidden="1" w:unhideWhenUsed="1" w:qFormat="1"/>
+    <w:lsdException w:name="heading 6" w:uiPriority="9" w:semiHidden="1" w:unhideWhenUsed="1" w:qFormat="1"/>
+    <w:lsdException w:name="heading 7" w:uiPriority="9" w:semiHidden="1" w:unhideWhenUsed="1" w:qFormat="1"/>
+    <w:lsdException w:name="heading 8" w:uiPriority="9" w:semiHidden="1" w:unhideWhenUsed="1" w:qFormat="1"/>
+    <w:lsdException w:name="heading 9" w:uiPriority="9" w:semiHidden="1" w:unhideWhenUsed="1" w:qFormat="1"/>
     <w:lsdException w:name="index 1" w:semiHidden="1" w:unhideWhenUsed="1"/>
     <w:lsdException w:name="index 2" w:semiHidden="1" w:unhideWhenUsed="1"/>
     <w:lsdException w:name="index 3" w:semiHidden="1" w:unhideWhenUsed="1"/>
@@ -3648,22 +3828,22 @@
     <w:lsdException w:name="index 7" w:semiHidden="1" w:unhideWhenUsed="1"/>
     <w:lsdException w:name="index 8" w:semiHidden="1" w:unhideWhenUsed="1"/>
     <w:lsdException w:name="index 9" w:semiHidden="1" w:unhideWhenUsed="1"/>
-    <w:lsdException w:name="toc 1" w:semiHidden="1" w:uiPriority="39" w:unhideWhenUsed="1"/>
-    <w:lsdException w:name="toc 2" w:semiHidden="1" w:uiPriority="39" w:unhideWhenUsed="1"/>
-    <w:lsdException w:name="toc 3" w:semiHidden="1" w:uiPriority="39" w:unhideWhenUsed="1"/>
-    <w:lsdException w:name="toc 4" w:semiHidden="1" w:uiPriority="39" w:unhideWhenUsed="1"/>
-    <w:lsdException w:name="toc 5" w:semiHidden="1" w:uiPriority="39" w:unhideWhenUsed="1"/>
-    <w:lsdException w:name="toc 6" w:semiHidden="1" w:uiPriority="39" w:unhideWhenUsed="1"/>
-    <w:lsdException w:name="toc 7" w:semiHidden="1" w:uiPriority="39" w:unhideWhenUsed="1"/>
-    <w:lsdException w:name="toc 8" w:semiHidden="1" w:uiPriority="39" w:unhideWhenUsed="1"/>
-    <w:lsdException w:name="toc 9" w:semiHidden="1" w:uiPriority="39" w:unhideWhenUsed="1"/>
+    <w:lsdException w:name="toc 1" w:uiPriority="39" w:semiHidden="1" w:unhideWhenUsed="1"/>
+    <w:lsdException w:name="toc 2" w:uiPriority="39" w:semiHidden="1" w:unhideWhenUsed="1"/>
+    <w:lsdException w:name="toc 3" w:uiPriority="39" w:semiHidden="1" w:unhideWhenUsed="1"/>
+    <w:lsdException w:name="toc 4" w:uiPriority="39" w:semiHidden="1" w:unhideWhenUsed="1"/>
+    <w:lsdException w:name="toc 5" w:uiPriority="39" w:semiHidden="1" w:unhideWhenUsed="1"/>
+    <w:lsdException w:name="toc 6" w:uiPriority="39" w:semiHidden="1" w:unhideWhenUsed="1"/>
+    <w:lsdException w:name="toc 7" w:uiPriority="39" w:semiHidden="1" w:unhideWhenUsed="1"/>
+    <w:lsdException w:name="toc 8" w:uiPriority="39" w:semiHidden="1" w:unhideWhenUsed="1"/>
+    <w:lsdException w:name="toc 9" w:uiPriority="39" w:semiHidden="1" w:unhideWhenUsed="1"/>
     <w:lsdException w:name="Normal Indent" w:semiHidden="1" w:unhideWhenUsed="1"/>
     <w:lsdException w:name="footnote text" w:semiHidden="1" w:unhideWhenUsed="1"/>
     <w:lsdException w:name="annotation text" w:semiHidden="1" w:unhideWhenUsed="1"/>
     <w:lsdException w:name="header" w:semiHidden="1" w:unhideWhenUsed="1"/>
     <w:lsdException w:name="footer" w:semiHidden="1" w:unhideWhenUsed="1"/>
     <w:lsdException w:name="index heading" w:semiHidden="1" w:unhideWhenUsed="1"/>
-    <w:lsdException w:name="caption" w:semiHidden="1" w:uiPriority="35" w:unhideWhenUsed="1" w:qFormat="1"/>
+    <w:lsdException w:name="caption" w:uiPriority="35" w:semiHidden="1" w:unhideWhenUsed="1" w:qFormat="1"/>
     <w:lsdException w:name="table of figures" w:semiHidden="1" w:unhideWhenUsed="1"/>
     <w:lsdException w:name="envelope address" w:semiHidden="1" w:unhideWhenUsed="1"/>
     <w:lsdException w:name="envelope return" w:semiHidden="1" w:unhideWhenUsed="1"/>
@@ -3694,7 +3874,7 @@
     <w:lsdException w:name="Title" w:uiPriority="10" w:qFormat="1"/>
     <w:lsdException w:name="Closing" w:semiHidden="1" w:unhideWhenUsed="1"/>
     <w:lsdException w:name="Signature" w:semiHidden="1" w:unhideWhenUsed="1"/>
-    <w:lsdException w:name="Default Paragraph Font" w:semiHidden="1" w:uiPriority="1" w:unhideWhenUsed="1"/>
+    <w:lsdException w:name="Default Paragraph Font" w:uiPriority="1" w:semiHidden="1" w:unhideWhenUsed="1"/>
     <w:lsdException w:name="Body Text" w:semiHidden="1" w:unhideWhenUsed="1"/>
     <w:lsdException w:name="Body Text Indent" w:semiHidden="1" w:unhideWhenUsed="1"/>
     <w:lsdException w:name="List Continue" w:semiHidden="1" w:unhideWhenUsed="1"/>
@@ -3894,8 +4074,8 @@
     <w:lsdException w:name="Subtle Reference" w:uiPriority="31" w:qFormat="1"/>
     <w:lsdException w:name="Intense Reference" w:uiPriority="32" w:qFormat="1"/>
     <w:lsdException w:name="Book Title" w:uiPriority="33" w:qFormat="1"/>
-    <w:lsdException w:name="Bibliography" w:semiHidden="1" w:uiPriority="37" w:unhideWhenUsed="1"/>
-    <w:lsdException w:name="TOC Heading" w:semiHidden="1" w:uiPriority="39" w:unhideWhenUsed="1" w:qFormat="1"/>
+    <w:lsdException w:name="Bibliography" w:uiPriority="37" w:semiHidden="1" w:unhideWhenUsed="1"/>
+    <w:lsdException w:name="TOC Heading" w:uiPriority="39" w:semiHidden="1" w:unhideWhenUsed="1" w:qFormat="1"/>
     <w:lsdException w:name="Plain Table 1" w:uiPriority="41"/>
     <w:lsdException w:name="Plain Table 2" w:uiPriority="42"/>
     <w:lsdException w:name="Plain Table 3" w:uiPriority="43"/>
@@ -4006,41 +4186,50 @@
     <w:lsdException w:name="Unresolved Mention" w:semiHidden="1" w:unhideWhenUsed="1"/>
     <w:lsdException w:name="Smart Link" w:semiHidden="1" w:unhideWhenUsed="1"/>
   </w:latentStyles>
-  <w:style w:type="paragraph" w:default="1" w:styleId="Normal">
+  <w:style w:type="paragraph" w:styleId="Normal" w:default="1">
     <w:name w:val="Normal"/>
     <w:qFormat/>
-    <w:rsid w:val="003622D3"/>
+    <w:rsid w:val="003622d3"/>
+    <w:pPr>
+      <w:widowControl/>
+      <w:suppressAutoHyphens w:val="true"/>
+      <w:bidi w:val="0"/>
+      <w:spacing w:before="0" w:after="0"/>
+      <w:jc w:val="left"/>
+    </w:pPr>
     <w:rPr>
-      <w:rFonts w:ascii="Times New Roman" w:eastAsia="Times New Roman" w:hAnsi="Times New Roman" w:cs="Times New Roman"/>
+      <w:rFonts w:ascii="Times New Roman" w:hAnsi="Times New Roman" w:eastAsia="Times New Roman" w:cs="Times New Roman"/>
+      <w:color w:val="auto"/>
       <w:kern w:val="0"/>
       <w:sz w:val="24"/>
       <w:szCs w:val="24"/>
-      <w:lang w:eastAsia="pt-BR"/>
+      <w:lang w:val="pt-BR" w:eastAsia="pt-BR" w:bidi="ar-SA"/>
+      <w14:ligatures w14:val="standardContextual"/>
     </w:rPr>
   </w:style>
-  <w:style w:type="paragraph" w:styleId="Ttulo1">
-    <w:name w:val="heading 1"/>
+  <w:style w:type="paragraph" w:styleId="Heading1">
+    <w:name w:val="Heading 1"/>
     <w:basedOn w:val="Normal"/>
     <w:next w:val="Normal"/>
     <w:link w:val="Ttulo1Char"/>
     <w:uiPriority w:val="9"/>
     <w:qFormat/>
-    <w:rsid w:val="003F5048"/>
+    <w:rsid w:val="003f5048"/>
     <w:pPr>
-      <w:keepNext/>
+      <w:keepNext w:val="true"/>
       <w:keepLines/>
       <w:spacing w:before="360" w:after="80"/>
       <w:outlineLvl w:val="0"/>
     </w:pPr>
     <w:rPr>
-      <w:rFonts w:asciiTheme="majorHAnsi" w:eastAsiaTheme="majorEastAsia" w:hAnsiTheme="majorHAnsi" w:cstheme="majorBidi"/>
-      <w:color w:val="0F4761" w:themeColor="accent1" w:themeShade="BF"/>
+      <w:rFonts w:ascii="Aptos Display" w:hAnsi="Aptos Display" w:eastAsia="" w:cs="" w:asciiTheme="majorHAnsi" w:cstheme="majorBidi" w:eastAsiaTheme="majorEastAsia" w:hAnsiTheme="majorHAnsi"/>
+      <w:color w:themeColor="accent1" w:themeShade="bf" w:val="0F4761"/>
       <w:sz w:val="40"/>
       <w:szCs w:val="40"/>
     </w:rPr>
   </w:style>
-  <w:style w:type="paragraph" w:styleId="Ttulo2">
-    <w:name w:val="heading 2"/>
+  <w:style w:type="paragraph" w:styleId="Heading2">
+    <w:name w:val="Heading 2"/>
     <w:basedOn w:val="Normal"/>
     <w:next w:val="Normal"/>
     <w:link w:val="Ttulo2Char"/>
@@ -4048,22 +4237,22 @@
     <w:semiHidden/>
     <w:unhideWhenUsed/>
     <w:qFormat/>
-    <w:rsid w:val="003F5048"/>
+    <w:rsid w:val="003f5048"/>
     <w:pPr>
-      <w:keepNext/>
+      <w:keepNext w:val="true"/>
       <w:keepLines/>
       <w:spacing w:before="160" w:after="80"/>
       <w:outlineLvl w:val="1"/>
     </w:pPr>
     <w:rPr>
-      <w:rFonts w:asciiTheme="majorHAnsi" w:eastAsiaTheme="majorEastAsia" w:hAnsiTheme="majorHAnsi" w:cstheme="majorBidi"/>
-      <w:color w:val="0F4761" w:themeColor="accent1" w:themeShade="BF"/>
+      <w:rFonts w:ascii="Aptos Display" w:hAnsi="Aptos Display" w:eastAsia="" w:cs="" w:asciiTheme="majorHAnsi" w:cstheme="majorBidi" w:eastAsiaTheme="majorEastAsia" w:hAnsiTheme="majorHAnsi"/>
+      <w:color w:themeColor="accent1" w:themeShade="bf" w:val="0F4761"/>
       <w:sz w:val="32"/>
       <w:szCs w:val="32"/>
     </w:rPr>
   </w:style>
-  <w:style w:type="paragraph" w:styleId="Ttulo3">
-    <w:name w:val="heading 3"/>
+  <w:style w:type="paragraph" w:styleId="Heading3">
+    <w:name w:val="Heading 3"/>
     <w:basedOn w:val="Normal"/>
     <w:next w:val="Normal"/>
     <w:link w:val="Ttulo3Char"/>
@@ -4071,22 +4260,22 @@
     <w:semiHidden/>
     <w:unhideWhenUsed/>
     <w:qFormat/>
-    <w:rsid w:val="003F5048"/>
+    <w:rsid w:val="003f5048"/>
     <w:pPr>
-      <w:keepNext/>
+      <w:keepNext w:val="true"/>
       <w:keepLines/>
       <w:spacing w:before="160" w:after="80"/>
       <w:outlineLvl w:val="2"/>
     </w:pPr>
     <w:rPr>
-      <w:rFonts w:eastAsiaTheme="majorEastAsia" w:cstheme="majorBidi"/>
-      <w:color w:val="0F4761" w:themeColor="accent1" w:themeShade="BF"/>
+      <w:rFonts w:eastAsia="" w:cs="" w:cstheme="majorBidi" w:eastAsiaTheme="majorEastAsia"/>
+      <w:color w:themeColor="accent1" w:themeShade="bf" w:val="0F4761"/>
       <w:sz w:val="28"/>
       <w:szCs w:val="28"/>
     </w:rPr>
   </w:style>
-  <w:style w:type="paragraph" w:styleId="Ttulo4">
-    <w:name w:val="heading 4"/>
+  <w:style w:type="paragraph" w:styleId="Heading4">
+    <w:name w:val="Heading 4"/>
     <w:basedOn w:val="Normal"/>
     <w:next w:val="Normal"/>
     <w:link w:val="Ttulo4Char"/>
@@ -4094,22 +4283,22 @@
     <w:semiHidden/>
     <w:unhideWhenUsed/>
     <w:qFormat/>
-    <w:rsid w:val="003F5048"/>
+    <w:rsid w:val="003f5048"/>
     <w:pPr>
-      <w:keepNext/>
+      <w:keepNext w:val="true"/>
       <w:keepLines/>
       <w:spacing w:before="80" w:after="40"/>
       <w:outlineLvl w:val="3"/>
     </w:pPr>
     <w:rPr>
-      <w:rFonts w:eastAsiaTheme="majorEastAsia" w:cstheme="majorBidi"/>
+      <w:rFonts w:eastAsia="" w:cs="" w:cstheme="majorBidi" w:eastAsiaTheme="majorEastAsia"/>
       <w:i/>
       <w:iCs/>
-      <w:color w:val="0F4761" w:themeColor="accent1" w:themeShade="BF"/>
+      <w:color w:themeColor="accent1" w:themeShade="bf" w:val="0F4761"/>
     </w:rPr>
   </w:style>
-  <w:style w:type="paragraph" w:styleId="Ttulo5">
-    <w:name w:val="heading 5"/>
+  <w:style w:type="paragraph" w:styleId="Heading5">
+    <w:name w:val="Heading 5"/>
     <w:basedOn w:val="Normal"/>
     <w:next w:val="Normal"/>
     <w:link w:val="Ttulo5Char"/>
@@ -4117,20 +4306,20 @@
     <w:semiHidden/>
     <w:unhideWhenUsed/>
     <w:qFormat/>
-    <w:rsid w:val="003F5048"/>
+    <w:rsid w:val="003f5048"/>
     <w:pPr>
-      <w:keepNext/>
+      <w:keepNext w:val="true"/>
       <w:keepLines/>
       <w:spacing w:before="80" w:after="40"/>
       <w:outlineLvl w:val="4"/>
     </w:pPr>
     <w:rPr>
-      <w:rFonts w:eastAsiaTheme="majorEastAsia" w:cstheme="majorBidi"/>
-      <w:color w:val="0F4761" w:themeColor="accent1" w:themeShade="BF"/>
+      <w:rFonts w:eastAsia="" w:cs="" w:cstheme="majorBidi" w:eastAsiaTheme="majorEastAsia"/>
+      <w:color w:themeColor="accent1" w:themeShade="bf" w:val="0F4761"/>
     </w:rPr>
   </w:style>
-  <w:style w:type="paragraph" w:styleId="Ttulo6">
-    <w:name w:val="heading 6"/>
+  <w:style w:type="paragraph" w:styleId="Heading6">
+    <w:name w:val="Heading 6"/>
     <w:basedOn w:val="Normal"/>
     <w:next w:val="Normal"/>
     <w:link w:val="Ttulo6Char"/>
@@ -4138,22 +4327,22 @@
     <w:semiHidden/>
     <w:unhideWhenUsed/>
     <w:qFormat/>
-    <w:rsid w:val="003F5048"/>
+    <w:rsid w:val="003f5048"/>
     <w:pPr>
-      <w:keepNext/>
+      <w:keepNext w:val="true"/>
       <w:keepLines/>
-      <w:spacing w:before="40"/>
+      <w:spacing w:before="40" w:after="0"/>
       <w:outlineLvl w:val="5"/>
     </w:pPr>
     <w:rPr>
-      <w:rFonts w:eastAsiaTheme="majorEastAsia" w:cstheme="majorBidi"/>
+      <w:rFonts w:eastAsia="" w:cs="" w:cstheme="majorBidi" w:eastAsiaTheme="majorEastAsia"/>
       <w:i/>
       <w:iCs/>
-      <w:color w:val="595959" w:themeColor="text1" w:themeTint="A6"/>
+      <w:color w:themeColor="text1" w:themeTint="a6" w:val="595959"/>
     </w:rPr>
   </w:style>
-  <w:style w:type="paragraph" w:styleId="Ttulo7">
-    <w:name w:val="heading 7"/>
+  <w:style w:type="paragraph" w:styleId="Heading7">
+    <w:name w:val="Heading 7"/>
     <w:basedOn w:val="Normal"/>
     <w:next w:val="Normal"/>
     <w:link w:val="Ttulo7Char"/>
@@ -4161,20 +4350,20 @@
     <w:semiHidden/>
     <w:unhideWhenUsed/>
     <w:qFormat/>
-    <w:rsid w:val="003F5048"/>
+    <w:rsid w:val="003f5048"/>
     <w:pPr>
-      <w:keepNext/>
+      <w:keepNext w:val="true"/>
       <w:keepLines/>
-      <w:spacing w:before="40"/>
+      <w:spacing w:before="40" w:after="0"/>
       <w:outlineLvl w:val="6"/>
     </w:pPr>
     <w:rPr>
-      <w:rFonts w:eastAsiaTheme="majorEastAsia" w:cstheme="majorBidi"/>
-      <w:color w:val="595959" w:themeColor="text1" w:themeTint="A6"/>
+      <w:rFonts w:eastAsia="" w:cs="" w:cstheme="majorBidi" w:eastAsiaTheme="majorEastAsia"/>
+      <w:color w:themeColor="text1" w:themeTint="a6" w:val="595959"/>
     </w:rPr>
   </w:style>
-  <w:style w:type="paragraph" w:styleId="Ttulo8">
-    <w:name w:val="heading 8"/>
+  <w:style w:type="paragraph" w:styleId="Heading8">
+    <w:name w:val="Heading 8"/>
     <w:basedOn w:val="Normal"/>
     <w:next w:val="Normal"/>
     <w:link w:val="Ttulo8Char"/>
@@ -4182,21 +4371,21 @@
     <w:semiHidden/>
     <w:unhideWhenUsed/>
     <w:qFormat/>
-    <w:rsid w:val="003F5048"/>
+    <w:rsid w:val="003f5048"/>
     <w:pPr>
-      <w:keepNext/>
+      <w:keepNext w:val="true"/>
       <w:keepLines/>
       <w:outlineLvl w:val="7"/>
     </w:pPr>
     <w:rPr>
-      <w:rFonts w:eastAsiaTheme="majorEastAsia" w:cstheme="majorBidi"/>
+      <w:rFonts w:eastAsia="" w:cs="" w:cstheme="majorBidi" w:eastAsiaTheme="majorEastAsia"/>
       <w:i/>
       <w:iCs/>
-      <w:color w:val="272727" w:themeColor="text1" w:themeTint="D8"/>
+      <w:color w:themeColor="text1" w:themeTint="d8" w:val="272727"/>
     </w:rPr>
   </w:style>
-  <w:style w:type="paragraph" w:styleId="Ttulo9">
-    <w:name w:val="heading 9"/>
+  <w:style w:type="paragraph" w:styleId="Heading9">
+    <w:name w:val="Heading 9"/>
     <w:basedOn w:val="Normal"/>
     <w:next w:val="Normal"/>
     <w:link w:val="Ttulo9Char"/>
@@ -4204,290 +4393,304 @@
     <w:semiHidden/>
     <w:unhideWhenUsed/>
     <w:qFormat/>
-    <w:rsid w:val="003F5048"/>
+    <w:rsid w:val="003f5048"/>
     <w:pPr>
-      <w:keepNext/>
+      <w:keepNext w:val="true"/>
       <w:keepLines/>
       <w:outlineLvl w:val="8"/>
     </w:pPr>
     <w:rPr>
-      <w:rFonts w:eastAsiaTheme="majorEastAsia" w:cstheme="majorBidi"/>
-      <w:color w:val="272727" w:themeColor="text1" w:themeTint="D8"/>
+      <w:rFonts w:eastAsia="" w:cs="" w:cstheme="majorBidi" w:eastAsiaTheme="majorEastAsia"/>
+      <w:color w:themeColor="text1" w:themeTint="d8" w:val="272727"/>
     </w:rPr>
   </w:style>
-  <w:style w:type="character" w:default="1" w:styleId="Fontepargpadro">
+  <w:style w:type="character" w:styleId="DefaultParagraphFont" w:default="1">
     <w:name w:val="Default Paragraph Font"/>
     <w:uiPriority w:val="1"/>
     <w:semiHidden/>
     <w:unhideWhenUsed/>
+    <w:qFormat/>
+    <w:rPr/>
   </w:style>
-  <w:style w:type="table" w:default="1" w:styleId="Tabelanormal">
-    <w:name w:val="Normal Table"/>
-    <w:uiPriority w:val="99"/>
-    <w:semiHidden/>
-    <w:unhideWhenUsed/>
-    <w:tblPr>
-      <w:tblInd w:w="0" w:type="dxa"/>
-      <w:tblCellMar>
-        <w:top w:w="0" w:type="dxa"/>
-        <w:left w:w="108" w:type="dxa"/>
-        <w:bottom w:w="0" w:type="dxa"/>
-        <w:right w:w="108" w:type="dxa"/>
-      </w:tblCellMar>
-    </w:tblPr>
-  </w:style>
-  <w:style w:type="numbering" w:default="1" w:styleId="Semlista">
-    <w:name w:val="No List"/>
-    <w:uiPriority w:val="99"/>
-    <w:semiHidden/>
-    <w:unhideWhenUsed/>
-  </w:style>
-  <w:style w:type="character" w:customStyle="1" w:styleId="Ttulo1Char">
+  <w:style w:type="character" w:styleId="Ttulo1Char" w:customStyle="1">
     <w:name w:val="Título 1 Char"/>
-    <w:basedOn w:val="Fontepargpadro"/>
-    <w:link w:val="Ttulo1"/>
+    <w:basedOn w:val="DefaultParagraphFont"/>
     <w:uiPriority w:val="9"/>
     <w:qFormat/>
-    <w:rsid w:val="003F5048"/>
+    <w:rsid w:val="003f5048"/>
     <w:rPr>
-      <w:rFonts w:asciiTheme="majorHAnsi" w:eastAsiaTheme="majorEastAsia" w:hAnsiTheme="majorHAnsi" w:cstheme="majorBidi"/>
-      <w:color w:val="0F4761" w:themeColor="accent1" w:themeShade="BF"/>
+      <w:rFonts w:ascii="Aptos Display" w:hAnsi="Aptos Display" w:eastAsia="" w:cs="" w:asciiTheme="majorHAnsi" w:cstheme="majorBidi" w:eastAsiaTheme="majorEastAsia" w:hAnsiTheme="majorHAnsi"/>
+      <w:color w:themeColor="accent1" w:themeShade="bf" w:val="0F4761"/>
       <w:sz w:val="40"/>
       <w:szCs w:val="40"/>
     </w:rPr>
   </w:style>
-  <w:style w:type="character" w:customStyle="1" w:styleId="Ttulo2Char">
+  <w:style w:type="character" w:styleId="Ttulo2Char" w:customStyle="1">
     <w:name w:val="Título 2 Char"/>
-    <w:basedOn w:val="Fontepargpadro"/>
-    <w:link w:val="Ttulo2"/>
+    <w:basedOn w:val="DefaultParagraphFont"/>
     <w:uiPriority w:val="9"/>
     <w:semiHidden/>
     <w:qFormat/>
-    <w:rsid w:val="003F5048"/>
+    <w:rsid w:val="003f5048"/>
     <w:rPr>
-      <w:rFonts w:asciiTheme="majorHAnsi" w:eastAsiaTheme="majorEastAsia" w:hAnsiTheme="majorHAnsi" w:cstheme="majorBidi"/>
-      <w:color w:val="0F4761" w:themeColor="accent1" w:themeShade="BF"/>
+      <w:rFonts w:ascii="Aptos Display" w:hAnsi="Aptos Display" w:eastAsia="" w:cs="" w:asciiTheme="majorHAnsi" w:cstheme="majorBidi" w:eastAsiaTheme="majorEastAsia" w:hAnsiTheme="majorHAnsi"/>
+      <w:color w:themeColor="accent1" w:themeShade="bf" w:val="0F4761"/>
       <w:sz w:val="32"/>
       <w:szCs w:val="32"/>
     </w:rPr>
   </w:style>
-  <w:style w:type="character" w:customStyle="1" w:styleId="Ttulo3Char">
+  <w:style w:type="character" w:styleId="Ttulo3Char" w:customStyle="1">
     <w:name w:val="Título 3 Char"/>
-    <w:basedOn w:val="Fontepargpadro"/>
-    <w:link w:val="Ttulo3"/>
+    <w:basedOn w:val="DefaultParagraphFont"/>
     <w:uiPriority w:val="9"/>
     <w:semiHidden/>
     <w:qFormat/>
-    <w:rsid w:val="003F5048"/>
+    <w:rsid w:val="003f5048"/>
     <w:rPr>
-      <w:rFonts w:eastAsiaTheme="majorEastAsia" w:cstheme="majorBidi"/>
-      <w:color w:val="0F4761" w:themeColor="accent1" w:themeShade="BF"/>
+      <w:rFonts w:eastAsia="" w:cs="" w:cstheme="majorBidi" w:eastAsiaTheme="majorEastAsia"/>
+      <w:color w:themeColor="accent1" w:themeShade="bf" w:val="0F4761"/>
       <w:sz w:val="28"/>
       <w:szCs w:val="28"/>
     </w:rPr>
   </w:style>
-  <w:style w:type="character" w:customStyle="1" w:styleId="Ttulo4Char">
+  <w:style w:type="character" w:styleId="Ttulo4Char" w:customStyle="1">
     <w:name w:val="Título 4 Char"/>
-    <w:basedOn w:val="Fontepargpadro"/>
-    <w:link w:val="Ttulo4"/>
+    <w:basedOn w:val="DefaultParagraphFont"/>
     <w:uiPriority w:val="9"/>
     <w:semiHidden/>
     <w:qFormat/>
-    <w:rsid w:val="003F5048"/>
+    <w:rsid w:val="003f5048"/>
     <w:rPr>
-      <w:rFonts w:eastAsiaTheme="majorEastAsia" w:cstheme="majorBidi"/>
+      <w:rFonts w:eastAsia="" w:cs="" w:cstheme="majorBidi" w:eastAsiaTheme="majorEastAsia"/>
       <w:i/>
       <w:iCs/>
-      <w:color w:val="0F4761" w:themeColor="accent1" w:themeShade="BF"/>
+      <w:color w:themeColor="accent1" w:themeShade="bf" w:val="0F4761"/>
     </w:rPr>
   </w:style>
-  <w:style w:type="character" w:customStyle="1" w:styleId="Ttulo5Char">
+  <w:style w:type="character" w:styleId="Ttulo5Char" w:customStyle="1">
     <w:name w:val="Título 5 Char"/>
-    <w:basedOn w:val="Fontepargpadro"/>
-    <w:link w:val="Ttulo5"/>
+    <w:basedOn w:val="DefaultParagraphFont"/>
     <w:uiPriority w:val="9"/>
     <w:semiHidden/>
     <w:qFormat/>
-    <w:rsid w:val="003F5048"/>
+    <w:rsid w:val="003f5048"/>
     <w:rPr>
-      <w:rFonts w:eastAsiaTheme="majorEastAsia" w:cstheme="majorBidi"/>
-      <w:color w:val="0F4761" w:themeColor="accent1" w:themeShade="BF"/>
+      <w:rFonts w:eastAsia="" w:cs="" w:cstheme="majorBidi" w:eastAsiaTheme="majorEastAsia"/>
+      <w:color w:themeColor="accent1" w:themeShade="bf" w:val="0F4761"/>
     </w:rPr>
   </w:style>
-  <w:style w:type="character" w:customStyle="1" w:styleId="Ttulo6Char">
+  <w:style w:type="character" w:styleId="Ttulo6Char" w:customStyle="1">
     <w:name w:val="Título 6 Char"/>
-    <w:basedOn w:val="Fontepargpadro"/>
-    <w:link w:val="Ttulo6"/>
+    <w:basedOn w:val="DefaultParagraphFont"/>
     <w:uiPriority w:val="9"/>
     <w:semiHidden/>
     <w:qFormat/>
-    <w:rsid w:val="003F5048"/>
+    <w:rsid w:val="003f5048"/>
     <w:rPr>
-      <w:rFonts w:eastAsiaTheme="majorEastAsia" w:cstheme="majorBidi"/>
+      <w:rFonts w:eastAsia="" w:cs="" w:cstheme="majorBidi" w:eastAsiaTheme="majorEastAsia"/>
       <w:i/>
       <w:iCs/>
-      <w:color w:val="595959" w:themeColor="text1" w:themeTint="A6"/>
+      <w:color w:themeColor="text1" w:themeTint="a6" w:val="595959"/>
     </w:rPr>
   </w:style>
-  <w:style w:type="character" w:customStyle="1" w:styleId="Ttulo7Char">
+  <w:style w:type="character" w:styleId="Ttulo7Char" w:customStyle="1">
     <w:name w:val="Título 7 Char"/>
-    <w:basedOn w:val="Fontepargpadro"/>
-    <w:link w:val="Ttulo7"/>
+    <w:basedOn w:val="DefaultParagraphFont"/>
     <w:uiPriority w:val="9"/>
     <w:semiHidden/>
     <w:qFormat/>
-    <w:rsid w:val="003F5048"/>
+    <w:rsid w:val="003f5048"/>
     <w:rPr>
-      <w:rFonts w:eastAsiaTheme="majorEastAsia" w:cstheme="majorBidi"/>
-      <w:color w:val="595959" w:themeColor="text1" w:themeTint="A6"/>
+      <w:rFonts w:eastAsia="" w:cs="" w:cstheme="majorBidi" w:eastAsiaTheme="majorEastAsia"/>
+      <w:color w:themeColor="text1" w:themeTint="a6" w:val="595959"/>
     </w:rPr>
   </w:style>
-  <w:style w:type="character" w:customStyle="1" w:styleId="Ttulo8Char">
+  <w:style w:type="character" w:styleId="Ttulo8Char" w:customStyle="1">
     <w:name w:val="Título 8 Char"/>
-    <w:basedOn w:val="Fontepargpadro"/>
-    <w:link w:val="Ttulo8"/>
+    <w:basedOn w:val="DefaultParagraphFont"/>
     <w:uiPriority w:val="9"/>
     <w:semiHidden/>
     <w:qFormat/>
-    <w:rsid w:val="003F5048"/>
+    <w:rsid w:val="003f5048"/>
     <w:rPr>
-      <w:rFonts w:eastAsiaTheme="majorEastAsia" w:cstheme="majorBidi"/>
+      <w:rFonts w:eastAsia="" w:cs="" w:cstheme="majorBidi" w:eastAsiaTheme="majorEastAsia"/>
       <w:i/>
       <w:iCs/>
-      <w:color w:val="272727" w:themeColor="text1" w:themeTint="D8"/>
+      <w:color w:themeColor="text1" w:themeTint="d8" w:val="272727"/>
     </w:rPr>
   </w:style>
-  <w:style w:type="character" w:customStyle="1" w:styleId="Ttulo9Char">
+  <w:style w:type="character" w:styleId="Ttulo9Char" w:customStyle="1">
     <w:name w:val="Título 9 Char"/>
-    <w:basedOn w:val="Fontepargpadro"/>
-    <w:link w:val="Ttulo9"/>
+    <w:basedOn w:val="DefaultParagraphFont"/>
     <w:uiPriority w:val="9"/>
     <w:semiHidden/>
     <w:qFormat/>
-    <w:rsid w:val="003F5048"/>
+    <w:rsid w:val="003f5048"/>
     <w:rPr>
-      <w:rFonts w:eastAsiaTheme="majorEastAsia" w:cstheme="majorBidi"/>
-      <w:color w:val="272727" w:themeColor="text1" w:themeTint="D8"/>
+      <w:rFonts w:eastAsia="" w:cs="" w:cstheme="majorBidi" w:eastAsiaTheme="majorEastAsia"/>
+      <w:color w:themeColor="text1" w:themeTint="d8" w:val="272727"/>
     </w:rPr>
   </w:style>
-  <w:style w:type="character" w:customStyle="1" w:styleId="TtuloChar">
+  <w:style w:type="character" w:styleId="TtuloChar" w:customStyle="1">
     <w:name w:val="Título Char"/>
-    <w:basedOn w:val="Fontepargpadro"/>
-    <w:link w:val="Ttulo"/>
+    <w:basedOn w:val="DefaultParagraphFont"/>
     <w:uiPriority w:val="10"/>
     <w:qFormat/>
-    <w:rsid w:val="003F5048"/>
+    <w:rsid w:val="003f5048"/>
     <w:rPr>
-      <w:rFonts w:asciiTheme="majorHAnsi" w:eastAsiaTheme="majorEastAsia" w:hAnsiTheme="majorHAnsi" w:cstheme="majorBidi"/>
+      <w:rFonts w:ascii="Aptos Display" w:hAnsi="Aptos Display" w:eastAsia="" w:cs="" w:asciiTheme="majorHAnsi" w:cstheme="majorBidi" w:eastAsiaTheme="majorEastAsia" w:hAnsiTheme="majorHAnsi"/>
       <w:spacing w:val="-10"/>
       <w:kern w:val="2"/>
       <w:sz w:val="56"/>
       <w:szCs w:val="56"/>
     </w:rPr>
   </w:style>
-  <w:style w:type="character" w:customStyle="1" w:styleId="SubttuloChar">
+  <w:style w:type="character" w:styleId="SubttuloChar" w:customStyle="1">
     <w:name w:val="Subtítulo Char"/>
-    <w:basedOn w:val="Fontepargpadro"/>
-    <w:link w:val="Subttulo"/>
+    <w:basedOn w:val="DefaultParagraphFont"/>
     <w:uiPriority w:val="11"/>
     <w:qFormat/>
-    <w:rsid w:val="003F5048"/>
+    <w:rsid w:val="003f5048"/>
     <w:rPr>
-      <w:rFonts w:eastAsiaTheme="majorEastAsia" w:cstheme="majorBidi"/>
-      <w:color w:val="595959" w:themeColor="text1" w:themeTint="A6"/>
+      <w:rFonts w:eastAsia="" w:cs="" w:cstheme="majorBidi" w:eastAsiaTheme="majorEastAsia"/>
+      <w:color w:themeColor="text1" w:themeTint="a6" w:val="595959"/>
       <w:spacing w:val="15"/>
       <w:sz w:val="28"/>
       <w:szCs w:val="28"/>
     </w:rPr>
   </w:style>
-  <w:style w:type="character" w:customStyle="1" w:styleId="CitaoChar">
+  <w:style w:type="character" w:styleId="CitaoChar" w:customStyle="1">
     <w:name w:val="Citação Char"/>
-    <w:basedOn w:val="Fontepargpadro"/>
-    <w:link w:val="Citao"/>
+    <w:basedOn w:val="DefaultParagraphFont"/>
+    <w:link w:val="Quote"/>
     <w:uiPriority w:val="29"/>
     <w:qFormat/>
-    <w:rsid w:val="003F5048"/>
+    <w:rsid w:val="003f5048"/>
     <w:rPr>
       <w:i/>
       <w:iCs/>
-      <w:color w:val="404040" w:themeColor="text1" w:themeTint="BF"/>
+      <w:color w:themeColor="text1" w:themeTint="bf" w:val="404040"/>
     </w:rPr>
   </w:style>
-  <w:style w:type="character" w:styleId="nfaseIntensa">
+  <w:style w:type="character" w:styleId="IntenseEmphasis">
     <w:name w:val="Intense Emphasis"/>
-    <w:basedOn w:val="Fontepargpadro"/>
+    <w:basedOn w:val="DefaultParagraphFont"/>
     <w:uiPriority w:val="21"/>
     <w:qFormat/>
-    <w:rsid w:val="003F5048"/>
+    <w:rsid w:val="003f5048"/>
     <w:rPr>
       <w:i/>
       <w:iCs/>
-      <w:color w:val="0F4761" w:themeColor="accent1" w:themeShade="BF"/>
+      <w:color w:themeColor="accent1" w:themeShade="bf" w:val="0F4761"/>
     </w:rPr>
   </w:style>
-  <w:style w:type="character" w:customStyle="1" w:styleId="CitaoIntensaChar">
+  <w:style w:type="character" w:styleId="CitaoIntensaChar" w:customStyle="1">
     <w:name w:val="Citação Intensa Char"/>
-    <w:basedOn w:val="Fontepargpadro"/>
-    <w:link w:val="CitaoIntensa"/>
+    <w:basedOn w:val="DefaultParagraphFont"/>
+    <w:link w:val="IntenseQuote"/>
     <w:uiPriority w:val="30"/>
     <w:qFormat/>
-    <w:rsid w:val="003F5048"/>
+    <w:rsid w:val="003f5048"/>
     <w:rPr>
       <w:i/>
       <w:iCs/>
-      <w:color w:val="0F4761" w:themeColor="accent1" w:themeShade="BF"/>
+      <w:color w:themeColor="accent1" w:themeShade="bf" w:val="0F4761"/>
     </w:rPr>
   </w:style>
-  <w:style w:type="character" w:styleId="RefernciaIntensa">
+  <w:style w:type="character" w:styleId="IntenseReference">
     <w:name w:val="Intense Reference"/>
-    <w:basedOn w:val="Fontepargpadro"/>
+    <w:basedOn w:val="DefaultParagraphFont"/>
     <w:uiPriority w:val="32"/>
     <w:qFormat/>
-    <w:rsid w:val="003F5048"/>
+    <w:rsid w:val="003f5048"/>
     <w:rPr>
       <w:b/>
       <w:bCs/>
       <w:smallCaps/>
-      <w:color w:val="0F4761" w:themeColor="accent1" w:themeShade="BF"/>
+      <w:color w:themeColor="accent1" w:themeShade="bf" w:val="0F4761"/>
       <w:spacing w:val="5"/>
     </w:rPr>
   </w:style>
   <w:style w:type="paragraph" w:styleId="Ttulo">
+    <w:name w:val="Título"/>
+    <w:basedOn w:val="Normal"/>
+    <w:next w:val="BodyText"/>
+    <w:qFormat/>
+    <w:pPr>
+      <w:keepNext w:val="true"/>
+      <w:spacing w:before="240" w:after="120"/>
+    </w:pPr>
+    <w:rPr>
+      <w:rFonts w:ascii="Liberation Sans" w:hAnsi="Liberation Sans" w:eastAsia="Microsoft YaHei" w:cs="Arial"/>
+      <w:sz w:val="28"/>
+      <w:szCs w:val="28"/>
+    </w:rPr>
+  </w:style>
+  <w:style w:type="paragraph" w:styleId="BodyText">
+    <w:name w:val="Body Text"/>
+    <w:basedOn w:val="Normal"/>
+    <w:pPr>
+      <w:spacing w:lineRule="auto" w:line="276" w:before="0" w:after="140"/>
+    </w:pPr>
+    <w:rPr/>
+  </w:style>
+  <w:style w:type="paragraph" w:styleId="List">
+    <w:name w:val="List"/>
+    <w:basedOn w:val="BodyText"/>
+    <w:pPr/>
+    <w:rPr>
+      <w:rFonts w:cs="Lucida Sans"/>
+    </w:rPr>
+  </w:style>
+  <w:style w:type="paragraph" w:styleId="Caption">
+    <w:name w:val="Caption"/>
+    <w:basedOn w:val="Normal"/>
+    <w:qFormat/>
+    <w:pPr>
+      <w:suppressLineNumbers/>
+      <w:spacing w:before="120" w:after="120"/>
+    </w:pPr>
+    <w:rPr>
+      <w:rFonts w:cs="Arial"/>
+      <w:i/>
+      <w:iCs/>
+      <w:sz w:val="24"/>
+      <w:szCs w:val="24"/>
+    </w:rPr>
+  </w:style>
+  <w:style w:type="paragraph" w:styleId="Ndice" w:customStyle="1">
+    <w:name w:val="Índice"/>
+    <w:basedOn w:val="Normal"/>
+    <w:qFormat/>
+    <w:pPr>
+      <w:suppressLineNumbers/>
+    </w:pPr>
+    <w:rPr>
+      <w:rFonts w:cs="Lucida Sans"/>
+    </w:rPr>
+  </w:style>
+  <w:style w:type="paragraph" w:styleId="Title">
     <w:name w:val="Title"/>
     <w:basedOn w:val="Normal"/>
-    <w:next w:val="Corpodetexto"/>
+    <w:next w:val="BodyText"/>
     <w:link w:val="TtuloChar"/>
     <w:uiPriority w:val="10"/>
     <w:qFormat/>
-    <w:rsid w:val="003F5048"/>
+    <w:rsid w:val="003f5048"/>
     <w:pPr>
-      <w:spacing w:after="80"/>
+      <w:spacing w:before="0" w:after="80"/>
       <w:contextualSpacing/>
     </w:pPr>
     <w:rPr>
-      <w:rFonts w:asciiTheme="majorHAnsi" w:eastAsiaTheme="majorEastAsia" w:hAnsiTheme="majorHAnsi" w:cstheme="majorBidi"/>
+      <w:rFonts w:ascii="Aptos Display" w:hAnsi="Aptos Display" w:eastAsia="" w:cs="" w:asciiTheme="majorHAnsi" w:cstheme="majorBidi" w:eastAsiaTheme="majorEastAsia" w:hAnsiTheme="majorHAnsi"/>
       <w:spacing w:val="-10"/>
       <w:kern w:val="2"/>
       <w:sz w:val="56"/>
       <w:szCs w:val="56"/>
     </w:rPr>
   </w:style>
-  <w:style w:type="paragraph" w:styleId="Corpodetexto">
-    <w:name w:val="Body Text"/>
-    <w:basedOn w:val="Normal"/>
-    <w:pPr>
-      <w:spacing w:after="140" w:line="276" w:lineRule="auto"/>
-    </w:pPr>
-  </w:style>
-  <w:style w:type="paragraph" w:styleId="Lista">
-    <w:name w:val="List"/>
-    <w:basedOn w:val="Corpodetexto"/>
-    <w:rPr>
-      <w:rFonts w:cs="Lucida Sans"/>
-    </w:rPr>
-  </w:style>
-  <w:style w:type="paragraph" w:styleId="Legenda">
-    <w:name w:val="caption"/>
+  <w:style w:type="paragraph" w:styleId="Caption1">
+    <w:name w:val="caption1"/>
     <w:basedOn w:val="Normal"/>
     <w:qFormat/>
     <w:pPr>
@@ -4500,74 +4703,66 @@
       <w:iCs/>
     </w:rPr>
   </w:style>
-  <w:style w:type="paragraph" w:customStyle="1" w:styleId="ndice">
-    <w:name w:val="Índice"/>
-    <w:basedOn w:val="Normal"/>
-    <w:qFormat/>
-    <w:pPr>
-      <w:suppressLineNumbers/>
-    </w:pPr>
-    <w:rPr>
-      <w:rFonts w:cs="Lucida Sans"/>
-    </w:rPr>
-  </w:style>
-  <w:style w:type="paragraph" w:styleId="Subttulo">
+  <w:style w:type="paragraph" w:styleId="Subtitle">
     <w:name w:val="Subtitle"/>
     <w:basedOn w:val="Normal"/>
     <w:next w:val="Normal"/>
     <w:link w:val="SubttuloChar"/>
     <w:uiPriority w:val="11"/>
     <w:qFormat/>
-    <w:rsid w:val="003F5048"/>
+    <w:rsid w:val="003f5048"/>
+    <w:pPr/>
     <w:rPr>
-      <w:rFonts w:eastAsiaTheme="majorEastAsia" w:cstheme="majorBidi"/>
-      <w:color w:val="595959" w:themeColor="text1" w:themeTint="A6"/>
+      <w:rFonts w:eastAsia="" w:cs="" w:cstheme="majorBidi" w:eastAsiaTheme="majorEastAsia"/>
+      <w:color w:themeColor="text1" w:themeTint="a6" w:val="595959"/>
       <w:spacing w:val="15"/>
       <w:sz w:val="28"/>
       <w:szCs w:val="28"/>
     </w:rPr>
   </w:style>
-  <w:style w:type="paragraph" w:styleId="Citao">
+  <w:style w:type="paragraph" w:styleId="Quote">
     <w:name w:val="Quote"/>
     <w:basedOn w:val="Normal"/>
     <w:next w:val="Normal"/>
     <w:link w:val="CitaoChar"/>
     <w:uiPriority w:val="29"/>
     <w:qFormat/>
-    <w:rsid w:val="003F5048"/>
+    <w:rsid w:val="003f5048"/>
     <w:pPr>
-      <w:spacing w:before="160"/>
+      <w:spacing w:before="160" w:after="0"/>
       <w:jc w:val="center"/>
     </w:pPr>
     <w:rPr>
       <w:i/>
       <w:iCs/>
-      <w:color w:val="404040" w:themeColor="text1" w:themeTint="BF"/>
+      <w:color w:themeColor="text1" w:themeTint="bf" w:val="404040"/>
     </w:rPr>
   </w:style>
-  <w:style w:type="paragraph" w:styleId="PargrafodaLista">
+  <w:style w:type="paragraph" w:styleId="ListParagraph">
     <w:name w:val="List Paragraph"/>
     <w:basedOn w:val="Normal"/>
     <w:uiPriority w:val="34"/>
     <w:qFormat/>
-    <w:rsid w:val="003F5048"/>
+    <w:rsid w:val="003f5048"/>
     <w:pPr>
+      <w:spacing w:before="0" w:after="0"/>
       <w:ind w:left="720"/>
       <w:contextualSpacing/>
     </w:pPr>
+    <w:rPr/>
   </w:style>
-  <w:style w:type="paragraph" w:styleId="CitaoIntensa">
+  <w:style w:type="paragraph" w:styleId="IntenseQuote">
     <w:name w:val="Intense Quote"/>
     <w:basedOn w:val="Normal"/>
     <w:next w:val="Normal"/>
     <w:link w:val="CitaoIntensaChar"/>
     <w:uiPriority w:val="30"/>
     <w:qFormat/>
-    <w:rsid w:val="003F5048"/>
+    <w:rsid w:val="003f5048"/>
     <w:pPr>
       <w:pBdr>
-        <w:top w:val="single" w:sz="4" w:space="10" w:color="0F4761" w:themeColor="accent1" w:themeShade="BF"/>
-        <w:bottom w:val="single" w:sz="4" w:space="10" w:color="0F4761" w:themeColor="accent1" w:themeShade="BF"/>
+        <w:top w:val="single" w:sz="4" w:space="10" w:color="0F4761" w:themeColor="accent1" w:themeShade="bf"/>
+        <w:bottom w:val="single" w:sz="4" w:space="10" w:color="0F4761" w:themeColor="accent1" w:themeShade="bf"/>
       </w:pBdr>
       <w:spacing w:before="360" w:after="360"/>
       <w:ind w:left="864" w:right="864"/>
@@ -4576,61 +4771,82 @@
     <w:rPr>
       <w:i/>
       <w:iCs/>
-      <w:color w:val="0F4761" w:themeColor="accent1" w:themeShade="BF"/>
+      <w:color w:themeColor="accent1" w:themeShade="bf" w:val="0F4761"/>
     </w:rPr>
+  </w:style>
+  <w:style w:type="numbering" w:styleId="NoList" w:default="1">
+    <w:name w:val="No List"/>
+    <w:uiPriority w:val="99"/>
+    <w:semiHidden/>
+    <w:unhideWhenUsed/>
+    <w:qFormat/>
+  </w:style>
+  <w:style w:type="table" w:default="1" w:styleId="Tabelanormal">
+    <w:name w:val="Normal Table"/>
+    <w:uiPriority w:val="99"/>
+    <w:semiHidden/>
+    <w:unhideWhenUsed/>
+    <w:tblPr>
+      <w:tblCellMar>
+        <w:top w:w="0" w:type="dxa"/>
+        <w:left w:w="108" w:type="dxa"/>
+        <w:bottom w:w="0" w:type="dxa"/>
+        <w:right w:w="108" w:type="dxa"/>
+      </w:tblCellMar>
+    </w:tblPr>
   </w:style>
 </w:styles>
 </file>
 
 <file path=word/theme/theme1.xml><?xml version="1.0" encoding="utf-8"?>
-<a:theme xmlns:a="http://schemas.openxmlformats.org/drawingml/2006/main" name="Tema do Office">
+<a:theme xmlns:a="http://schemas.openxmlformats.org/drawingml/2006/main" xmlns:r="http://schemas.openxmlformats.org/officeDocument/2006/relationships" name="Tema do Office">
   <a:themeElements>
     <a:clrScheme name="Office">
       <a:dk1>
         <a:srgbClr val="000000"/>
       </a:dk1>
       <a:lt1>
-        <a:srgbClr val="FFFFFF"/>
+        <a:srgbClr val="ffffff"/>
       </a:lt1>
       <a:dk2>
-        <a:srgbClr val="0E2841"/>
+        <a:srgbClr val="0e2841"/>
       </a:dk2>
       <a:lt2>
-        <a:srgbClr val="E8E8E8"/>
+        <a:srgbClr val="e8e8e8"/>
       </a:lt2>
       <a:accent1>
         <a:srgbClr val="156082"/>
       </a:accent1>
       <a:accent2>
-        <a:srgbClr val="E97132"/>
+        <a:srgbClr val="e97132"/>
       </a:accent2>
       <a:accent3>
-        <a:srgbClr val="196B24"/>
+        <a:srgbClr val="196b24"/>
       </a:accent3>
       <a:accent4>
-        <a:srgbClr val="0F9ED5"/>
+        <a:srgbClr val="0f9ed5"/>
       </a:accent4>
       <a:accent5>
-        <a:srgbClr val="A02B93"/>
+        <a:srgbClr val="a02b93"/>
       </a:accent5>
       <a:accent6>
-        <a:srgbClr val="4EA72E"/>
+        <a:srgbClr val="4ea72e"/>
       </a:accent6>
       <a:hlink>
         <a:srgbClr val="467886"/>
       </a:hlink>
       <a:folHlink>
-        <a:srgbClr val="96607D"/>
+        <a:srgbClr val="96607d"/>
       </a:folHlink>
     </a:clrScheme>
     <a:fontScheme name="Office">
       <a:majorFont>
-        <a:latin typeface="Aptos Display" panose="02110004020202020204"/>
+        <a:latin typeface="Aptos Display" panose="02110004020202020204" pitchFamily="0" charset="1"/>
         <a:ea typeface=""/>
         <a:cs typeface=""/>
       </a:majorFont>
       <a:minorFont>
-        <a:latin typeface="Aptos" panose="02110004020202020204"/>
+        <a:latin typeface="Aptos" panose="02110004020202020204" pitchFamily="0" charset="1"/>
         <a:ea typeface=""/>
         <a:cs typeface=""/>
       </a:minorFont>
@@ -4662,7 +4878,7 @@
             </a:gs>
           </a:gsLst>
           <a:lin ang="5400000" scaled="0"/>
-          <a:tileRect/>
+          <a:tileRect l="0" t="0" r="0" b="0"/>
         </a:gradFill>
         <a:gradFill>
           <a:gsLst>
@@ -4686,7 +4902,7 @@
             </a:gs>
           </a:gsLst>
           <a:lin ang="5400000" scaled="0"/>
-          <a:tileRect/>
+          <a:tileRect l="0" t="0" r="0" b="0"/>
         </a:gradFill>
       </a:fillStyleLst>
       <a:lnStyleLst>
@@ -4746,12 +4962,10 @@
             </a:gs>
           </a:gsLst>
           <a:lin ang="5400000" scaled="0"/>
-          <a:tileRect/>
+          <a:tileRect l="0" t="0" r="0" b="0"/>
         </a:gradFill>
       </a:bgFillStyleLst>
     </a:fmtScheme>
   </a:themeElements>
-  <a:objectDefaults/>
-  <a:extraClrSchemeLst/>
 </a:theme>
 </file>
</xml_diff>